<commit_message>
fix CCTC Module H classification consistency and reviewer-perspective improvements
- Add integrated KOTHA classification in run_validation.py based on OIS, CI, TSA, event-rate ratio, and I2.

- Update build_paper_cct.py to use dynamic KOTHA classification strings and structured 4-paragraph abstract.

- Align Module T Methods text with power-prior discounting implementation; remove b_i bias term.

- Add representativeness threshold justification and remove unused EBM abbreviation.

- Regenerate CCTC submission files and submission_package_CCTC.zip.

Co-Authored-By: Tatsuki Onishi <bougtoir@gmail.com>
</commit_message>
<xml_diff>
--- a/rct-decomposition/KOTHA_Framework_CCTC.docx
+++ b/rct-decomposition/KOTHA_Framework_CCTC.docx
@@ -52,7 +52,7 @@
           <w:i w:val="0"/>
           <w:sz w:val="24"/>
         </w:rPr>
-        <w:t>Word count: 2107</w:t>
+        <w:t>Word count: 2195</w:t>
       </w:r>
     </w:p>
     <w:p>
@@ -119,14 +119,12 @@
         </w:rPr>
         <w:t xml:space="preserve">: Evidence-based medicine ranks RCTs and meta-analyses highest, yet observational-RCT discordance is usually attributed to confounding. We highlight a structural explanation: trial enrollment progressively excludes higher-risk patients, diluting event rates and statistical information. The Knowledge-driven Observational-Trial Harmonization Approach (KOTHA) Framework diagnoses this structural information loss.</w:t>
       </w:r>
-      <w:r>
-        <w:rPr>
-          <w:rFonts w:ascii="Times New Roman" w:hAnsi="Times New Roman" w:cs="Times New Roman" w:eastAsia="Times New Roman"/>
-          <w:sz w:val="24"/>
-          <w:szCs w:val="24"/>
-        </w:rPr>
-        <w:t xml:space="preserve"> </w:t>
-      </w:r>
+    </w:p>
+    <w:p xmlns:a="http://schemas.openxmlformats.org/drawingml/2006/main" xmlns:pic="http://schemas.openxmlformats.org/drawingml/2006/picture">
+      <w:pPr>
+        <w:pStyle w:val="Normal"/>
+        <w:spacing w:line="480" w:lineRule="auto" w:after="120"/>
+      </w:pPr>
       <w:r>
         <w:rPr>
           <w:bCs/>
@@ -145,14 +143,12 @@
         </w:rPr>
         <w:t xml:space="preserve">: KOTHA comprises three modules. Module K (Counterfactual Power Simulation) quantifies how enrollment-driven risk-profile shifts alter statistical power. Module T (Bayesian Evidence Integration) combines RCT and observational evidence using power-prior discounting. Module H (Guideline Interpreter) translates outputs into a structured GRADE-compatible assessment. We illustrated KOTHA using two cases of observational-RCT divergence: intravenous magnesium in acute myocardial infarction (12 trials, 1984-1995) and statins in heart failure (5 observational studies, 2 RCTs).</w:t>
       </w:r>
-      <w:r>
-        <w:rPr>
-          <w:rFonts w:ascii="Times New Roman" w:hAnsi="Times New Roman" w:cs="Times New Roman" w:eastAsia="Times New Roman"/>
-          <w:sz w:val="24"/>
-          <w:szCs w:val="24"/>
-        </w:rPr>
-        <w:t xml:space="preserve"> </w:t>
-      </w:r>
+    </w:p>
+    <w:p xmlns:a="http://schemas.openxmlformats.org/drawingml/2006/main" xmlns:pic="http://schemas.openxmlformats.org/drawingml/2006/picture">
+      <w:pPr>
+        <w:pStyle w:val="Normal"/>
+        <w:spacing w:line="480" w:lineRule="auto" w:after="120"/>
+      </w:pPr>
       <w:r>
         <w:rPr>
           <w:bCs/>
@@ -207,37 +203,14 @@
           <w:sz w:val="24"/>
           <w:szCs w:val="24"/>
         </w:rPr>
-        <w:t xml:space="preserve">= 62%. In the statins case, observational HR was 0.72 (0.64-0.80) versus RCT HR 0.97 (0.90-1.05), with an RCT-to-observational event rate ratio of 0.53. Bayesian integration with moderate discounting (</w:t>
+        <w:t xml:space="preserve">= 62%. In the statins case, observational HR was 0.72 (0.64-0.80) versus RCT HR 0.97 (0.90-1.05), with an RCT-to-observational event rate ratio of 0.53. Bayesian integration with moderate discounting (α = 0.3) yielded OR 0.73 (95% CrI: 0.28-2.09), P(OR &lt; 1) = 77% for magnesium, and HR 0.85 (0.59-1.57), P(HR &lt; 1) = 84% for statins.</w:t>
       </w:r>
-      <m:oMath>
-        <m:r>
-          <m:t>α</m:t>
-        </m:r>
-      </m:oMath>
-      <w:r>
-        <w:rPr>
-          <w:rFonts w:ascii="Times New Roman" w:hAnsi="Times New Roman" w:cs="Times New Roman" w:eastAsia="Times New Roman"/>
-          <w:sz w:val="24"/>
-          <w:szCs w:val="24"/>
-        </w:rPr>
-        <w:t xml:space="preserve"> </w:t>
-      </w:r>
-      <w:r>
-        <w:rPr>
-          <w:rFonts w:ascii="Times New Roman" w:hAnsi="Times New Roman" w:cs="Times New Roman" w:eastAsia="Times New Roman"/>
-          <w:sz w:val="24"/>
-          <w:szCs w:val="24"/>
-        </w:rPr>
-        <w:t xml:space="preserve">= 0.3) yielded OR 0.73 (95% CrI: 0.28-2.09), P(OR &lt; 1) = 77% for magnesium, and HR 0.85 (0.59-1.57), P(HR &lt; 1) = 84% for statins. Module H reclassified both cases as informationally inconclusive due to serious indirectness.</w:t>
-      </w:r>
-      <w:r>
-        <w:rPr>
-          <w:rFonts w:ascii="Times New Roman" w:hAnsi="Times New Roman" w:cs="Times New Roman" w:eastAsia="Times New Roman"/>
-          <w:sz w:val="24"/>
-          <w:szCs w:val="24"/>
-        </w:rPr>
-        <w:t xml:space="preserve"> </w:t>
-      </w:r>
+    </w:p>
+    <w:p xmlns:a="http://schemas.openxmlformats.org/drawingml/2006/main" xmlns:pic="http://schemas.openxmlformats.org/drawingml/2006/picture">
+      <w:pPr>
+        <w:pStyle w:val="Normal"/>
+        <w:spacing w:line="480" w:lineRule="auto" w:after="120"/>
+      </w:pPr>
       <w:r>
         <w:rPr>
           <w:bCs/>
@@ -350,7 +323,7 @@
           <w:sz w:val="24"/>
           <w:szCs w:val="24"/>
         </w:rPr>
-        <w:t xml:space="preserve">and to inform trial design, evidence synthesis, and guideline interpretation.</w:t>
+        <w:t xml:space="preserve">and to inform trial design, evidence synthesis, and guideline interpretation. Module H classified magnesium as inconclusive with serious imprecision (heterogeneity) and moderate indirectness, and statins as inconclusive with serious indirectness.</w:t>
       </w:r>
     </w:p>
     <w:p xmlns:a="http://schemas.openxmlformats.org/drawingml/2006/main" xmlns:pic="http://schemas.openxmlformats.org/drawingml/2006/picture">
@@ -594,44 +567,6 @@
                 <w:szCs w:val="20"/>
               </w:rPr>
               <w:t xml:space="preserve">Confidence interval</w:t>
-            </w:r>
-          </w:p>
-        </w:tc>
-      </w:tr>
-      <w:tr>
-        <w:tc>
-          <w:tcPr/>
-          <w:p>
-            <w:pPr>
-              <w:pStyle w:val="Normal"/>
-              <w:jc w:val="left"/>
-              <w:spacing w:line="240" w:lineRule="auto" w:after="0"/>
-            </w:pPr>
-            <w:r>
-              <w:rPr>
-                <w:rFonts w:ascii="Times New Roman" w:hAnsi="Times New Roman" w:cs="Times New Roman" w:eastAsia="Times New Roman"/>
-                <w:sz w:val="20"/>
-                <w:szCs w:val="20"/>
-              </w:rPr>
-              <w:t xml:space="preserve">EBM</w:t>
-            </w:r>
-          </w:p>
-        </w:tc>
-        <w:tc>
-          <w:tcPr/>
-          <w:p>
-            <w:pPr>
-              <w:pStyle w:val="Normal"/>
-              <w:jc w:val="left"/>
-              <w:spacing w:line="240" w:lineRule="auto" w:after="0"/>
-            </w:pPr>
-            <w:r>
-              <w:rPr>
-                <w:rFonts w:ascii="Times New Roman" w:hAnsi="Times New Roman" w:cs="Times New Roman" w:eastAsia="Times New Roman"/>
-                <w:sz w:val="20"/>
-                <w:szCs w:val="20"/>
-              </w:rPr>
-              <w:t xml:space="preserve">Evidence-based medicine</w:t>
             </w:r>
           </w:p>
         </w:tc>
@@ -2324,7 +2259,7 @@
           <w:sz w:val="24"/>
           <w:szCs w:val="24"/>
         </w:rPr>
-        <w:t xml:space="preserve">When Module K indicates that RCT evidence is informationally insufficient, Module T combines RCT and observational evidence while explicitly modeling design-specific bias. Let</w:t>
+        <w:t xml:space="preserve">When Module K indicates that RCT evidence is informationally insufficient, Module T combines RCT and observational evidence while discounting the observational likelihood for potential design-specific bias. Let</w:t>
       </w:r>
       <w:r>
         <w:rPr>
@@ -2421,7 +2356,7 @@
           <w:sz w:val="24"/>
           <w:szCs w:val="24"/>
         </w:rPr>
-        <w:t xml:space="preserve">. The model is</w:t>
+        <w:t xml:space="preserve">. The RCT evidence contributes its full likelihood; the observational evidence contributes a power-prior-discounted likelihood with factor</w:t>
       </w:r>
       <w:r>
         <w:rPr>
@@ -2432,74 +2367,35 @@
         <w:t xml:space="preserve"> </w:t>
       </w:r>
       <m:oMath>
-        <m:sSub>
-          <m:e>
-            <m:r>
-              <m:t>y</m:t>
-            </m:r>
-          </m:e>
-          <m:sub>
-            <m:r>
-              <m:t>i</m:t>
-            </m:r>
-          </m:sub>
-        </m:sSub>
+        <m:r>
+          <m:t>α</m:t>
+        </m:r>
         <m:r>
           <m:rPr>
             <m:sty m:val="p"/>
           </m:rPr>
-          <m:t>∼</m:t>
-        </m:r>
-        <m:r>
-          <m:rPr>
-            <m:nor/>
-            <m:sty m:val="p"/>
-          </m:rPr>
-          <m:t>Normal</m:t>
+          <m:t>∈</m:t>
         </m:r>
         <m:d>
           <m:dPr>
-            <m:begChr m:val="("/>
-            <m:endChr m:val=")"/>
+            <m:begChr m:val="["/>
+            <m:endChr m:val="]"/>
             <m:sepChr m:val=""/>
             <m:grow/>
           </m:dPr>
           <m:e>
-            <m:sSub>
-              <m:e>
-                <m:r>
-                  <m:t>θ</m:t>
-                </m:r>
-              </m:e>
-              <m:sub>
-                <m:r>
-                  <m:t>i</m:t>
-                </m:r>
-              </m:sub>
-            </m:sSub>
+            <m:r>
+              <m:t>0</m:t>
+            </m:r>
             <m:r>
               <m:rPr>
                 <m:sty m:val="p"/>
               </m:rPr>
               <m:t>,</m:t>
             </m:r>
-            <m:sSubSup>
-              <m:e>
-                <m:r>
-                  <m:t>s</m:t>
-                </m:r>
-              </m:e>
-              <m:sub>
-                <m:r>
-                  <m:t>i</m:t>
-                </m:r>
-              </m:sub>
-              <m:sup>
-                <m:r>
-                  <m:t>2</m:t>
-                </m:r>
-              </m:sup>
-            </m:sSubSup>
+            <m:r>
+              <m:t>1</m:t>
+            </m:r>
           </m:e>
         </m:d>
       </m:oMath>
@@ -2517,82 +2413,7 @@
           <w:sz w:val="24"/>
           <w:szCs w:val="24"/>
         </w:rPr>
-        <w:t xml:space="preserve">and</w:t>
-      </w:r>
-      <w:r>
-        <w:rPr>
-          <w:rFonts w:ascii="Times New Roman" w:hAnsi="Times New Roman" w:cs="Times New Roman" w:eastAsia="Times New Roman"/>
-          <w:sz w:val="24"/>
-          <w:szCs w:val="24"/>
-        </w:rPr>
-        <w:t xml:space="preserve"> </w:t>
-      </w:r>
-      <m:oMath>
-        <m:sSub>
-          <m:e>
-            <m:r>
-              <m:t>θ</m:t>
-            </m:r>
-          </m:e>
-          <m:sub>
-            <m:r>
-              <m:t>i</m:t>
-            </m:r>
-          </m:sub>
-        </m:sSub>
-        <m:r>
-          <m:rPr>
-            <m:sty m:val="p"/>
-          </m:rPr>
-          <m:t>=</m:t>
-        </m:r>
-        <m:r>
-          <m:t>μ</m:t>
-        </m:r>
-        <m:r>
-          <m:rPr>
-            <m:sty m:val="p"/>
-          </m:rPr>
-          <m:t>+</m:t>
-        </m:r>
-        <m:sSub>
-          <m:e>
-            <m:r>
-              <m:t>u</m:t>
-            </m:r>
-          </m:e>
-          <m:sub>
-            <m:r>
-              <m:t>i</m:t>
-            </m:r>
-          </m:sub>
-        </m:sSub>
-        <m:r>
-          <m:rPr>
-            <m:sty m:val="p"/>
-          </m:rPr>
-          <m:t>+</m:t>
-        </m:r>
-        <m:sSub>
-          <m:e>
-            <m:r>
-              <m:t>b</m:t>
-            </m:r>
-          </m:e>
-          <m:sub>
-            <m:r>
-              <m:t>i</m:t>
-            </m:r>
-          </m:sub>
-        </m:sSub>
-      </m:oMath>
-      <w:r>
-        <w:rPr>
-          <w:rFonts w:ascii="Times New Roman" w:hAnsi="Times New Roman" w:cs="Times New Roman" w:eastAsia="Times New Roman"/>
-          <w:sz w:val="24"/>
-          <w:szCs w:val="24"/>
-        </w:rPr>
-        <w:t xml:space="preserve">, where</w:t>
+        <w:t xml:space="preserve">[15], so that</w:t>
       </w:r>
       <w:r>
         <w:rPr>
@@ -2604,7 +2425,16 @@
       </w:r>
       <m:oMath>
         <m:r>
-          <m:t>μ</m:t>
+          <m:t>α</m:t>
+        </m:r>
+        <m:r>
+          <m:rPr>
+            <m:sty m:val="p"/>
+          </m:rPr>
+          <m:t>=</m:t>
+        </m:r>
+        <m:r>
+          <m:t>0</m:t>
         </m:r>
       </m:oMath>
       <w:r>
@@ -2621,7 +2451,45 @@
           <w:sz w:val="24"/>
           <w:szCs w:val="24"/>
         </w:rPr>
-        <w:t xml:space="preserve">is the overall effect,</w:t>
+        <w:t xml:space="preserve">retains only RCTs and</w:t>
+      </w:r>
+      <w:r>
+        <w:rPr>
+          <w:rFonts w:ascii="Times New Roman" w:hAnsi="Times New Roman" w:cs="Times New Roman" w:eastAsia="Times New Roman"/>
+          <w:sz w:val="24"/>
+          <w:szCs w:val="24"/>
+        </w:rPr>
+        <w:t xml:space="preserve"> </w:t>
+      </w:r>
+      <m:oMath>
+        <m:r>
+          <m:t>α</m:t>
+        </m:r>
+        <m:r>
+          <m:rPr>
+            <m:sty m:val="p"/>
+          </m:rPr>
+          <m:t>=</m:t>
+        </m:r>
+        <m:r>
+          <m:t>1</m:t>
+        </m:r>
+      </m:oMath>
+      <w:r>
+        <w:rPr>
+          <w:rFonts w:ascii="Times New Roman" w:hAnsi="Times New Roman" w:cs="Times New Roman" w:eastAsia="Times New Roman"/>
+          <w:sz w:val="24"/>
+          <w:szCs w:val="24"/>
+        </w:rPr>
+        <w:t xml:space="preserve"> </w:t>
+      </w:r>
+      <w:r>
+        <w:rPr>
+          <w:rFonts w:ascii="Times New Roman" w:hAnsi="Times New Roman" w:cs="Times New Roman" w:eastAsia="Times New Roman"/>
+          <w:sz w:val="24"/>
+          <w:szCs w:val="24"/>
+        </w:rPr>
+        <w:t xml:space="preserve">gives observational data full weight. Between-study heterogeneity is modeled with a random-effects distribution</w:t>
       </w:r>
       <w:r>
         <w:rPr>
@@ -2695,110 +2563,7 @@
           <w:sz w:val="24"/>
           <w:szCs w:val="24"/>
         </w:rPr>
-        <w:t xml:space="preserve"> </w:t>
-      </w:r>
-      <w:r>
-        <w:rPr>
-          <w:rFonts w:ascii="Times New Roman" w:hAnsi="Times New Roman" w:cs="Times New Roman" w:eastAsia="Times New Roman"/>
-          <w:sz w:val="24"/>
-          <w:szCs w:val="24"/>
-        </w:rPr>
-        <w:t xml:space="preserve">captures between-study heterogeneity, and</w:t>
-      </w:r>
-      <w:r>
-        <w:rPr>
-          <w:rFonts w:ascii="Times New Roman" w:hAnsi="Times New Roman" w:cs="Times New Roman" w:eastAsia="Times New Roman"/>
-          <w:sz w:val="24"/>
-          <w:szCs w:val="24"/>
-        </w:rPr>
-        <w:t xml:space="preserve"> </w:t>
-      </w:r>
-      <m:oMath>
-        <m:sSub>
-          <m:e>
-            <m:r>
-              <m:t>b</m:t>
-            </m:r>
-          </m:e>
-          <m:sub>
-            <m:r>
-              <m:t>i</m:t>
-            </m:r>
-          </m:sub>
-        </m:sSub>
-      </m:oMath>
-      <w:r>
-        <w:rPr>
-          <w:rFonts w:ascii="Times New Roman" w:hAnsi="Times New Roman" w:cs="Times New Roman" w:eastAsia="Times New Roman"/>
-          <w:sz w:val="24"/>
-          <w:szCs w:val="24"/>
-        </w:rPr>
-        <w:t xml:space="preserve"> </w:t>
-      </w:r>
-      <w:r>
-        <w:rPr>
-          <w:rFonts w:ascii="Times New Roman" w:hAnsi="Times New Roman" w:cs="Times New Roman" w:eastAsia="Times New Roman"/>
-          <w:sz w:val="24"/>
-          <w:szCs w:val="24"/>
-        </w:rPr>
-        <w:t xml:space="preserve">captures design-specific bias. Alternative effect measures such as restricted mean survival time can be substituted when proportional-hazards assumptions are questionable [12-13]. Evidence-based priors have been proposed to anchor historical expectations while limiting prior-data conflict [14]. We use power-prior discounting [15] to down-weight observational evidence by a factor</w:t>
-      </w:r>
-      <w:r>
-        <w:rPr>
-          <w:rFonts w:ascii="Times New Roman" w:hAnsi="Times New Roman" w:cs="Times New Roman" w:eastAsia="Times New Roman"/>
-          <w:sz w:val="24"/>
-          <w:szCs w:val="24"/>
-        </w:rPr>
-        <w:t xml:space="preserve"> </w:t>
-      </w:r>
-      <m:oMath>
-        <m:r>
-          <m:t>α</m:t>
-        </m:r>
-        <m:r>
-          <m:rPr>
-            <m:sty m:val="p"/>
-          </m:rPr>
-          <m:t>∈</m:t>
-        </m:r>
-        <m:d>
-          <m:dPr>
-            <m:begChr m:val="["/>
-            <m:endChr m:val="]"/>
-            <m:sepChr m:val=""/>
-            <m:grow/>
-          </m:dPr>
-          <m:e>
-            <m:r>
-              <m:t>0</m:t>
-            </m:r>
-            <m:r>
-              <m:rPr>
-                <m:sty m:val="p"/>
-              </m:rPr>
-              <m:t>,</m:t>
-            </m:r>
-            <m:r>
-              <m:t>1</m:t>
-            </m:r>
-          </m:e>
-        </m:d>
-      </m:oMath>
-      <w:r>
-        <w:rPr>
-          <w:rFonts w:ascii="Times New Roman" w:hAnsi="Times New Roman" w:cs="Times New Roman" w:eastAsia="Times New Roman"/>
-          <w:sz w:val="24"/>
-          <w:szCs w:val="24"/>
-        </w:rPr>
-        <w:t xml:space="preserve"> </w:t>
-      </w:r>
-      <w:r>
-        <w:rPr>
-          <w:rFonts w:ascii="Times New Roman" w:hAnsi="Times New Roman" w:cs="Times New Roman" w:eastAsia="Times New Roman"/>
-          <w:sz w:val="24"/>
-          <w:szCs w:val="24"/>
-        </w:rPr>
-        <w:t xml:space="preserve">and also present bias-adjusted normal-approximation analyses. Posterior distributions are obtained by Metropolis-Hastings MCMC (15,000 post-warmup iterations after 3,000 warmup) for each</w:t>
+        <w:t xml:space="preserve">. Alternative effect measures such as restricted mean survival time can be substituted when proportional-hazards assumptions are questionable [12-13]. Evidence-based priors have been proposed to anchor historical expectations while limiting prior-data conflict [14]. We also present bias-adjusted normal-approximation analyses as a sensitivity check. Posterior distributions are obtained by Metropolis-Hastings MCMC (15,000 post-warmup iterations after 3,000 warmup) for each</w:t>
       </w:r>
       <w:r>
         <w:rPr>
@@ -2940,7 +2705,7 @@
           <w:sz w:val="24"/>
           <w:szCs w:val="24"/>
         </w:rPr>
-        <w:t xml:space="preserve">Module H maps the outputs of Modules K and T onto the GRADE framework [1]. It includes five assessments (Table 2): information sufficiency (OIS vs observed events), confidence interval interpretation, representativeness (event rate ratio), TSA boundary status, and recommended language. The result is a KOTHA-enhanced certainty rating and recommendation that explicitly distinguishes</w:t>
+        <w:t xml:space="preserve">Module H maps the outputs of Modules K and T onto the GRADE framework [1]. It includes five assessments (Table 2): information sufficiency (OIS vs observed events), confidence interval interpretation, representativeness (event rate ratio), TSA boundary status, and recommended language. For representativeness, event-rate ratios below 0.67 or above 1.50 (a ≥50% relative shift) are classified as serious indirectness, and ratios below 0.85 or above 1.18 (a ≥15% relative shift) as moderate indirectness. The result is a KOTHA-enhanced certainty rating and recommendation that explicitly distinguishes</w:t>
       </w:r>
       <w:r>
         <w:rPr>
@@ -3465,7 +3230,7 @@
                 <w:sz w:val="20"/>
                 <w:szCs w:val="20"/>
               </w:rPr>
-              <w:t xml:space="preserve">Event rate ratio &gt; 1.5 or &lt; 0.67: indirectness concern</w:t>
+              <w:t xml:space="preserve">&lt; 0.67 or &gt; 1.50: serious; &lt; 0.85 or &gt; 1.18: moderate</w:t>
             </w:r>
           </w:p>
         </w:tc>
@@ -8705,7 +8470,37 @@
           <w:sz w:val="24"/>
           <w:szCs w:val="24"/>
         </w:rPr>
-        <w:t xml:space="preserve">Module H results are summarized in Table 7 and Fig. 8. For magnesium, the OIS for the pre-ISIS-4 effect was 85 events and the observed total was 4,617 (information fraction 5426%). Although the OIS was exceeded, the pooled estimate was dominated by high between-study heterogeneity; the appropriate KOTHA classification is</w:t>
+        <w:t xml:space="preserve">Module H results are summarized in Table 7 and Fig. 8. For magnesium, the OIS for the pre-ISIS-4 effect was 85 events and the observed total was 4,617 (information fraction 5426%). The TSA efficacy boundary was crossed under random-effects accumulation, but the pooled estimate was dominated by high between-study heterogeneity (</w:t>
+      </w:r>
+      <m:oMath>
+        <m:sSup>
+          <m:e>
+            <m:r>
+              <m:t>I</m:t>
+            </m:r>
+          </m:e>
+          <m:sup>
+            <m:r>
+              <m:t>2</m:t>
+            </m:r>
+          </m:sup>
+        </m:sSup>
+      </m:oMath>
+      <w:r>
+        <w:rPr>
+          <w:rFonts w:ascii="Times New Roman" w:hAnsi="Times New Roman" w:cs="Times New Roman" w:eastAsia="Times New Roman"/>
+          <w:sz w:val="24"/>
+          <w:szCs w:val="24"/>
+        </w:rPr>
+        <w:t xml:space="preserve"> </w:t>
+      </w:r>
+      <w:r>
+        <w:rPr>
+          <w:rFonts w:ascii="Times New Roman" w:hAnsi="Times New Roman" w:cs="Times New Roman" w:eastAsia="Times New Roman"/>
+          <w:sz w:val="24"/>
+          <w:szCs w:val="24"/>
+        </w:rPr>
+        <w:t xml:space="preserve">= 62%). The appropriate KOTHA classification is</w:t>
       </w:r>
       <w:r>
         <w:rPr>
@@ -8723,7 +8518,7 @@
           <w:sz w:val="24"/>
           <w:szCs w:val="24"/>
         </w:rPr>
-        <w:t xml:space="preserve">inconclusive with serious imprecision</w:t>
+        <w:t xml:space="preserve">Inconclusive with serious imprecision (heterogeneity) and moderate indirectness</w:t>
       </w:r>
       <w:r>
         <w:rPr>
@@ -8731,7 +8526,15 @@
           <w:sz w:val="24"/>
           <w:szCs w:val="24"/>
         </w:rPr>
-        <w:t xml:space="preserve">. For statins, the OIS for the observational effect was 279 events and the RCTs contributed 1,385 events (information fraction 496%). The cumulative</w:t>
+        <w:t xml:space="preserve"> </w:t>
+      </w:r>
+      <w:r>
+        <w:rPr>
+          <w:rFonts w:ascii="Times New Roman" w:hAnsi="Times New Roman" w:cs="Times New Roman" w:eastAsia="Times New Roman"/>
+          <w:sz w:val="24"/>
+          <w:szCs w:val="24"/>
+        </w:rPr>
+        <w:t xml:space="preserve">(TSA/CI indicate benefit but the signal is downgraded by serious imprecision (heterogeneity) and moderate indirectness). For statins, the OIS for the observational effect was 279 events and the RCTs contributed 1,385 events (information fraction 496%). The cumulative</w:t>
       </w:r>
       <w:r>
         <w:rPr>
@@ -8778,7 +8581,7 @@
           <w:sz w:val="24"/>
           <w:szCs w:val="24"/>
         </w:rPr>
-        <w:t xml:space="preserve">inconclusive with serious indirectness</w:t>
+        <w:t xml:space="preserve">Inconclusive with serious indirectness</w:t>
       </w:r>
       <w:r>
         <w:rPr>
@@ -8786,7 +8589,15 @@
           <w:sz w:val="24"/>
           <w:szCs w:val="24"/>
         </w:rPr>
-        <w:t xml:space="preserve">. In both cases, standard GRADE would be more likely to conclude</w:t>
+        <w:t xml:space="preserve"> </w:t>
+      </w:r>
+      <w:r>
+        <w:rPr>
+          <w:rFonts w:ascii="Times New Roman" w:hAnsi="Times New Roman" w:cs="Times New Roman" w:eastAsia="Times New Roman"/>
+          <w:sz w:val="24"/>
+          <w:szCs w:val="24"/>
+        </w:rPr>
+        <w:t xml:space="preserve">(OIS reached but no TSA/CI boundary crossed; serious indirectness from enrollment-driven event dilution). In both cases, standard GRADE would be more likely to conclude</w:t>
       </w:r>
       <w:r>
         <w:rPr>
@@ -9828,7 +9639,7 @@
           <w:sz w:val="24"/>
           <w:szCs w:val="24"/>
         </w:rPr>
-        <w:t xml:space="preserve">= 62%) than by simple underpowering. In the statins case, Module K showed that RCT populations had roughly half the event rate of observational cohorts, and that power for a modest effect (HR = 0.85) dropped from 85% to 58%. Module T demonstrated that even modest borrowing from observational evidence shifted posterior probabilities of benefit substantially, but uncertainty remained. Module H reclassified both cases as inconclusive rather than</w:t>
+        <w:t xml:space="preserve">= 62%) than by simple underpowering. In the statins case, Module K showed that RCT populations had roughly half the event rate of observational cohorts, and that power for a modest effect (HR = 0.85) dropped from 85% to 58%. Module T demonstrated that even modest borrowing from observational evidence shifted posterior probabilities of benefit substantially, but uncertainty remained. Module H classified magnesium as inconclusive with serious imprecision (heterogeneity) and moderate indirectness, and statins as inconclusive with serious indirectness, rather than</w:t>
       </w:r>
       <w:r>
         <w:rPr>
@@ -9852,7 +9663,7 @@
           <w:sz w:val="24"/>
           <w:szCs w:val="24"/>
         </w:rPr>
-        <w:t xml:space="preserve">no effect.</w:t>
+        <w:t xml:space="preserve">evidence of no effect.</w:t>
       </w:r>
       <w:r>
         <w:rPr>

</xml_diff>

<commit_message>
shorten CCTC abstract conclusion to keep body under 250 words
Co-Authored-By: Tatsuki Onishi <bougtoir@gmail.com>
</commit_message>
<xml_diff>
--- a/rct-decomposition/KOTHA_Framework_CCTC.docx
+++ b/rct-decomposition/KOTHA_Framework_CCTC.docx
@@ -227,7 +227,7 @@
           <w:sz w:val="24"/>
           <w:szCs w:val="24"/>
         </w:rPr>
-        <w:t xml:space="preserve">: KOTHA provides a reproducible, quantitative method to distinguish</w:t>
+        <w:t xml:space="preserve">: KOTHA distinguishes</w:t>
       </w:r>
       <w:r>
         <w:rPr>
@@ -315,15 +315,7 @@
           <w:sz w:val="24"/>
           <w:szCs w:val="24"/>
         </w:rPr>
-        <w:t xml:space="preserve"> </w:t>
-      </w:r>
-      <w:r>
-        <w:rPr>
-          <w:rFonts w:ascii="Times New Roman" w:hAnsi="Times New Roman" w:cs="Times New Roman" w:eastAsia="Times New Roman"/>
-          <w:sz w:val="24"/>
-          <w:szCs w:val="24"/>
-        </w:rPr>
-        <w:t xml:space="preserve">and to inform trial design, evidence synthesis, and guideline interpretation. Module H classified magnesium as inconclusive with serious imprecision (heterogeneity) and moderate indirectness, and statins as inconclusive with serious indirectness.</w:t>
+        <w:t xml:space="preserve">. Module H classified magnesium as inconclusive due to serious imprecision (heterogeneity) and moderate indirectness, and statins as inconclusive due to serious indirectness.</w:t>
       </w:r>
     </w:p>
     <w:p xmlns:a="http://schemas.openxmlformats.org/drawingml/2006/main" xmlns:pic="http://schemas.openxmlformats.org/drawingml/2006/picture">

</xml_diff>

<commit_message>
fix GRADE domain labels and indirectness thresholds in CCTC manuscript
- Rename 'serious imprecision (heterogeneity)' to 'serious inconsistency (heterogeneity)' in kotha_assessment.

- Revert event-rate ratio moderate thresholds to 0.80/1.25 and justify as conventional clinically important boundaries.

- Update Table 7 imprecision/overall certainty rows to align with OIS/CI and KOTHA classifications.

- Regenerate CCTC/RSM/generic manuscripts and submission package.

Co-Authored-By: Tatsuki Onishi <bougtoir@gmail.com>
</commit_message>
<xml_diff>
--- a/rct-decomposition/KOTHA_Framework_CCTC.docx
+++ b/rct-decomposition/KOTHA_Framework_CCTC.docx
@@ -52,7 +52,7 @@
           <w:i w:val="0"/>
           <w:sz w:val="24"/>
         </w:rPr>
-        <w:t>Word count: 2195</w:t>
+        <w:t>Word count: 2197</w:t>
       </w:r>
     </w:p>
     <w:p>
@@ -315,7 +315,7 @@
           <w:sz w:val="24"/>
           <w:szCs w:val="24"/>
         </w:rPr>
-        <w:t xml:space="preserve">. Module H classified magnesium as inconclusive due to serious imprecision (heterogeneity) and moderate indirectness, and statins as inconclusive due to serious indirectness.</w:t>
+        <w:t xml:space="preserve">. Module H classified magnesium as inconclusive with serious inconsistency (heterogeneity), and statins as inconclusive with serious indirectness.</w:t>
       </w:r>
     </w:p>
     <w:p xmlns:a="http://schemas.openxmlformats.org/drawingml/2006/main" xmlns:pic="http://schemas.openxmlformats.org/drawingml/2006/picture">
@@ -2697,7 +2697,7 @@
           <w:sz w:val="24"/>
           <w:szCs w:val="24"/>
         </w:rPr>
-        <w:t xml:space="preserve">Module H maps the outputs of Modules K and T onto the GRADE framework [1]. It includes five assessments (Table 2): information sufficiency (OIS vs observed events), confidence interval interpretation, representativeness (event rate ratio), TSA boundary status, and recommended language. For representativeness, event-rate ratios below 0.67 or above 1.50 (a ≥50% relative shift) are classified as serious indirectness, and ratios below 0.85 or above 1.18 (a ≥15% relative shift) as moderate indirectness. The result is a KOTHA-enhanced certainty rating and recommendation that explicitly distinguishes</w:t>
+        <w:t xml:space="preserve">Module H maps the outputs of Modules K and T onto the GRADE framework [1]. It includes five assessments (Table 2): information sufficiency (OIS vs observed events), confidence interval interpretation, representativeness (event rate ratio), TSA boundary status, and recommended language. For representativeness, event-rate ratios below 0.67 or above 1.50 (a ≥50% relative shift) are classified as serious indirectness, and ratios below 0.80 or above 1.25 (a ≥25% relative shift) as moderate indirectness. These thresholds correspond to conventional boundaries for clinically important relative effects. The result is a KOTHA-enhanced certainty rating and recommendation that explicitly distinguishes</w:t>
       </w:r>
       <w:r>
         <w:rPr>
@@ -3222,7 +3222,7 @@
                 <w:sz w:val="20"/>
                 <w:szCs w:val="20"/>
               </w:rPr>
-              <w:t xml:space="preserve">&lt; 0.67 or &gt; 1.50: serious; &lt; 0.85 or &gt; 1.18: moderate</w:t>
+              <w:t xml:space="preserve">&lt; 0.67 or &gt; 1.50: serious; &lt; 0.80 or &gt; 1.25: moderate</w:t>
             </w:r>
           </w:p>
         </w:tc>
@@ -8510,7 +8510,7 @@
           <w:sz w:val="24"/>
           <w:szCs w:val="24"/>
         </w:rPr>
-        <w:t xml:space="preserve">Inconclusive with serious imprecision (heterogeneity) and moderate indirectness</w:t>
+        <w:t xml:space="preserve">Inconclusive with serious inconsistency (heterogeneity)</w:t>
       </w:r>
       <w:r>
         <w:rPr>
@@ -8526,7 +8526,7 @@
           <w:sz w:val="24"/>
           <w:szCs w:val="24"/>
         </w:rPr>
-        <w:t xml:space="preserve">(TSA/CI indicate benefit but the signal is downgraded by serious imprecision (heterogeneity) and moderate indirectness). For statins, the OIS for the observational effect was 279 events and the RCTs contributed 1,385 events (information fraction 496%). The cumulative</w:t>
+        <w:t xml:space="preserve">(TSA/CI indicate benefit but the signal is downgraded by serious inconsistency (heterogeneity)). For statins, the OIS for the observational effect was 279 events and the RCTs contributed 1,385 events (information fraction 496%). The cumulative</w:t>
       </w:r>
       <w:r>
         <w:rPr>
@@ -9121,7 +9121,7 @@
                 <w:sz w:val="20"/>
                 <w:szCs w:val="20"/>
               </w:rPr>
-              <w:t xml:space="preserve">Moderate: event rate decreased by 18%</w:t>
+              <w:t xml:space="preserve">Low: event rate decreased by 18%</w:t>
             </w:r>
           </w:p>
         </w:tc>
@@ -9195,7 +9195,7 @@
                 <w:sz w:val="20"/>
                 <w:szCs w:val="20"/>
               </w:rPr>
-              <w:t xml:space="preserve">Serious</w:t>
+              <w:t xml:space="preserve">Not serious (OIS met)</w:t>
             </w:r>
           </w:p>
         </w:tc>
@@ -9213,7 +9213,7 @@
                 <w:sz w:val="20"/>
                 <w:szCs w:val="20"/>
               </w:rPr>
-              <w:t xml:space="preserve">Serious (heterogeneity-driven)</w:t>
+              <w:t xml:space="preserve">Not serious (OIS met, CI excludes null)</w:t>
             </w:r>
           </w:p>
         </w:tc>
@@ -9231,7 +9231,7 @@
                 <w:sz w:val="20"/>
                 <w:szCs w:val="20"/>
               </w:rPr>
-              <w:t xml:space="preserve">Serious</w:t>
+              <w:t xml:space="preserve">Not serious (OIS met, CI excludes clinically important benefit)</w:t>
             </w:r>
           </w:p>
         </w:tc>
@@ -9249,7 +9249,7 @@
                 <w:sz w:val="20"/>
                 <w:szCs w:val="20"/>
               </w:rPr>
-              <w:t xml:space="preserve">Serious</w:t>
+              <w:t xml:space="preserve">Not serious (OIS met, CI excludes clinically important benefit)</w:t>
             </w:r>
           </w:p>
         </w:tc>
@@ -9305,7 +9305,7 @@
                 <w:sz w:val="20"/>
                 <w:szCs w:val="20"/>
               </w:rPr>
-              <w:t xml:space="preserve">Very low</w:t>
+              <w:t xml:space="preserve">Low</w:t>
             </w:r>
           </w:p>
         </w:tc>
@@ -9323,7 +9323,7 @@
                 <w:sz w:val="20"/>
                 <w:szCs w:val="20"/>
               </w:rPr>
-              <w:t xml:space="preserve">Moderate</w:t>
+              <w:t xml:space="preserve">High</w:t>
             </w:r>
           </w:p>
         </w:tc>
@@ -9631,7 +9631,7 @@
           <w:sz w:val="24"/>
           <w:szCs w:val="24"/>
         </w:rPr>
-        <w:t xml:space="preserve">= 62%) than by simple underpowering. In the statins case, Module K showed that RCT populations had roughly half the event rate of observational cohorts, and that power for a modest effect (HR = 0.85) dropped from 85% to 58%. Module T demonstrated that even modest borrowing from observational evidence shifted posterior probabilities of benefit substantially, but uncertainty remained. Module H classified magnesium as inconclusive with serious imprecision (heterogeneity) and moderate indirectness, and statins as inconclusive with serious indirectness, rather than</w:t>
+        <w:t xml:space="preserve">= 62%) than by simple underpowering. In the statins case, Module K showed that RCT populations had roughly half the event rate of observational cohorts, and that power for a modest effect (HR = 0.85) dropped from 85% to 58%. Module T demonstrated that even modest borrowing from observational evidence shifted posterior probabilities of benefit substantially, but uncertainty remained. Module H classified magnesium as inconclusive with serious inconsistency (heterogeneity), and statins as inconclusive with serious indirectness, rather than</w:t>
       </w:r>
       <w:r>
         <w:rPr>

</xml_diff>

<commit_message>
CCTC reviewer-perspective fixes: terminology, thresholds, references, interpretations
- Cite DerSimonian & Laird (1986) for random-effects meta-analysis.

- Add 0.80/1.25 CI boundary rationale and alpha-grid justification.

- Clarify statins OIS as a counterfactual target-population OIS.

- Update cover letter article type to Original Research / Methodology.

- Regenerate CCTC/RSM/generic outputs and submission package.

Co-Authored-By: Tatsuki Onishi <bougtoir@gmail.com>
</commit_message>
<xml_diff>
--- a/rct-decomposition/KOTHA_Framework_CCTC.docx
+++ b/rct-decomposition/KOTHA_Framework_CCTC.docx
@@ -52,7 +52,7 @@
           <w:i w:val="0"/>
           <w:sz w:val="24"/>
         </w:rPr>
-        <w:t>Word count: 2197</w:t>
+        <w:t>Word count: 2254</w:t>
       </w:r>
     </w:p>
     <w:p>
@@ -2669,7 +2669,36 @@
           <w:sz w:val="24"/>
           <w:szCs w:val="24"/>
         </w:rPr>
-        <w:t xml:space="preserve">.</w:t>
+        <w:t xml:space="preserve">; we report the full grid to show sensitivity and use</w:t>
+      </w:r>
+      <w:r>
+        <w:rPr>
+          <w:rFonts w:ascii="Times New Roman" w:hAnsi="Times New Roman" w:cs="Times New Roman" w:eastAsia="Times New Roman"/>
+          <w:sz w:val="24"/>
+          <w:szCs w:val="24"/>
+        </w:rPr>
+        <w:t xml:space="preserve"> </w:t>
+      </w:r>
+      <m:oMath>
+        <m:r>
+          <m:t>α</m:t>
+        </m:r>
+      </m:oMath>
+      <w:r>
+        <w:rPr>
+          <w:rFonts w:ascii="Times New Roman" w:hAnsi="Times New Roman" w:cs="Times New Roman" w:eastAsia="Times New Roman"/>
+          <w:sz w:val="24"/>
+          <w:szCs w:val="24"/>
+        </w:rPr>
+        <w:t xml:space="preserve"> </w:t>
+      </w:r>
+      <w:r>
+        <w:rPr>
+          <w:rFonts w:ascii="Times New Roman" w:hAnsi="Times New Roman" w:cs="Times New Roman" w:eastAsia="Times New Roman"/>
+          <w:sz w:val="24"/>
+          <w:szCs w:val="24"/>
+        </w:rPr>
+        <w:t xml:space="preserve">= 0.3 as an illustrative moderate-discounting value without claiming it is universally optimal.</w:t>
       </w:r>
     </w:p>
     <w:p>
@@ -2697,7 +2726,7 @@
           <w:sz w:val="24"/>
           <w:szCs w:val="24"/>
         </w:rPr>
-        <w:t xml:space="preserve">Module H maps the outputs of Modules K and T onto the GRADE framework [1]. It includes five assessments (Table 2): information sufficiency (OIS vs observed events), confidence interval interpretation, representativeness (event rate ratio), TSA boundary status, and recommended language. For representativeness, event-rate ratios below 0.67 or above 1.50 (a ≥50% relative shift) are classified as serious indirectness, and ratios below 0.80 or above 1.25 (a ≥25% relative shift) as moderate indirectness. These thresholds correspond to conventional boundaries for clinically important relative effects. The result is a KOTHA-enhanced certainty rating and recommendation that explicitly distinguishes</w:t>
+        <w:t xml:space="preserve">Module H maps the outputs of Modules K and T onto the GRADE framework [1]. It includes five assessments (Table 2): information sufficiency (OIS vs observed events), confidence interval interpretation, representativeness (event rate ratio), TSA boundary status, and recommended language. For CI interpretation, we used relative effect boundaries of 0.80 and 1.25 to define clinically important benefit and harm. For representativeness, event-rate ratios below 0.67 or above 1.50 (a ≥50% relative shift) are classified as serious indirectness, and ratios below 0.80 or above 1.25 (a ≥25% relative shift) as moderate indirectness. These thresholds correspond to conventional boundaries for clinically important relative effects. The result is a KOTHA-enhanced certainty rating and recommendation that explicitly distinguishes</w:t>
       </w:r>
       <w:r>
         <w:rPr>
@@ -2801,7 +2830,7 @@
           <w:sz w:val="24"/>
           <w:szCs w:val="24"/>
         </w:rPr>
-        <w:t xml:space="preserve">no evidence of effect (inconclusive).</w:t>
+        <w:t xml:space="preserve">no evidence of effect (inconsistent or indirect).</w:t>
       </w:r>
       <w:r>
         <w:rPr>
@@ -2837,7 +2866,7 @@
           <w:sz w:val="24"/>
           <w:szCs w:val="24"/>
         </w:rPr>
-        <w:t xml:space="preserve">For magnesium in AMI we used study-level event counts extracted from published overviews [16-17]. For statins in heart failure we used aggregate data from five observational cohorts [18-22] and two RCTs [23-24]. We used DerSimonian-Laird random-effects meta-analysis and computed 95% confidence intervals. OIS and TSA were calculated using standard formulas [6-9]. All analyses were performed with the Python code in the public repository.</w:t>
+        <w:t xml:space="preserve">For magnesium in AMI we used study-level event counts extracted from published overviews [16-17]. For statins in heart failure we used aggregate data from five observational cohorts [18-22] and two RCTs [23-24]. We used DerSimonian-Laird random-effects meta-analysis [25] and computed 95% confidence intervals. OIS and TSA were calculated using standard formulas [6-9]. All analyses were performed with the Python code in the public repository.</w:t>
       </w:r>
     </w:p>
     <w:p>
@@ -8526,7 +8555,7 @@
           <w:sz w:val="24"/>
           <w:szCs w:val="24"/>
         </w:rPr>
-        <w:t xml:space="preserve">(TSA/CI indicate benefit but the signal is downgraded by serious inconsistency (heterogeneity)). For statins, the OIS for the observational effect was 279 events and the RCTs contributed 1,385 events (information fraction 496%). The cumulative</w:t>
+        <w:t xml:space="preserve">(TSA/CI indicate benefit but the signal is downgraded by serious inconsistency (heterogeneity)). For statins, if the observational effect (HR 0.72) represented the true effect in the target population, the required information size would be 279 events; the RCTs contributed 1,385 events (information fraction 496%). The cumulative</w:t>
       </w:r>
       <w:r>
         <w:rPr>
@@ -9909,7 +9938,7 @@
           <w:sz w:val="24"/>
           <w:szCs w:val="24"/>
         </w:rPr>
-        <w:t xml:space="preserve">Target trial emulation uses observational data to mimic a specific RCT in order to estimate a causal effect [25-26]. Module K is complementary: it does not estimate effects but quantifies the information lost due to enrollment decisions. Existing methods for combining RCT and observational evidence include hierarchical models, power priors, and meta-analytic-predictive priors [27-29]. Module T builds on these but embeds them in a broader workflow that first diagnoses the need for integration and then interprets the result through Module H. TSA and OIS are well established [6-9], but are not routinely used to quantify risk-profile shifts. GRADE provides domains for assessment [1]; KOTHA provides quantitative inputs to the imprecision and indirectness domains without changing GRADE’s structure.</w:t>
+        <w:t xml:space="preserve">Target trial emulation uses observational data to mimic a specific RCT in order to estimate a causal effect [26-27]. Module K is complementary: it does not estimate effects but quantifies the information lost due to enrollment decisions. Existing methods for combining RCT and observational evidence include hierarchical models, power priors, and meta-analytic-predictive priors [28-30]. Module T builds on these but embeds them in a broader workflow that first diagnoses the need for integration and then interprets the result through Module H. TSA and OIS are well established [6-9], but are not routinely used to quantify risk-profile shifts. GRADE provides domains for assessment [1]; KOTHA provides quantitative inputs to the imprecision and indirectness domains without changing GRADE’s structure.</w:t>
       </w:r>
     </w:p>
     <w:p>
@@ -10478,7 +10507,7 @@
           <w:rFonts w:ascii="Times New Roman" w:hAnsi="Times New Roman"/>
           <w:sz w:val="20"/>
         </w:rPr>
-        <w:t>25. Hernan MA, Robins JM. Using big data to emulate a target trial when a randomized trial is not available. Am J Epidemiol. 2016;183(8):758-64.</w:t>
+        <w:t>25. DerSimonian R, Laird N. Meta-analysis in clinical trials. Control Clin Trials. 1986;7(3):177-88.</w:t>
       </w:r>
     </w:p>
     <w:p>
@@ -10487,7 +10516,7 @@
           <w:rFonts w:ascii="Times New Roman" w:hAnsi="Times New Roman"/>
           <w:sz w:val="20"/>
         </w:rPr>
-        <w:t>26. Hernan MA, Wang W, Leaf DE. Target trial emulation: a framework for causal inference from observational data. JAMA. 2022;328(24):2446-7.</w:t>
+        <w:t>26. Hernan MA, Robins JM. Using big data to emulate a target trial when a randomized trial is not available. Am J Epidemiol. 2016;183(8):758-64.</w:t>
       </w:r>
     </w:p>
     <w:p>
@@ -10496,7 +10525,7 @@
           <w:rFonts w:ascii="Times New Roman" w:hAnsi="Times New Roman"/>
           <w:sz w:val="20"/>
         </w:rPr>
-        <w:t>27. Schmidli H, Gsteiger S, Roychoudhury S, O'Hagan A, Spiegelhalter D, Neuenschwander B. Robust meta-analytic-predictive priors in clinical trials with historical control information. Biometrics. 2014;70(4):1023-32.</w:t>
+        <w:t>27. Hernan MA, Wang W, Leaf DE. Target trial emulation: a framework for causal inference from observational data. JAMA. 2022;328(24):2446-7.</w:t>
       </w:r>
     </w:p>
     <w:p>
@@ -10505,7 +10534,7 @@
           <w:rFonts w:ascii="Times New Roman" w:hAnsi="Times New Roman"/>
           <w:sz w:val="20"/>
         </w:rPr>
-        <w:t>28. Verde PE, Ohmann C. Combining randomized and non-randomized evidence in clinical research: a review of methods and applications. Res Synth Methods. 2015;6(1):45-62.</w:t>
+        <w:t>28. Schmidli H, Gsteiger S, Roychoudhury S, O'Hagan A, Spiegelhalter D, Neuenschwander B. Robust meta-analytic-predictive priors in clinical trials with historical control information. Biometrics. 2014;70(4):1023-32.</w:t>
       </w:r>
     </w:p>
     <w:p>
@@ -10514,7 +10543,16 @@
           <w:rFonts w:ascii="Times New Roman" w:hAnsi="Times New Roman"/>
           <w:sz w:val="20"/>
         </w:rPr>
-        <w:t>29. Efthimiou O, Mavridis D, Debray TPA, Samara M, Belger M, Salanti G, et al. Combining randomized and non-randomized evidence in network meta-analysis. Stat Med. 2017;36(8):1210-26.</w:t>
+        <w:t>29. Verde PE, Ohmann C. Combining randomized and non-randomized evidence in clinical research: a review of methods and applications. Res Synth Methods. 2015;6(1):45-62.</w:t>
+      </w:r>
+    </w:p>
+    <w:p>
+      <w:r>
+        <w:rPr>
+          <w:rFonts w:ascii="Times New Roman" w:hAnsi="Times New Roman"/>
+          <w:sz w:val="20"/>
+        </w:rPr>
+        <w:t>30. Efthimiou O, Mavridis D, Debray TPA, Samara M, Belger M, Salanti G, et al. Combining randomized and non-randomized evidence in network meta-analysis. Stat Med. 2017;36(8):1210-26.</w:t>
       </w:r>
     </w:p>
     <w:sectPr>

</xml_diff>

<commit_message>
replace Metropolis with emcee ensemble MCMC and add convergence diagnostics
- Use emcee affine-invariant ensemble sampler for power-prior meta-analysis.

- Add split-R-hat and ESS diagnostics in run_validation.py.

- Report minimum ESS and maximum R-hat in Methods; cite Foreman-Mackey et al. (emcee).

- Add emcee to requirements.txt and update CCTC/RSM/generic outputs and submission package.

Co-Authored-By: Tatsuki Onishi <bougtoir@gmail.com>
</commit_message>
<xml_diff>
--- a/rct-decomposition/KOTHA_Framework_CCTC.docx
+++ b/rct-decomposition/KOTHA_Framework_CCTC.docx
@@ -52,7 +52,7 @@
           <w:i w:val="0"/>
           <w:sz w:val="24"/>
         </w:rPr>
-        <w:t>Word count: 2254</w:t>
+        <w:t>Word count: 2299</w:t>
       </w:r>
     </w:p>
     <w:p>
@@ -203,7 +203,7 @@
           <w:sz w:val="24"/>
           <w:szCs w:val="24"/>
         </w:rPr>
-        <w:t xml:space="preserve">= 62%. In the statins case, observational HR was 0.72 (0.64-0.80) versus RCT HR 0.97 (0.90-1.05), with an RCT-to-observational event rate ratio of 0.53. Bayesian integration with moderate discounting (α = 0.3) yielded OR 0.73 (95% CrI: 0.28-2.09), P(OR &lt; 1) = 77% for magnesium, and HR 0.85 (0.59-1.57), P(HR &lt; 1) = 84% for statins.</w:t>
+        <w:t xml:space="preserve">= 62%. In the statins case, observational HR was 0.72 (0.64-0.80) versus RCT HR 0.97 (0.90-1.05), with an RCT-to-observational event rate ratio of 0.53. Bayesian integration with moderate discounting (α = 0.3) yielded OR 0.74 (95% CrI: 0.25-1.40), P(OR &lt; 1) = 81% for magnesium, and HR 0.85 (0.57-1.27), P(HR &lt; 1) = 86% for statins.</w:t>
       </w:r>
     </w:p>
     <w:p xmlns:a="http://schemas.openxmlformats.org/drawingml/2006/main" xmlns:pic="http://schemas.openxmlformats.org/drawingml/2006/picture">
@@ -2555,7 +2555,7 @@
           <w:sz w:val="24"/>
           <w:szCs w:val="24"/>
         </w:rPr>
-        <w:t xml:space="preserve">. Alternative effect measures such as restricted mean survival time can be substituted when proportional-hazards assumptions are questionable [12-13]. Evidence-based priors have been proposed to anchor historical expectations while limiting prior-data conflict [14]. We also present bias-adjusted normal-approximation analyses as a sensitivity check. Posterior distributions are obtained by Metropolis-Hastings MCMC (15,000 post-warmup iterations after 3,000 warmup) for each</w:t>
+        <w:t xml:space="preserve">. Alternative effect measures such as restricted mean survival time can be substituted when proportional-hazards assumptions are questionable [12-13]. Evidence-based priors have been proposed to anchor historical expectations while limiting prior-data conflict [14]. We also present bias-adjusted normal-approximation analyses as a sensitivity check. Posterior distributions are sampled with an affine-invariant ensemble MCMC [16] using 16 walkers, 1,000 warmup and 4,000 post-warmup iterations per walker, for each</w:t>
       </w:r>
       <w:r>
         <w:rPr>
@@ -2669,7 +2669,7 @@
           <w:sz w:val="24"/>
           <w:szCs w:val="24"/>
         </w:rPr>
-        <w:t xml:space="preserve">; we report the full grid to show sensitivity and use</w:t>
+        <w:t xml:space="preserve">. Convergence was assessed with split-R-hat and effective sample size (ESS) for the population mean log effect and the between-study heterogeneity. Across all discounting factors the minimum ESS was 929 and the maximum split-R-hat was 1.022, indicating satisfactory convergence. We report the full grid to show sensitivity and use</w:t>
       </w:r>
       <w:r>
         <w:rPr>
@@ -2866,7 +2866,7 @@
           <w:sz w:val="24"/>
           <w:szCs w:val="24"/>
         </w:rPr>
-        <w:t xml:space="preserve">For magnesium in AMI we used study-level event counts extracted from published overviews [16-17]. For statins in heart failure we used aggregate data from five observational cohorts [18-22] and two RCTs [23-24]. We used DerSimonian-Laird random-effects meta-analysis [25] and computed 95% confidence intervals. OIS and TSA were calculated using standard formulas [6-9]. All analyses were performed with the Python code in the public repository.</w:t>
+        <w:t xml:space="preserve">For magnesium in AMI we used study-level event counts extracted from published overviews [17-18]. For statins in heart failure we used aggregate data from five observational cohorts [19-23] and two RCTs [24-25]. We used DerSimonian-Laird random-effects meta-analysis [26] and computed 95% confidence intervals. OIS and TSA were calculated using standard formulas [6-9]. All analyses were performed with the Python code in the public repository.</w:t>
       </w:r>
     </w:p>
     <w:p>
@@ -6785,7 +6785,7 @@
           <w:sz w:val="24"/>
           <w:szCs w:val="24"/>
         </w:rPr>
-        <w:t xml:space="preserve">= 0 (ISIS-4 only), the posterior median OR was 1.11 with 30.6% probability of benefit. With</w:t>
+        <w:t xml:space="preserve">= 0 (ISIS-4 only), the posterior median OR was 1.05 with 40.9% probability of benefit. With</w:t>
       </w:r>
       <w:r>
         <w:rPr>
@@ -6814,7 +6814,7 @@
           <w:sz w:val="24"/>
           <w:szCs w:val="24"/>
         </w:rPr>
-        <w:t xml:space="preserve">= 0.3 the posterior shifted to OR = 0.73 (95% CrI: 0.28-2.09), with 77% probability of benefit (Fig. 7A). For statins (Table 6), with</w:t>
+        <w:t xml:space="preserve">= 0.3 the posterior shifted to OR = 0.74 (95% CrI: 0.25-1.40), with 81% probability of benefit (Fig. 7A). For statins (Table 6), with</w:t>
       </w:r>
       <w:r>
         <w:rPr>
@@ -6843,7 +6843,7 @@
           <w:sz w:val="24"/>
           <w:szCs w:val="24"/>
         </w:rPr>
-        <w:t xml:space="preserve">= 0 (RCTs only) the posterior probability of benefit was 60.9% and the probability of a clinically meaningful benefit (HR &lt; 0.90) was 17.7%. With</w:t>
+        <w:t xml:space="preserve">= 0 (RCTs only) the posterior probability of benefit was 61.9% and the probability of a clinically meaningful benefit (HR &lt; 0.90) was 21.8%. With</w:t>
       </w:r>
       <w:r>
         <w:rPr>
@@ -6872,7 +6872,7 @@
           <w:sz w:val="24"/>
           <w:szCs w:val="24"/>
         </w:rPr>
-        <w:t xml:space="preserve">= 0.3 these probabilities rose to 83.7% and 65.7%, respectively (Fig. 7B). Even with moderate borrowing from observational evidence, conclusions remained uncertain.</w:t>
+        <w:t xml:space="preserve">= 0.3 these probabilities rose to 85.8% and 65.6%, respectively (Fig. 7B). Even with moderate borrowing from observational evidence, conclusions remained uncertain.</w:t>
       </w:r>
     </w:p>
     <w:p>
@@ -7029,7 +7029,7 @@
                 <w:sz w:val="20"/>
                 <w:szCs w:val="20"/>
               </w:rPr>
-              <w:t xml:space="preserve">1.11 (0.43–7.03)</w:t>
+              <w:t xml:space="preserve">1.05 (0.05–38.33)</w:t>
             </w:r>
           </w:p>
         </w:tc>
@@ -7047,7 +7047,7 @@
                 <w:sz w:val="20"/>
                 <w:szCs w:val="20"/>
               </w:rPr>
-              <w:t xml:space="preserve">30.6%</w:t>
+              <w:t xml:space="preserve">40.9%</w:t>
             </w:r>
           </w:p>
         </w:tc>
@@ -7065,7 +7065,7 @@
                 <w:sz w:val="20"/>
                 <w:szCs w:val="20"/>
               </w:rPr>
-              <w:t xml:space="preserve">22.2%</w:t>
+              <w:t xml:space="preserve">31.5%</w:t>
             </w:r>
           </w:p>
         </w:tc>
@@ -7083,7 +7083,7 @@
                 <w:sz w:val="20"/>
                 <w:szCs w:val="20"/>
               </w:rPr>
-              <w:t xml:space="preserve">16.2%</w:t>
+              <w:t xml:space="preserve">24.9%</w:t>
             </w:r>
           </w:p>
         </w:tc>
@@ -7121,7 +7121,7 @@
                 <w:sz w:val="20"/>
                 <w:szCs w:val="20"/>
               </w:rPr>
-              <w:t xml:space="preserve">1.00 (0.31–3.51)</w:t>
+              <w:t xml:space="preserve">0.94 (0.16–3.56)</w:t>
             </w:r>
           </w:p>
         </w:tc>
@@ -7139,7 +7139,7 @@
                 <w:sz w:val="20"/>
                 <w:szCs w:val="20"/>
               </w:rPr>
-              <w:t xml:space="preserve">50.7%</w:t>
+              <w:t xml:space="preserve">57.8%</w:t>
             </w:r>
           </w:p>
         </w:tc>
@@ -7157,7 +7157,7 @@
                 <w:sz w:val="20"/>
                 <w:szCs w:val="20"/>
               </w:rPr>
-              <w:t xml:space="preserve">36.6%</w:t>
+              <w:t xml:space="preserve">46.2%</w:t>
             </w:r>
           </w:p>
         </w:tc>
@@ -7175,7 +7175,7 @@
                 <w:sz w:val="20"/>
                 <w:szCs w:val="20"/>
               </w:rPr>
-              <w:t xml:space="preserve">27.9%</w:t>
+              <w:t xml:space="preserve">36.4%</w:t>
             </w:r>
           </w:p>
         </w:tc>
@@ -7213,7 +7213,7 @@
                 <w:sz w:val="20"/>
                 <w:szCs w:val="20"/>
               </w:rPr>
-              <w:t xml:space="preserve">0.85 (0.31–2.50)</w:t>
+              <w:t xml:space="preserve">0.83 (0.22–1.82)</w:t>
             </w:r>
           </w:p>
         </w:tc>
@@ -7231,7 +7231,7 @@
                 <w:sz w:val="20"/>
                 <w:szCs w:val="20"/>
               </w:rPr>
-              <w:t xml:space="preserve">66.5%</w:t>
+              <w:t xml:space="preserve">71.1%</w:t>
             </w:r>
           </w:p>
         </w:tc>
@@ -7249,7 +7249,7 @@
                 <w:sz w:val="20"/>
                 <w:szCs w:val="20"/>
               </w:rPr>
-              <w:t xml:space="preserve">55.0%</w:t>
+              <w:t xml:space="preserve">58.3%</w:t>
             </w:r>
           </w:p>
         </w:tc>
@@ -7267,7 +7267,7 @@
                 <w:sz w:val="20"/>
                 <w:szCs w:val="20"/>
               </w:rPr>
-              <w:t xml:space="preserve">45.8%</w:t>
+              <w:t xml:space="preserve">45.6%</w:t>
             </w:r>
           </w:p>
         </w:tc>
@@ -7305,7 +7305,7 @@
                 <w:sz w:val="20"/>
                 <w:szCs w:val="20"/>
               </w:rPr>
-              <w:t xml:space="preserve">0.73 (0.28–2.09)</w:t>
+              <w:t xml:space="preserve">0.74 (0.25–1.40)</w:t>
             </w:r>
           </w:p>
         </w:tc>
@@ -7323,7 +7323,7 @@
                 <w:sz w:val="20"/>
                 <w:szCs w:val="20"/>
               </w:rPr>
-              <w:t xml:space="preserve">77.0%</w:t>
+              <w:t xml:space="preserve">81.4%</w:t>
             </w:r>
           </w:p>
         </w:tc>
@@ -7341,7 +7341,7 @@
                 <w:sz w:val="20"/>
                 <w:szCs w:val="20"/>
               </w:rPr>
-              <w:t xml:space="preserve">66.3%</w:t>
+              <w:t xml:space="preserve">70.2%</w:t>
             </w:r>
           </w:p>
         </w:tc>
@@ -7359,7 +7359,7 @@
                 <w:sz w:val="20"/>
                 <w:szCs w:val="20"/>
               </w:rPr>
-              <w:t xml:space="preserve">56.9%</w:t>
+              <w:t xml:space="preserve">57.7%</w:t>
             </w:r>
           </w:p>
         </w:tc>
@@ -7397,7 +7397,7 @@
                 <w:sz w:val="20"/>
                 <w:szCs w:val="20"/>
               </w:rPr>
-              <w:t xml:space="preserve">0.61 (0.28–1.30)</w:t>
+              <w:t xml:space="preserve">0.65 (0.28–1.10)</w:t>
             </w:r>
           </w:p>
         </w:tc>
@@ -7415,7 +7415,7 @@
                 <w:sz w:val="20"/>
                 <w:szCs w:val="20"/>
               </w:rPr>
-              <w:t xml:space="preserve">92.6%</w:t>
+              <w:t xml:space="preserve">93.8%</w:t>
             </w:r>
           </w:p>
         </w:tc>
@@ -7433,7 +7433,7 @@
                 <w:sz w:val="20"/>
                 <w:szCs w:val="20"/>
               </w:rPr>
-              <w:t xml:space="preserve">87.3%</w:t>
+              <w:t xml:space="preserve">86.5%</w:t>
             </w:r>
           </w:p>
         </w:tc>
@@ -7451,7 +7451,7 @@
                 <w:sz w:val="20"/>
                 <w:szCs w:val="20"/>
               </w:rPr>
-              <w:t xml:space="preserve">77.1%</w:t>
+              <w:t xml:space="preserve">75.1%</w:t>
             </w:r>
           </w:p>
         </w:tc>
@@ -7489,7 +7489,7 @@
                 <w:sz w:val="20"/>
                 <w:szCs w:val="20"/>
               </w:rPr>
-              <w:t xml:space="preserve">0.57 (0.29–1.05)</w:t>
+              <w:t xml:space="preserve">0.59 (0.29–0.96)</w:t>
             </w:r>
           </w:p>
         </w:tc>
@@ -7507,7 +7507,7 @@
                 <w:sz w:val="20"/>
                 <w:szCs w:val="20"/>
               </w:rPr>
-              <w:t xml:space="preserve">96.6%</w:t>
+              <w:t xml:space="preserve">98.3%</w:t>
             </w:r>
           </w:p>
         </w:tc>
@@ -7525,7 +7525,7 @@
                 <w:sz w:val="20"/>
                 <w:szCs w:val="20"/>
               </w:rPr>
-              <w:t xml:space="preserve">94.1%</w:t>
+              <w:t xml:space="preserve">94.9%</w:t>
             </w:r>
           </w:p>
         </w:tc>
@@ -7543,7 +7543,7 @@
                 <w:sz w:val="20"/>
                 <w:szCs w:val="20"/>
               </w:rPr>
-              <w:t xml:space="preserve">87.4%</w:t>
+              <w:t xml:space="preserve">87.2%</w:t>
             </w:r>
           </w:p>
         </w:tc>
@@ -7581,7 +7581,7 @@
                 <w:sz w:val="20"/>
                 <w:szCs w:val="20"/>
               </w:rPr>
-              <w:t xml:space="preserve">0.54 (0.32–0.91)</w:t>
+              <w:t xml:space="preserve">0.55 (0.30–0.85)</w:t>
             </w:r>
           </w:p>
         </w:tc>
@@ -7599,7 +7599,7 @@
                 <w:sz w:val="20"/>
                 <w:szCs w:val="20"/>
               </w:rPr>
-              <w:t xml:space="preserve">98.7%</w:t>
+              <w:t xml:space="preserve">99.7%</w:t>
             </w:r>
           </w:p>
         </w:tc>
@@ -7617,7 +7617,7 @@
                 <w:sz w:val="20"/>
                 <w:szCs w:val="20"/>
               </w:rPr>
-              <w:t xml:space="preserve">97.2%</w:t>
+              <w:t xml:space="preserve">98.6%</w:t>
             </w:r>
           </w:p>
         </w:tc>
@@ -7635,7 +7635,7 @@
                 <w:sz w:val="20"/>
                 <w:szCs w:val="20"/>
               </w:rPr>
-              <w:t xml:space="preserve">93.5%</w:t>
+              <w:t xml:space="preserve">95.0%</w:t>
             </w:r>
           </w:p>
         </w:tc>
@@ -7795,7 +7795,7 @@
                 <w:sz w:val="20"/>
                 <w:szCs w:val="20"/>
               </w:rPr>
-              <w:t xml:space="preserve">0.98 (0.63–2.35)</w:t>
+              <w:t xml:space="preserve">0.97 (0.54–1.67)</w:t>
             </w:r>
           </w:p>
         </w:tc>
@@ -7813,7 +7813,7 @@
                 <w:sz w:val="20"/>
                 <w:szCs w:val="20"/>
               </w:rPr>
-              <w:t xml:space="preserve">60.9%</w:t>
+              <w:t xml:space="preserve">61.9%</w:t>
             </w:r>
           </w:p>
         </w:tc>
@@ -7831,7 +7831,7 @@
                 <w:sz w:val="20"/>
                 <w:szCs w:val="20"/>
               </w:rPr>
-              <w:t xml:space="preserve">17.7%</w:t>
+              <w:t xml:space="preserve">21.8%</w:t>
             </w:r>
           </w:p>
         </w:tc>
@@ -7849,7 +7849,7 @@
                 <w:sz w:val="20"/>
                 <w:szCs w:val="20"/>
               </w:rPr>
-              <w:t xml:space="preserve">9.1%</w:t>
+              <w:t xml:space="preserve">10.0%</w:t>
             </w:r>
           </w:p>
         </w:tc>
@@ -7887,7 +7887,7 @@
                 <w:sz w:val="20"/>
                 <w:szCs w:val="20"/>
               </w:rPr>
-              <w:t xml:space="preserve">0.92 (0.63–2.19)</w:t>
+              <w:t xml:space="preserve">0.92 (0.46–1.65)</w:t>
             </w:r>
           </w:p>
         </w:tc>
@@ -7905,7 +7905,7 @@
                 <w:sz w:val="20"/>
                 <w:szCs w:val="20"/>
               </w:rPr>
-              <w:t xml:space="preserve">70.4%</w:t>
+              <w:t xml:space="preserve">72.5%</w:t>
             </w:r>
           </w:p>
         </w:tc>
@@ -7923,7 +7923,7 @@
                 <w:sz w:val="20"/>
                 <w:szCs w:val="20"/>
               </w:rPr>
-              <w:t xml:space="preserve">43.5%</w:t>
+              <w:t xml:space="preserve">44.3%</w:t>
             </w:r>
           </w:p>
         </w:tc>
@@ -7941,7 +7941,7 @@
                 <w:sz w:val="20"/>
                 <w:szCs w:val="20"/>
               </w:rPr>
-              <w:t xml:space="preserve">17.7%</w:t>
+              <w:t xml:space="preserve">20.2%</w:t>
             </w:r>
           </w:p>
         </w:tc>
@@ -7979,7 +7979,7 @@
                 <w:sz w:val="20"/>
                 <w:szCs w:val="20"/>
               </w:rPr>
-              <w:t xml:space="preserve">0.88 (0.60–1.80)</w:t>
+              <w:t xml:space="preserve">0.88 (0.53–1.37)</w:t>
             </w:r>
           </w:p>
         </w:tc>
@@ -7997,7 +7997,7 @@
                 <w:sz w:val="20"/>
                 <w:szCs w:val="20"/>
               </w:rPr>
-              <w:t xml:space="preserve">78.4%</w:t>
+              <w:t xml:space="preserve">81.5%</w:t>
             </w:r>
           </w:p>
         </w:tc>
@@ -8015,7 +8015,7 @@
                 <w:sz w:val="20"/>
                 <w:szCs w:val="20"/>
               </w:rPr>
-              <w:t xml:space="preserve">57.0%</w:t>
+              <w:t xml:space="preserve">57.7%</w:t>
             </w:r>
           </w:p>
         </w:tc>
@@ -8033,7 +8033,7 @@
                 <w:sz w:val="20"/>
                 <w:szCs w:val="20"/>
               </w:rPr>
-              <w:t xml:space="preserve">26.0%</w:t>
+              <w:t xml:space="preserve">26.9%</w:t>
             </w:r>
           </w:p>
         </w:tc>
@@ -8071,7 +8071,7 @@
                 <w:sz w:val="20"/>
                 <w:szCs w:val="20"/>
               </w:rPr>
-              <w:t xml:space="preserve">0.85 (0.59–1.57)</w:t>
+              <w:t xml:space="preserve">0.85 (0.57–1.27)</w:t>
             </w:r>
           </w:p>
         </w:tc>
@@ -8089,7 +8089,7 @@
                 <w:sz w:val="20"/>
                 <w:szCs w:val="20"/>
               </w:rPr>
-              <w:t xml:space="preserve">83.7%</w:t>
+              <w:t xml:space="preserve">85.8%</w:t>
             </w:r>
           </w:p>
         </w:tc>
@@ -8107,7 +8107,7 @@
                 <w:sz w:val="20"/>
                 <w:szCs w:val="20"/>
               </w:rPr>
-              <w:t xml:space="preserve">65.7%</w:t>
+              <w:t xml:space="preserve">65.6%</w:t>
             </w:r>
           </w:p>
         </w:tc>
@@ -8125,7 +8125,7 @@
                 <w:sz w:val="20"/>
                 <w:szCs w:val="20"/>
               </w:rPr>
-              <w:t xml:space="preserve">32.8%</w:t>
+              <w:t xml:space="preserve">30.5%</w:t>
             </w:r>
           </w:p>
         </w:tc>
@@ -8163,7 +8163,7 @@
                 <w:sz w:val="20"/>
                 <w:szCs w:val="20"/>
               </w:rPr>
-              <w:t xml:space="preserve">0.82 (0.62–1.15)</w:t>
+              <w:t xml:space="preserve">0.82 (0.60–1.10)</w:t>
             </w:r>
           </w:p>
         </w:tc>
@@ -8181,7 +8181,7 @@
                 <w:sz w:val="20"/>
                 <w:szCs w:val="20"/>
               </w:rPr>
-              <w:t xml:space="preserve">91.9%</w:t>
+              <w:t xml:space="preserve">93.6%</w:t>
             </w:r>
           </w:p>
         </w:tc>
@@ -8199,7 +8199,7 @@
                 <w:sz w:val="20"/>
                 <w:szCs w:val="20"/>
               </w:rPr>
-              <w:t xml:space="preserve">79.2%</w:t>
+              <w:t xml:space="preserve">78.9%</w:t>
             </w:r>
           </w:p>
         </w:tc>
@@ -8217,7 +8217,7 @@
                 <w:sz w:val="20"/>
                 <w:szCs w:val="20"/>
               </w:rPr>
-              <w:t xml:space="preserve">42.5%</w:t>
+              <w:t xml:space="preserve">39.9%</w:t>
             </w:r>
           </w:p>
         </w:tc>
@@ -8255,7 +8255,7 @@
                 <w:sz w:val="20"/>
                 <w:szCs w:val="20"/>
               </w:rPr>
-              <w:t xml:space="preserve">0.79 (0.63–1.02)</w:t>
+              <w:t xml:space="preserve">0.80 (0.62–0.99)</w:t>
             </w:r>
           </w:p>
         </w:tc>
@@ -8273,7 +8273,7 @@
                 <w:sz w:val="20"/>
                 <w:szCs w:val="20"/>
               </w:rPr>
-              <w:t xml:space="preserve">96.8%</w:t>
+              <w:t xml:space="preserve">97.7%</w:t>
             </w:r>
           </w:p>
         </w:tc>
@@ -8291,7 +8291,7 @@
                 <w:sz w:val="20"/>
                 <w:szCs w:val="20"/>
               </w:rPr>
-              <w:t xml:space="preserve">88.7%</w:t>
+              <w:t xml:space="preserve">89.3%</w:t>
             </w:r>
           </w:p>
         </w:tc>
@@ -8309,7 +8309,7 @@
                 <w:sz w:val="20"/>
                 <w:szCs w:val="20"/>
               </w:rPr>
-              <w:t xml:space="preserve">53.4%</w:t>
+              <w:t xml:space="preserve">51.4%</w:t>
             </w:r>
           </w:p>
         </w:tc>
@@ -8347,7 +8347,7 @@
                 <w:sz w:val="20"/>
                 <w:szCs w:val="20"/>
               </w:rPr>
-              <w:t xml:space="preserve">0.78 (0.65–0.95)</w:t>
+              <w:t xml:space="preserve">0.78 (0.64–0.94)</w:t>
             </w:r>
           </w:p>
         </w:tc>
@@ -8365,7 +8365,7 @@
                 <w:sz w:val="20"/>
                 <w:szCs w:val="20"/>
               </w:rPr>
-              <w:t xml:space="preserve">99.1%</w:t>
+              <w:t xml:space="preserve">99.3%</w:t>
             </w:r>
           </w:p>
         </w:tc>
@@ -8383,7 +8383,7 @@
                 <w:sz w:val="20"/>
                 <w:szCs w:val="20"/>
               </w:rPr>
-              <w:t xml:space="preserve">94.8%</w:t>
+              <w:t xml:space="preserve">94.6%</w:t>
             </w:r>
           </w:p>
         </w:tc>
@@ -8401,7 +8401,7 @@
                 <w:sz w:val="20"/>
                 <w:szCs w:val="20"/>
               </w:rPr>
-              <w:t xml:space="preserve">64.1%</w:t>
+              <w:t xml:space="preserve">61.7%</w:t>
             </w:r>
           </w:p>
         </w:tc>
@@ -9938,7 +9938,7 @@
           <w:sz w:val="24"/>
           <w:szCs w:val="24"/>
         </w:rPr>
-        <w:t xml:space="preserve">Target trial emulation uses observational data to mimic a specific RCT in order to estimate a causal effect [26-27]. Module K is complementary: it does not estimate effects but quantifies the information lost due to enrollment decisions. Existing methods for combining RCT and observational evidence include hierarchical models, power priors, and meta-analytic-predictive priors [28-30]. Module T builds on these but embeds them in a broader workflow that first diagnoses the need for integration and then interprets the result through Module H. TSA and OIS are well established [6-9], but are not routinely used to quantify risk-profile shifts. GRADE provides domains for assessment [1]; KOTHA provides quantitative inputs to the imprecision and indirectness domains without changing GRADE’s structure.</w:t>
+        <w:t xml:space="preserve">Target trial emulation uses observational data to mimic a specific RCT in order to estimate a causal effect [27-28]. Module K is complementary: it does not estimate effects but quantifies the information lost due to enrollment decisions. Existing methods for combining RCT and observational evidence include hierarchical models, power priors, and meta-analytic-predictive priors [29-31]. Module T builds on these but embeds them in a broader workflow that first diagnoses the need for integration and then interprets the result through Module H. TSA and OIS are well established [6-9], but are not routinely used to quantify risk-profile shifts. GRADE provides domains for assessment [1]; KOTHA provides quantitative inputs to the imprecision and indirectness domains without changing GRADE’s structure.</w:t>
       </w:r>
     </w:p>
     <w:p>
@@ -10426,7 +10426,7 @@
           <w:rFonts w:ascii="Times New Roman" w:hAnsi="Times New Roman"/>
           <w:sz w:val="20"/>
         </w:rPr>
-        <w:t>16. Teo KK, Yusuf S, Collins R, Held PH, Peto R. Effects of intravenous magnesium in suspected acute myocardial infarction: overview of randomised trials. BMJ. 1991;303(6816):1499-503.</w:t>
+        <w:t>16. Foreman-Mackey D, Hogg DW, Lang D, Goodman J. emcee: the MCMC hammer. Publ Astron Soc Pac. 2013;125(925):306-12.</w:t>
       </w:r>
     </w:p>
     <w:p>
@@ -10435,7 +10435,7 @@
           <w:rFonts w:ascii="Times New Roman" w:hAnsi="Times New Roman"/>
           <w:sz w:val="20"/>
         </w:rPr>
-        <w:t>17. Li J, Zhang Q, Zhang M, Egger M. Intravenous magnesium for acute myocardial infarction. Cochrane Database Syst Rev. 2007;(2):CD002755.</w:t>
+        <w:t>17. Teo KK, Yusuf S, Collins R, Held PH, Peto R. Effects of intravenous magnesium in suspected acute myocardial infarction: overview of randomised trials. BMJ. 1991;303(6816):1499-503.</w:t>
       </w:r>
     </w:p>
     <w:p>
@@ -10444,7 +10444,7 @@
           <w:rFonts w:ascii="Times New Roman" w:hAnsi="Times New Roman"/>
           <w:sz w:val="20"/>
         </w:rPr>
-        <w:t>18. Anker SD, Clark AL, Winkler R, Zugck C, Cicoira M, Haehling S, et al. Statin use and survival in patients with chronic heart failure -- results from two observational studies with 5200 patients. Int J Cardiol. 2006;112(2):234-42.</w:t>
+        <w:t>18. Li J, Zhang Q, Zhang M, Egger M. Intravenous magnesium for acute myocardial infarction. Cochrane Database Syst Rev. 2007;(2):CD002755.</w:t>
       </w:r>
     </w:p>
     <w:p>
@@ -10453,7 +10453,7 @@
           <w:rFonts w:ascii="Times New Roman" w:hAnsi="Times New Roman"/>
           <w:sz w:val="20"/>
         </w:rPr>
-        <w:t>19. Mozaffarian D, Nye R, Levy WC. Statin therapy is associated with lower mortality among patients with severe heart failure. Am J Cardiol. 2004;93(9):1124-9.</w:t>
+        <w:t>19. Anker SD, Clark AL, Winkler R, Zugck C, Cicoira M, Haehling S, et al. Statin use and survival in patients with chronic heart failure -- results from two observational studies with 5200 patients. Int J Cardiol. 2006;112(2):234-42.</w:t>
       </w:r>
     </w:p>
     <w:p>
@@ -10462,7 +10462,7 @@
           <w:rFonts w:ascii="Times New Roman" w:hAnsi="Times New Roman"/>
           <w:sz w:val="20"/>
         </w:rPr>
-        <w:t>20. Horwich TB, MacLellan WR, Fonarow GC. Statin therapy is associated with improved survival in ischemic and non-ischemic heart failure. J Am Coll Cardiol. 2004;43(4):642-8.</w:t>
+        <w:t>20. Mozaffarian D, Nye R, Levy WC. Statin therapy is associated with lower mortality among patients with severe heart failure. Am J Cardiol. 2004;93(9):1124-9.</w:t>
       </w:r>
     </w:p>
     <w:p>
@@ -10471,7 +10471,7 @@
           <w:rFonts w:ascii="Times New Roman" w:hAnsi="Times New Roman"/>
           <w:sz w:val="20"/>
         </w:rPr>
-        <w:t>21. Go AS, Lee WY, Yang J, Lo JC, Gurwitz JH. Statin therapy and risks for death and hospitalization in chronic heart failure. JAMA. 2006;296(17):2105-11.</w:t>
+        <w:t>21. Horwich TB, MacLellan WR, Fonarow GC. Statin therapy is associated with improved survival in ischemic and non-ischemic heart failure. J Am Coll Cardiol. 2004;43(4):642-8.</w:t>
       </w:r>
     </w:p>
     <w:p>
@@ -10480,7 +10480,7 @@
           <w:rFonts w:ascii="Times New Roman" w:hAnsi="Times New Roman"/>
           <w:sz w:val="20"/>
         </w:rPr>
-        <w:t>22. Foody JM, Shah R, Galusha D, Masoudi FA, Havranek EP, Krumholz HM. Statins and mortality among elderly patients hospitalized with heart failure. Circulation. 2006;113(8):1086-92.</w:t>
+        <w:t>22. Go AS, Lee WY, Yang J, Lo JC, Gurwitz JH. Statin therapy and risks for death and hospitalization in chronic heart failure. JAMA. 2006;296(17):2105-11.</w:t>
       </w:r>
     </w:p>
     <w:p>
@@ -10489,7 +10489,7 @@
           <w:rFonts w:ascii="Times New Roman" w:hAnsi="Times New Roman"/>
           <w:sz w:val="20"/>
         </w:rPr>
-        <w:t>23. Kjekshus J, Apetrei E, Barrios V, Bohm M, Cleland JG, Cornel JH, et al. Rosuvastatin in older patients with systolic heart failure. N Engl J Med. 2007;357(22):2248-61.</w:t>
+        <w:t>23. Foody JM, Shah R, Galusha D, Masoudi FA, Havranek EP, Krumholz HM. Statins and mortality among elderly patients hospitalized with heart failure. Circulation. 2006;113(8):1086-92.</w:t>
       </w:r>
     </w:p>
     <w:p>
@@ -10498,7 +10498,7 @@
           <w:rFonts w:ascii="Times New Roman" w:hAnsi="Times New Roman"/>
           <w:sz w:val="20"/>
         </w:rPr>
-        <w:t>24. GISSI-HF Investigators. Effect of rosuvastatin in patients with chronic heart failure (the GISSI-HF trial): a randomised, double-blind, placebo-controlled trial. Lancet. 2008;372(9645):1231-9.</w:t>
+        <w:t>24. Kjekshus J, Apetrei E, Barrios V, Bohm M, Cleland JG, Cornel JH, et al. Rosuvastatin in older patients with systolic heart failure. N Engl J Med. 2007;357(22):2248-61.</w:t>
       </w:r>
     </w:p>
     <w:p>
@@ -10507,7 +10507,7 @@
           <w:rFonts w:ascii="Times New Roman" w:hAnsi="Times New Roman"/>
           <w:sz w:val="20"/>
         </w:rPr>
-        <w:t>25. DerSimonian R, Laird N. Meta-analysis in clinical trials. Control Clin Trials. 1986;7(3):177-88.</w:t>
+        <w:t>25. GISSI-HF Investigators. Effect of rosuvastatin in patients with chronic heart failure (the GISSI-HF trial): a randomised, double-blind, placebo-controlled trial. Lancet. 2008;372(9645):1231-9.</w:t>
       </w:r>
     </w:p>
     <w:p>
@@ -10516,7 +10516,7 @@
           <w:rFonts w:ascii="Times New Roman" w:hAnsi="Times New Roman"/>
           <w:sz w:val="20"/>
         </w:rPr>
-        <w:t>26. Hernan MA, Robins JM. Using big data to emulate a target trial when a randomized trial is not available. Am J Epidemiol. 2016;183(8):758-64.</w:t>
+        <w:t>26. DerSimonian R, Laird N. Meta-analysis in clinical trials. Control Clin Trials. 1986;7(3):177-88.</w:t>
       </w:r>
     </w:p>
     <w:p>
@@ -10525,7 +10525,7 @@
           <w:rFonts w:ascii="Times New Roman" w:hAnsi="Times New Roman"/>
           <w:sz w:val="20"/>
         </w:rPr>
-        <w:t>27. Hernan MA, Wang W, Leaf DE. Target trial emulation: a framework for causal inference from observational data. JAMA. 2022;328(24):2446-7.</w:t>
+        <w:t>27. Hernan MA, Robins JM. Using big data to emulate a target trial when a randomized trial is not available. Am J Epidemiol. 2016;183(8):758-64.</w:t>
       </w:r>
     </w:p>
     <w:p>
@@ -10534,7 +10534,7 @@
           <w:rFonts w:ascii="Times New Roman" w:hAnsi="Times New Roman"/>
           <w:sz w:val="20"/>
         </w:rPr>
-        <w:t>28. Schmidli H, Gsteiger S, Roychoudhury S, O'Hagan A, Spiegelhalter D, Neuenschwander B. Robust meta-analytic-predictive priors in clinical trials with historical control information. Biometrics. 2014;70(4):1023-32.</w:t>
+        <w:t>28. Hernan MA, Wang W, Leaf DE. Target trial emulation: a framework for causal inference from observational data. JAMA. 2022;328(24):2446-7.</w:t>
       </w:r>
     </w:p>
     <w:p>
@@ -10543,7 +10543,7 @@
           <w:rFonts w:ascii="Times New Roman" w:hAnsi="Times New Roman"/>
           <w:sz w:val="20"/>
         </w:rPr>
-        <w:t>29. Verde PE, Ohmann C. Combining randomized and non-randomized evidence in clinical research: a review of methods and applications. Res Synth Methods. 2015;6(1):45-62.</w:t>
+        <w:t>29. Schmidli H, Gsteiger S, Roychoudhury S, O'Hagan A, Spiegelhalter D, Neuenschwander B. Robust meta-analytic-predictive priors in clinical trials with historical control information. Biometrics. 2014;70(4):1023-32.</w:t>
       </w:r>
     </w:p>
     <w:p>
@@ -10552,7 +10552,16 @@
           <w:rFonts w:ascii="Times New Roman" w:hAnsi="Times New Roman"/>
           <w:sz w:val="20"/>
         </w:rPr>
-        <w:t>30. Efthimiou O, Mavridis D, Debray TPA, Samara M, Belger M, Salanti G, et al. Combining randomized and non-randomized evidence in network meta-analysis. Stat Med. 2017;36(8):1210-26.</w:t>
+        <w:t>30. Verde PE, Ohmann C. Combining randomized and non-randomized evidence in clinical research: a review of methods and applications. Res Synth Methods. 2015;6(1):45-62.</w:t>
+      </w:r>
+    </w:p>
+    <w:p>
+      <w:r>
+        <w:rPr>
+          <w:rFonts w:ascii="Times New Roman" w:hAnsi="Times New Roman"/>
+          <w:sz w:val="20"/>
+        </w:rPr>
+        <w:t>31. Efthimiou O, Mavridis D, Debray TPA, Samara M, Belger M, Salanti G, et al. Combining randomized and non-randomized evidence in network meta-analysis. Stat Med. 2017;36(8):1210-26.</w:t>
       </w:r>
     </w:p>
     <w:sectPr>

</xml_diff>

<commit_message>
seed emcee sampler with RandomState for reproducibility
- Set sampler.random_state to a seeded RandomState before run_mcmc.

- Removes dependence on the global numpy RNG state across processes.

Co-Authored-By: Tatsuki Onishi <bougtoir@gmail.com>
</commit_message>
<xml_diff>
--- a/rct-decomposition/KOTHA_Framework_CCTC.docx
+++ b/rct-decomposition/KOTHA_Framework_CCTC.docx
@@ -203,7 +203,7 @@
           <w:sz w:val="24"/>
           <w:szCs w:val="24"/>
         </w:rPr>
-        <w:t xml:space="preserve">= 62%. In the statins case, observational HR was 0.72 (0.64-0.80) versus RCT HR 0.97 (0.90-1.05), with an RCT-to-observational event rate ratio of 0.53. Bayesian integration with moderate discounting (α = 0.3) yielded OR 0.74 (95% CrI: 0.25-1.40), P(OR &lt; 1) = 81% for magnesium, and HR 0.85 (0.57-1.27), P(HR &lt; 1) = 86% for statins.</w:t>
+        <w:t xml:space="preserve">= 62%. In the statins case, observational HR was 0.72 (0.64-0.80) versus RCT HR 0.97 (0.90-1.05), with an RCT-to-observational event rate ratio of 0.53. Bayesian integration with moderate discounting (α = 0.3) yielded OR 0.74 (95% CrI: 0.25-1.43), P(OR &lt; 1) = 81% for magnesium, and HR 0.85 (0.55-1.24), P(HR &lt; 1) = 87% for statins.</w:t>
       </w:r>
     </w:p>
     <w:p xmlns:a="http://schemas.openxmlformats.org/drawingml/2006/main" xmlns:pic="http://schemas.openxmlformats.org/drawingml/2006/picture">
@@ -2669,7 +2669,7 @@
           <w:sz w:val="24"/>
           <w:szCs w:val="24"/>
         </w:rPr>
-        <w:t xml:space="preserve">. Convergence was assessed with split-R-hat and effective sample size (ESS) for the population mean log effect and the between-study heterogeneity. Across all discounting factors the minimum ESS was 929 and the maximum split-R-hat was 1.022, indicating satisfactory convergence. We report the full grid to show sensitivity and use</w:t>
+        <w:t xml:space="preserve">. Convergence was assessed with split-R-hat and effective sample size (ESS) for the population mean log effect and the between-study heterogeneity. Across all discounting factors the minimum ESS was 972 and the maximum split-R-hat was 1.024, indicating satisfactory convergence. We report the full grid to show sensitivity and use</w:t>
       </w:r>
       <w:r>
         <w:rPr>
@@ -6785,7 +6785,7 @@
           <w:sz w:val="24"/>
           <w:szCs w:val="24"/>
         </w:rPr>
-        <w:t xml:space="preserve">= 0 (ISIS-4 only), the posterior median OR was 1.05 with 40.9% probability of benefit. With</w:t>
+        <w:t xml:space="preserve">= 0 (ISIS-4 only), the posterior median OR was 1.05 with 42.8% probability of benefit. With</w:t>
       </w:r>
       <w:r>
         <w:rPr>
@@ -6814,7 +6814,7 @@
           <w:sz w:val="24"/>
           <w:szCs w:val="24"/>
         </w:rPr>
-        <w:t xml:space="preserve">= 0.3 the posterior shifted to OR = 0.74 (95% CrI: 0.25-1.40), with 81% probability of benefit (Fig. 7A). For statins (Table 6), with</w:t>
+        <w:t xml:space="preserve">= 0.3 the posterior shifted to OR = 0.74 (95% CrI: 0.25-1.43), with 81% probability of benefit (Fig. 7A). For statins (Table 6), with</w:t>
       </w:r>
       <w:r>
         <w:rPr>
@@ -6843,7 +6843,7 @@
           <w:sz w:val="24"/>
           <w:szCs w:val="24"/>
         </w:rPr>
-        <w:t xml:space="preserve">= 0 (RCTs only) the posterior probability of benefit was 61.9% and the probability of a clinically meaningful benefit (HR &lt; 0.90) was 21.8%. With</w:t>
+        <w:t xml:space="preserve">= 0 (RCTs only) the posterior probability of benefit was 62.9% and the probability of a clinically meaningful benefit (HR &lt; 0.90) was 21.2%. With</w:t>
       </w:r>
       <w:r>
         <w:rPr>
@@ -6872,7 +6872,7 @@
           <w:sz w:val="24"/>
           <w:szCs w:val="24"/>
         </w:rPr>
-        <w:t xml:space="preserve">= 0.3 these probabilities rose to 85.8% and 65.6%, respectively (Fig. 7B). Even with moderate borrowing from observational evidence, conclusions remained uncertain.</w:t>
+        <w:t xml:space="preserve">= 0.3 these probabilities rose to 86.5% and 66.0%, respectively (Fig. 7B). Even with moderate borrowing from observational evidence, conclusions remained uncertain.</w:t>
       </w:r>
     </w:p>
     <w:p>
@@ -7029,7 +7029,7 @@
                 <w:sz w:val="20"/>
                 <w:szCs w:val="20"/>
               </w:rPr>
-              <w:t xml:space="preserve">1.05 (0.05–38.33)</w:t>
+              <w:t xml:space="preserve">1.05 (0.03–27.97)</w:t>
             </w:r>
           </w:p>
         </w:tc>
@@ -7047,7 +7047,7 @@
                 <w:sz w:val="20"/>
                 <w:szCs w:val="20"/>
               </w:rPr>
-              <w:t xml:space="preserve">40.9%</w:t>
+              <w:t xml:space="preserve">42.8%</w:t>
             </w:r>
           </w:p>
         </w:tc>
@@ -7065,7 +7065,7 @@
                 <w:sz w:val="20"/>
                 <w:szCs w:val="20"/>
               </w:rPr>
-              <w:t xml:space="preserve">31.5%</w:t>
+              <w:t xml:space="preserve">33.4%</w:t>
             </w:r>
           </w:p>
         </w:tc>
@@ -7083,7 +7083,7 @@
                 <w:sz w:val="20"/>
                 <w:szCs w:val="20"/>
               </w:rPr>
-              <w:t xml:space="preserve">24.9%</w:t>
+              <w:t xml:space="preserve">27.0%</w:t>
             </w:r>
           </w:p>
         </w:tc>
@@ -7121,7 +7121,7 @@
                 <w:sz w:val="20"/>
                 <w:szCs w:val="20"/>
               </w:rPr>
-              <w:t xml:space="preserve">0.94 (0.16–3.56)</w:t>
+              <w:t xml:space="preserve">0.93 (0.15–2.92)</w:t>
             </w:r>
           </w:p>
         </w:tc>
@@ -7139,7 +7139,7 @@
                 <w:sz w:val="20"/>
                 <w:szCs w:val="20"/>
               </w:rPr>
-              <w:t xml:space="preserve">57.8%</w:t>
+              <w:t xml:space="preserve">58.3%</w:t>
             </w:r>
           </w:p>
         </w:tc>
@@ -7157,7 +7157,7 @@
                 <w:sz w:val="20"/>
                 <w:szCs w:val="20"/>
               </w:rPr>
-              <w:t xml:space="preserve">46.2%</w:t>
+              <w:t xml:space="preserve">46.3%</w:t>
             </w:r>
           </w:p>
         </w:tc>
@@ -7175,7 +7175,7 @@
                 <w:sz w:val="20"/>
                 <w:szCs w:val="20"/>
               </w:rPr>
-              <w:t xml:space="preserve">36.4%</w:t>
+              <w:t xml:space="preserve">36.2%</w:t>
             </w:r>
           </w:p>
         </w:tc>
@@ -7213,7 +7213,7 @@
                 <w:sz w:val="20"/>
                 <w:szCs w:val="20"/>
               </w:rPr>
-              <w:t xml:space="preserve">0.83 (0.22–1.82)</w:t>
+              <w:t xml:space="preserve">0.83 (0.22–1.75)</w:t>
             </w:r>
           </w:p>
         </w:tc>
@@ -7231,7 +7231,7 @@
                 <w:sz w:val="20"/>
                 <w:szCs w:val="20"/>
               </w:rPr>
-              <w:t xml:space="preserve">71.1%</w:t>
+              <w:t xml:space="preserve">71.4%</w:t>
             </w:r>
           </w:p>
         </w:tc>
@@ -7249,7 +7249,7 @@
                 <w:sz w:val="20"/>
                 <w:szCs w:val="20"/>
               </w:rPr>
-              <w:t xml:space="preserve">58.3%</w:t>
+              <w:t xml:space="preserve">58.9%</w:t>
             </w:r>
           </w:p>
         </w:tc>
@@ -7267,7 +7267,7 @@
                 <w:sz w:val="20"/>
                 <w:szCs w:val="20"/>
               </w:rPr>
-              <w:t xml:space="preserve">45.6%</w:t>
+              <w:t xml:space="preserve">46.9%</w:t>
             </w:r>
           </w:p>
         </w:tc>
@@ -7305,7 +7305,7 @@
                 <w:sz w:val="20"/>
                 <w:szCs w:val="20"/>
               </w:rPr>
-              <w:t xml:space="preserve">0.74 (0.25–1.40)</w:t>
+              <w:t xml:space="preserve">0.74 (0.25–1.43)</w:t>
             </w:r>
           </w:p>
         </w:tc>
@@ -7323,7 +7323,7 @@
                 <w:sz w:val="20"/>
                 <w:szCs w:val="20"/>
               </w:rPr>
-              <w:t xml:space="preserve">81.4%</w:t>
+              <w:t xml:space="preserve">80.7%</w:t>
             </w:r>
           </w:p>
         </w:tc>
@@ -7341,7 +7341,7 @@
                 <w:sz w:val="20"/>
                 <w:szCs w:val="20"/>
               </w:rPr>
-              <w:t xml:space="preserve">70.2%</w:t>
+              <w:t xml:space="preserve">69.6%</w:t>
             </w:r>
           </w:p>
         </w:tc>
@@ -7359,7 +7359,7 @@
                 <w:sz w:val="20"/>
                 <w:szCs w:val="20"/>
               </w:rPr>
-              <w:t xml:space="preserve">57.7%</w:t>
+              <w:t xml:space="preserve">57.4%</w:t>
             </w:r>
           </w:p>
         </w:tc>
@@ -7397,7 +7397,7 @@
                 <w:sz w:val="20"/>
                 <w:szCs w:val="20"/>
               </w:rPr>
-              <w:t xml:space="preserve">0.65 (0.28–1.10)</w:t>
+              <w:t xml:space="preserve">0.63 (0.28–1.10)</w:t>
             </w:r>
           </w:p>
         </w:tc>
@@ -7415,7 +7415,7 @@
                 <w:sz w:val="20"/>
                 <w:szCs w:val="20"/>
               </w:rPr>
-              <w:t xml:space="preserve">93.8%</w:t>
+              <w:t xml:space="preserve">94.0%</w:t>
             </w:r>
           </w:p>
         </w:tc>
@@ -7433,7 +7433,7 @@
                 <w:sz w:val="20"/>
                 <w:szCs w:val="20"/>
               </w:rPr>
-              <w:t xml:space="preserve">86.5%</w:t>
+              <w:t xml:space="preserve">87.2%</w:t>
             </w:r>
           </w:p>
         </w:tc>
@@ -7451,7 +7451,7 @@
                 <w:sz w:val="20"/>
                 <w:szCs w:val="20"/>
               </w:rPr>
-              <w:t xml:space="preserve">75.1%</w:t>
+              <w:t xml:space="preserve">76.3%</w:t>
             </w:r>
           </w:p>
         </w:tc>
@@ -7489,7 +7489,7 @@
                 <w:sz w:val="20"/>
                 <w:szCs w:val="20"/>
               </w:rPr>
-              <w:t xml:space="preserve">0.59 (0.29–0.96)</w:t>
+              <w:t xml:space="preserve">0.59 (0.29–0.98)</w:t>
             </w:r>
           </w:p>
         </w:tc>
@@ -7507,7 +7507,7 @@
                 <w:sz w:val="20"/>
                 <w:szCs w:val="20"/>
               </w:rPr>
-              <w:t xml:space="preserve">98.3%</w:t>
+              <w:t xml:space="preserve">98.1%</w:t>
             </w:r>
           </w:p>
         </w:tc>
@@ -7525,7 +7525,7 @@
                 <w:sz w:val="20"/>
                 <w:szCs w:val="20"/>
               </w:rPr>
-              <w:t xml:space="preserve">94.9%</w:t>
+              <w:t xml:space="preserve">94.8%</w:t>
             </w:r>
           </w:p>
         </w:tc>
@@ -7543,7 +7543,7 @@
                 <w:sz w:val="20"/>
                 <w:szCs w:val="20"/>
               </w:rPr>
-              <w:t xml:space="preserve">87.2%</w:t>
+              <w:t xml:space="preserve">87.1%</w:t>
             </w:r>
           </w:p>
         </w:tc>
@@ -7581,7 +7581,7 @@
                 <w:sz w:val="20"/>
                 <w:szCs w:val="20"/>
               </w:rPr>
-              <w:t xml:space="preserve">0.55 (0.30–0.85)</w:t>
+              <w:t xml:space="preserve">0.55 (0.32–0.87)</w:t>
             </w:r>
           </w:p>
         </w:tc>
@@ -7599,7 +7599,7 @@
                 <w:sz w:val="20"/>
                 <w:szCs w:val="20"/>
               </w:rPr>
-              <w:t xml:space="preserve">99.7%</w:t>
+              <w:t xml:space="preserve">99.6%</w:t>
             </w:r>
           </w:p>
         </w:tc>
@@ -7617,7 +7617,7 @@
                 <w:sz w:val="20"/>
                 <w:szCs w:val="20"/>
               </w:rPr>
-              <w:t xml:space="preserve">98.6%</w:t>
+              <w:t xml:space="preserve">98.4%</w:t>
             </w:r>
           </w:p>
         </w:tc>
@@ -7635,7 +7635,7 @@
                 <w:sz w:val="20"/>
                 <w:szCs w:val="20"/>
               </w:rPr>
-              <w:t xml:space="preserve">95.0%</w:t>
+              <w:t xml:space="preserve">94.4%</w:t>
             </w:r>
           </w:p>
         </w:tc>
@@ -7795,7 +7795,7 @@
                 <w:sz w:val="20"/>
                 <w:szCs w:val="20"/>
               </w:rPr>
-              <w:t xml:space="preserve">0.97 (0.54–1.67)</w:t>
+              <w:t xml:space="preserve">0.97 (0.58–1.65)</w:t>
             </w:r>
           </w:p>
         </w:tc>
@@ -7813,7 +7813,7 @@
                 <w:sz w:val="20"/>
                 <w:szCs w:val="20"/>
               </w:rPr>
-              <w:t xml:space="preserve">61.9%</w:t>
+              <w:t xml:space="preserve">62.9%</w:t>
             </w:r>
           </w:p>
         </w:tc>
@@ -7831,7 +7831,7 @@
                 <w:sz w:val="20"/>
                 <w:szCs w:val="20"/>
               </w:rPr>
-              <w:t xml:space="preserve">21.8%</w:t>
+              <w:t xml:space="preserve">21.2%</w:t>
             </w:r>
           </w:p>
         </w:tc>
@@ -7849,7 +7849,7 @@
                 <w:sz w:val="20"/>
                 <w:szCs w:val="20"/>
               </w:rPr>
-              <w:t xml:space="preserve">10.0%</w:t>
+              <w:t xml:space="preserve">8.9%</w:t>
             </w:r>
           </w:p>
         </w:tc>
@@ -7887,7 +7887,7 @@
                 <w:sz w:val="20"/>
                 <w:szCs w:val="20"/>
               </w:rPr>
-              <w:t xml:space="preserve">0.92 (0.46–1.65)</w:t>
+              <w:t xml:space="preserve">0.92 (0.53–1.64)</w:t>
             </w:r>
           </w:p>
         </w:tc>
@@ -7905,7 +7905,7 @@
                 <w:sz w:val="20"/>
                 <w:szCs w:val="20"/>
               </w:rPr>
-              <w:t xml:space="preserve">72.5%</w:t>
+              <w:t xml:space="preserve">71.9%</w:t>
             </w:r>
           </w:p>
         </w:tc>
@@ -7923,7 +7923,7 @@
                 <w:sz w:val="20"/>
                 <w:szCs w:val="20"/>
               </w:rPr>
-              <w:t xml:space="preserve">44.3%</w:t>
+              <w:t xml:space="preserve">42.7%</w:t>
             </w:r>
           </w:p>
         </w:tc>
@@ -7941,7 +7941,7 @@
                 <w:sz w:val="20"/>
                 <w:szCs w:val="20"/>
               </w:rPr>
-              <w:t xml:space="preserve">20.2%</w:t>
+              <w:t xml:space="preserve">19.2%</w:t>
             </w:r>
           </w:p>
         </w:tc>
@@ -7979,7 +7979,7 @@
                 <w:sz w:val="20"/>
                 <w:szCs w:val="20"/>
               </w:rPr>
-              <w:t xml:space="preserve">0.88 (0.53–1.37)</w:t>
+              <w:t xml:space="preserve">0.89 (0.53–1.41)</w:t>
             </w:r>
           </w:p>
         </w:tc>
@@ -7997,7 +7997,7 @@
                 <w:sz w:val="20"/>
                 <w:szCs w:val="20"/>
               </w:rPr>
-              <w:t xml:space="preserve">81.5%</w:t>
+              <w:t xml:space="preserve">79.8%</w:t>
             </w:r>
           </w:p>
         </w:tc>
@@ -8015,7 +8015,7 @@
                 <w:sz w:val="20"/>
                 <w:szCs w:val="20"/>
               </w:rPr>
-              <w:t xml:space="preserve">57.7%</w:t>
+              <w:t xml:space="preserve">54.7%</w:t>
             </w:r>
           </w:p>
         </w:tc>
@@ -8033,7 +8033,7 @@
                 <w:sz w:val="20"/>
                 <w:szCs w:val="20"/>
               </w:rPr>
-              <w:t xml:space="preserve">26.9%</w:t>
+              <w:t xml:space="preserve">24.4%</w:t>
             </w:r>
           </w:p>
         </w:tc>
@@ -8071,7 +8071,7 @@
                 <w:sz w:val="20"/>
                 <w:szCs w:val="20"/>
               </w:rPr>
-              <w:t xml:space="preserve">0.85 (0.57–1.27)</w:t>
+              <w:t xml:space="preserve">0.85 (0.55–1.24)</w:t>
             </w:r>
           </w:p>
         </w:tc>
@@ -8089,7 +8089,7 @@
                 <w:sz w:val="20"/>
                 <w:szCs w:val="20"/>
               </w:rPr>
-              <w:t xml:space="preserve">85.8%</w:t>
+              <w:t xml:space="preserve">86.5%</w:t>
             </w:r>
           </w:p>
         </w:tc>
@@ -8107,7 +8107,7 @@
                 <w:sz w:val="20"/>
                 <w:szCs w:val="20"/>
               </w:rPr>
-              <w:t xml:space="preserve">65.6%</w:t>
+              <w:t xml:space="preserve">66.0%</w:t>
             </w:r>
           </w:p>
         </w:tc>
@@ -8125,7 +8125,7 @@
                 <w:sz w:val="20"/>
                 <w:szCs w:val="20"/>
               </w:rPr>
-              <w:t xml:space="preserve">30.5%</w:t>
+              <w:t xml:space="preserve">31.1%</w:t>
             </w:r>
           </w:p>
         </w:tc>
@@ -8163,7 +8163,7 @@
                 <w:sz w:val="20"/>
                 <w:szCs w:val="20"/>
               </w:rPr>
-              <w:t xml:space="preserve">0.82 (0.60–1.10)</w:t>
+              <w:t xml:space="preserve">0.82 (0.59–1.10)</w:t>
             </w:r>
           </w:p>
         </w:tc>
@@ -8181,7 +8181,7 @@
                 <w:sz w:val="20"/>
                 <w:szCs w:val="20"/>
               </w:rPr>
-              <w:t xml:space="preserve">93.6%</w:t>
+              <w:t xml:space="preserve">93.9%</w:t>
             </w:r>
           </w:p>
         </w:tc>
@@ -8199,7 +8199,7 @@
                 <w:sz w:val="20"/>
                 <w:szCs w:val="20"/>
               </w:rPr>
-              <w:t xml:space="preserve">78.9%</w:t>
+              <w:t xml:space="preserve">79.6%</w:t>
             </w:r>
           </w:p>
         </w:tc>
@@ -8217,7 +8217,7 @@
                 <w:sz w:val="20"/>
                 <w:szCs w:val="20"/>
               </w:rPr>
-              <w:t xml:space="preserve">39.9%</w:t>
+              <w:t xml:space="preserve">41.9%</w:t>
             </w:r>
           </w:p>
         </w:tc>
@@ -8255,7 +8255,7 @@
                 <w:sz w:val="20"/>
                 <w:szCs w:val="20"/>
               </w:rPr>
-              <w:t xml:space="preserve">0.80 (0.62–0.99)</w:t>
+              <w:t xml:space="preserve">0.80 (0.62–1.00)</w:t>
             </w:r>
           </w:p>
         </w:tc>
@@ -8273,7 +8273,7 @@
                 <w:sz w:val="20"/>
                 <w:szCs w:val="20"/>
               </w:rPr>
-              <w:t xml:space="preserve">97.7%</w:t>
+              <w:t xml:space="preserve">97.3%</w:t>
             </w:r>
           </w:p>
         </w:tc>
@@ -8291,7 +8291,7 @@
                 <w:sz w:val="20"/>
                 <w:szCs w:val="20"/>
               </w:rPr>
-              <w:t xml:space="preserve">89.3%</w:t>
+              <w:t xml:space="preserve">88.3%</w:t>
             </w:r>
           </w:p>
         </w:tc>
@@ -8309,7 +8309,7 @@
                 <w:sz w:val="20"/>
                 <w:szCs w:val="20"/>
               </w:rPr>
-              <w:t xml:space="preserve">51.4%</w:t>
+              <w:t xml:space="preserve">49.7%</w:t>
             </w:r>
           </w:p>
         </w:tc>
@@ -8347,7 +8347,7 @@
                 <w:sz w:val="20"/>
                 <w:szCs w:val="20"/>
               </w:rPr>
-              <w:t xml:space="preserve">0.78 (0.64–0.94)</w:t>
+              <w:t xml:space="preserve">0.78 (0.64–0.93)</w:t>
             </w:r>
           </w:p>
         </w:tc>
@@ -8383,7 +8383,7 @@
                 <w:sz w:val="20"/>
                 <w:szCs w:val="20"/>
               </w:rPr>
-              <w:t xml:space="preserve">94.6%</w:t>
+              <w:t xml:space="preserve">95.7%</w:t>
             </w:r>
           </w:p>
         </w:tc>
@@ -8401,7 +8401,7 @@
                 <w:sz w:val="20"/>
                 <w:szCs w:val="20"/>
               </w:rPr>
-              <w:t xml:space="preserve">61.7%</w:t>
+              <w:t xml:space="preserve">63.3%</w:t>
             </w:r>
           </w:p>
         </w:tc>

</xml_diff>

<commit_message>
refactor(cctc): reviewer-perspective consistency and MCMC trace diagnostics
Co-Authored-By: Tatsuki Onishi <bougtoir@gmail.com>
</commit_message>
<xml_diff>
--- a/rct-decomposition/KOTHA_Framework_CCTC.docx
+++ b/rct-decomposition/KOTHA_Framework_CCTC.docx
@@ -52,7 +52,7 @@
           <w:i w:val="0"/>
           <w:sz w:val="24"/>
         </w:rPr>
-        <w:t>Word count: 2299</w:t>
+        <w:t>Word count: 2361</w:t>
       </w:r>
     </w:p>
     <w:p>
@@ -339,7 +339,7 @@
           <w:sz w:val="24"/>
           <w:szCs w:val="24"/>
         </w:rPr>
-        <w:t xml:space="preserve">: randomized controlled trials, meta-analysis, observational studies, trial design, counterfactual simulation, Bayesian evidence synthesis, power analysis, GRADE, magnesium, statins, heart failure</w:t>
+        <w:t xml:space="preserve">: randomized controlled trials, meta-analysis, observational studies, trial design, Bayesian evidence synthesis, GRADE</w:t>
       </w:r>
     </w:p>
     <w:p>
@@ -1566,7 +1566,7 @@
           <w:sz w:val="24"/>
           <w:szCs w:val="24"/>
         </w:rPr>
-        <w:t xml:space="preserve">The KOTHA Framework comprises three interconnected modules (Fig. 1). Module K (Counterfactual Power Simulation) quantifies how enrollment-driven risk-profile shifts reduce statistical power. Module T (Trial-Observational Bayesian Integration) combines RCT and observational evidence with explicit discounting for design-related bias. Module H (Hermeneutic Guideline Interpreter) translates module outputs into a structured GRADE assessment. Each module can be used independently, but the framework is most informative when applied in sequence.</w:t>
+        <w:t xml:space="preserve">The KOTHA Framework comprises three interconnected modules (Fig. 1). Module K (Counterfactual Power Simulation) quantifies how enrollment-driven risk-profile shifts reduce statistical power. Module T (Trial-Observational Bayesian Integration) combines RCT and observational evidence with explicit discounting for design-related bias. Module H (Guideline Interpreter) translates module outputs into a structured GRADE assessment. Each module can be used independently, but the framework is most informative when applied in sequence.</w:t>
       </w:r>
     </w:p>
     <w:p>
@@ -2669,7 +2669,7 @@
           <w:sz w:val="24"/>
           <w:szCs w:val="24"/>
         </w:rPr>
-        <w:t xml:space="preserve">. Convergence was assessed with split-R-hat and effective sample size (ESS) for the population mean log effect and the between-study heterogeneity. Across all discounting factors the minimum ESS was 972 and the maximum split-R-hat was 1.024, indicating satisfactory convergence. We report the full grid to show sensitivity and use</w:t>
+        <w:t xml:space="preserve">. Convergence was assessed with split-R-hat and effective sample size (ESS) for the population mean log effect and the between-study heterogeneity, using accepted thresholds (split-R-hat &lt; 1.05; ESS per parameter &gt; 400). Trace plots for selected chains are provided as Supplementary Figure S1 and showed no obvious non-stationarity. Across all discounting factors the minimum ESS was 972 and the maximum split-R-hat was 1.024, both satisfying the convergence criteria. We report the full grid to show sensitivity and use</w:t>
       </w:r>
       <w:r>
         <w:rPr>
@@ -9539,7 +9539,7 @@
       <w:r>
         <w:drawing>
           <wp:inline xmlns:a="http://schemas.openxmlformats.org/drawingml/2006/main" xmlns:pic="http://schemas.openxmlformats.org/drawingml/2006/picture">
-            <wp:extent cx="5029200" cy="2715861"/>
+            <wp:extent cx="5029200" cy="2418945"/>
             <wp:docPr id="8" name="Picture 8"/>
             <wp:cNvGraphicFramePr>
               <a:graphicFrameLocks noChangeAspect="1"/>
@@ -9560,7 +9560,7 @@
                   <pic:spPr>
                     <a:xfrm>
                       <a:off x="0" y="0"/>
-                      <a:ext cx="5029200" cy="2715861"/>
+                      <a:ext cx="5029200" cy="2418945"/>
                     </a:xfrm>
                     <a:prstGeom prst="rect"/>
                   </pic:spPr>
@@ -9980,7 +9980,7 @@
           <w:sz w:val="24"/>
           <w:szCs w:val="24"/>
         </w:rPr>
-        <w:t xml:space="preserve">Limitations should be acknowledged. The cases are retrospective applications; prospective validation against trials whose results are not yet known would be stronger. Module T results are sensitive to the discounting parameter</w:t>
+        <w:t xml:space="preserve">Limitations should be acknowledged. The cases are retrospective applications of the framework to published aggregate data; individual patient data would strengthen risk-profile stratification and adjustment for confounders, and ecological bias may affect the representativeness assessment. Prospective validation against trials whose results are not yet known would be stronger. Module T treats the discounting parameter</w:t>
       </w:r>
       <w:r>
         <w:rPr>
@@ -10009,7 +10009,7 @@
           <w:sz w:val="24"/>
           <w:szCs w:val="24"/>
         </w:rPr>
-        <w:t xml:space="preserve">and to assumptions about residual confounding; we present sensitivity analyses but do not claim a single preferred</w:t>
+        <w:t xml:space="preserve">as a fixed sensitivity parameter and is therefore sensitive to assumptions about residual confounding; we present the full grid of values but do not claim a single preferred</w:t>
       </w:r>
       <w:r>
         <w:rPr>

</xml_diff>

<commit_message>
chore(cctc): add Highlights, Trial registration, and Funding source declarations per typical Elsevier/CCTC layout
- Insert Highlights section with 4 bullets (<85 chars each)
- Add Trial registration and rename declaration headings to match common CCTC articles
- Regenerate docx, figures/tables, and submission package

Co-Authored-By: Tatsuki Onishi <bougtoir@gmail.com>
</commit_message>
<xml_diff>
--- a/rct-decomposition/KOTHA_Framework_CCTC.docx
+++ b/rct-decomposition/KOTHA_Framework_CCTC.docx
@@ -80,6 +80,92 @@
     <w:p>
       <w:r>
         <w:br w:type="page"/>
+      </w:r>
+    </w:p>
+    <w:p>
+      <w:pPr>
+        <w:pStyle w:val="Heading2"/>
+      </w:pPr>
+      <w:r>
+        <w:rPr>
+          <w:rFonts w:ascii="Times New Roman" w:hAnsi="Times New Roman"/>
+          <w:b/>
+          <w:color w:val="000000"/>
+          <w:sz w:val="24"/>
+        </w:rPr>
+        <w:t>Highlights</w:t>
+      </w:r>
+    </w:p>
+    <w:p xmlns:a="http://schemas.openxmlformats.org/drawingml/2006/main" xmlns:pic="http://schemas.openxmlformats.org/drawingml/2006/picture">
+      <w:pPr>
+        <w:numPr>
+          <w:ilvl w:val="0"/>
+          <w:numId w:val="1001"/>
+        </w:numPr>
+        <w:pStyle w:val="Normal"/>
+        <w:spacing w:line="480" w:lineRule="auto" w:after="120"/>
+      </w:pPr>
+      <w:r>
+        <w:rPr>
+          <w:rFonts w:ascii="Times New Roman" w:hAnsi="Times New Roman" w:cs="Times New Roman" w:eastAsia="Times New Roman"/>
+          <w:sz w:val="24"/>
+          <w:szCs w:val="24"/>
+        </w:rPr>
+        <w:t xml:space="preserve">KOTHA separates structural information loss from residual confounding in trial evidence.</w:t>
+      </w:r>
+    </w:p>
+    <w:p xmlns:a="http://schemas.openxmlformats.org/drawingml/2006/main" xmlns:pic="http://schemas.openxmlformats.org/drawingml/2006/picture">
+      <w:pPr>
+        <w:numPr>
+          <w:ilvl w:val="0"/>
+          <w:numId w:val="1001"/>
+        </w:numPr>
+        <w:pStyle w:val="Normal"/>
+        <w:spacing w:line="480" w:lineRule="auto" w:after="120"/>
+      </w:pPr>
+      <w:r>
+        <w:rPr>
+          <w:rFonts w:ascii="Times New Roman" w:hAnsi="Times New Roman" w:cs="Times New Roman" w:eastAsia="Times New Roman"/>
+          <w:sz w:val="24"/>
+          <w:szCs w:val="24"/>
+        </w:rPr>
+        <w:t xml:space="preserve">Counterfactual power simulation quantifies enrollment-driven event dilution.</w:t>
+      </w:r>
+    </w:p>
+    <w:p xmlns:a="http://schemas.openxmlformats.org/drawingml/2006/main" xmlns:pic="http://schemas.openxmlformats.org/drawingml/2006/picture">
+      <w:pPr>
+        <w:numPr>
+          <w:ilvl w:val="0"/>
+          <w:numId w:val="1001"/>
+        </w:numPr>
+        <w:pStyle w:val="Normal"/>
+        <w:spacing w:line="480" w:lineRule="auto" w:after="120"/>
+      </w:pPr>
+      <w:r>
+        <w:rPr>
+          <w:rFonts w:ascii="Times New Roman" w:hAnsi="Times New Roman" w:cs="Times New Roman" w:eastAsia="Times New Roman"/>
+          <w:sz w:val="24"/>
+          <w:szCs w:val="24"/>
+        </w:rPr>
+        <w:t xml:space="preserve">Power-prior Bayesian synthesis transparently discounts observational evidence.</w:t>
+      </w:r>
+    </w:p>
+    <w:p xmlns:a="http://schemas.openxmlformats.org/drawingml/2006/main" xmlns:pic="http://schemas.openxmlformats.org/drawingml/2006/picture">
+      <w:pPr>
+        <w:numPr>
+          <w:ilvl w:val="0"/>
+          <w:numId w:val="1001"/>
+        </w:numPr>
+        <w:pStyle w:val="Normal"/>
+        <w:spacing w:line="480" w:lineRule="auto" w:after="120"/>
+      </w:pPr>
+      <w:r>
+        <w:rPr>
+          <w:rFonts w:ascii="Times New Roman" w:hAnsi="Times New Roman" w:cs="Times New Roman" w:eastAsia="Times New Roman"/>
+          <w:sz w:val="24"/>
+          <w:szCs w:val="24"/>
+        </w:rPr>
+        <w:t xml:space="preserve">GRADE-compatible output labels evidence as sufficient or insufficient.</w:t>
       </w:r>
     </w:p>
     <w:p>
@@ -10170,7 +10256,35 @@
           <w:color w:val="000000"/>
           <w:sz w:val="24"/>
         </w:rPr>
-        <w:t>Competing interests</w:t>
+        <w:t>Trial registration</w:t>
+      </w:r>
+    </w:p>
+    <w:p xmlns:a="http://schemas.openxmlformats.org/drawingml/2006/main" xmlns:pic="http://schemas.openxmlformats.org/drawingml/2006/picture">
+      <w:pPr>
+        <w:pStyle w:val="Normal"/>
+        <w:spacing w:line="480" w:lineRule="auto" w:after="120"/>
+      </w:pPr>
+      <w:r>
+        <w:rPr>
+          <w:rFonts w:ascii="Times New Roman" w:hAnsi="Times New Roman" w:cs="Times New Roman" w:eastAsia="Times New Roman"/>
+          <w:sz w:val="24"/>
+          <w:szCs w:val="24"/>
+        </w:rPr>
+        <w:t xml:space="preserve">Not applicable. This manuscript presents a methodological framework and retrospective case illustrations; no prospective clinical trial was conducted.</w:t>
+      </w:r>
+    </w:p>
+    <w:p>
+      <w:pPr>
+        <w:pStyle w:val="Heading3"/>
+      </w:pPr>
+      <w:r>
+        <w:rPr>
+          <w:rFonts w:ascii="Times New Roman" w:hAnsi="Times New Roman"/>
+          <w:b/>
+          <w:color w:val="000000"/>
+          <w:sz w:val="24"/>
+        </w:rPr>
+        <w:t>Declaration of competing interest</w:t>
       </w:r>
     </w:p>
     <w:p xmlns:a="http://schemas.openxmlformats.org/drawingml/2006/main" xmlns:pic="http://schemas.openxmlformats.org/drawingml/2006/picture">
@@ -10198,7 +10312,7 @@
           <w:color w:val="000000"/>
           <w:sz w:val="24"/>
         </w:rPr>
-        <w:t>Funding</w:t>
+        <w:t>Funding source</w:t>
       </w:r>
     </w:p>
     <w:p xmlns:a="http://schemas.openxmlformats.org/drawingml/2006/main" xmlns:pic="http://schemas.openxmlformats.org/drawingml/2006/picture">

</xml_diff>

<commit_message>
chore(cctc): align submission package with CCTC Guide for Authors
- Add page numbers, title page affiliation/corresponding-address placeholders
- Generate separate editable Highlights docx with 'highlights' in filename
- Number main sections 1-5 per guide
- Increase figure DPI to 500 for line/halftone artwork
- Provide separate Figure_1..Figure_8 and Supplementary_Figure_S1 PNG files with captions
- Update submission zip layout (manuscript/figures/tables/supplementary/code+data)

Co-Authored-By: Tatsuki Onishi <bougtoir@gmail.com>
</commit_message>
<xml_diff>
--- a/rct-decomposition/KOTHA_Framework_CCTC.docx
+++ b/rct-decomposition/KOTHA_Framework_CCTC.docx
@@ -45,14 +45,17 @@
       </w:r>
     </w:p>
     <w:p>
+      <w:pPr>
+        <w:jc w:val="center"/>
+      </w:pPr>
       <w:r>
         <w:rPr>
           <w:rFonts w:ascii="Times New Roman" w:hAnsi="Times New Roman"/>
           <w:b w:val="0"/>
-          <w:i w:val="0"/>
+          <w:i/>
           <w:sz w:val="24"/>
         </w:rPr>
-        <w:t>Word count: 2361</w:t>
+        <w:t>Affiliations: [To be determined]</w:t>
       </w:r>
     </w:p>
     <w:p>
@@ -64,6 +67,28 @@
           <w:sz w:val="24"/>
         </w:rPr>
         <w:t>Corresponding author: [To be determined]</w:t>
+      </w:r>
+    </w:p>
+    <w:p>
+      <w:r>
+        <w:rPr>
+          <w:rFonts w:ascii="Times New Roman" w:hAnsi="Times New Roman"/>
+          <w:b w:val="0"/>
+          <w:i w:val="0"/>
+          <w:sz w:val="24"/>
+        </w:rPr>
+        <w:t>Corresponding author address: [To be determined]</w:t>
+      </w:r>
+    </w:p>
+    <w:p>
+      <w:r>
+        <w:rPr>
+          <w:rFonts w:ascii="Times New Roman" w:hAnsi="Times New Roman"/>
+          <w:b w:val="0"/>
+          <w:i w:val="0"/>
+          <w:sz w:val="24"/>
+        </w:rPr>
+        <w:t>Word count: 2365</w:t>
       </w:r>
     </w:p>
     <w:p>
@@ -98,11 +123,7 @@
     </w:p>
     <w:p xmlns:a="http://schemas.openxmlformats.org/drawingml/2006/main" xmlns:pic="http://schemas.openxmlformats.org/drawingml/2006/picture">
       <w:pPr>
-        <w:numPr>
-          <w:ilvl w:val="0"/>
-          <w:numId w:val="1001"/>
-        </w:numPr>
-        <w:pStyle w:val="Normal"/>
+        <w:pStyle w:val="List Bullet"/>
         <w:spacing w:line="480" w:lineRule="auto" w:after="120"/>
       </w:pPr>
       <w:r>
@@ -116,11 +137,7 @@
     </w:p>
     <w:p xmlns:a="http://schemas.openxmlformats.org/drawingml/2006/main" xmlns:pic="http://schemas.openxmlformats.org/drawingml/2006/picture">
       <w:pPr>
-        <w:numPr>
-          <w:ilvl w:val="0"/>
-          <w:numId w:val="1001"/>
-        </w:numPr>
-        <w:pStyle w:val="Normal"/>
+        <w:pStyle w:val="List Bullet"/>
         <w:spacing w:line="480" w:lineRule="auto" w:after="120"/>
       </w:pPr>
       <w:r>
@@ -134,11 +151,7 @@
     </w:p>
     <w:p xmlns:a="http://schemas.openxmlformats.org/drawingml/2006/main" xmlns:pic="http://schemas.openxmlformats.org/drawingml/2006/picture">
       <w:pPr>
-        <w:numPr>
-          <w:ilvl w:val="0"/>
-          <w:numId w:val="1001"/>
-        </w:numPr>
-        <w:pStyle w:val="Normal"/>
+        <w:pStyle w:val="List Bullet"/>
         <w:spacing w:line="480" w:lineRule="auto" w:after="120"/>
       </w:pPr>
       <w:r>
@@ -152,11 +165,7 @@
     </w:p>
     <w:p xmlns:a="http://schemas.openxmlformats.org/drawingml/2006/main" xmlns:pic="http://schemas.openxmlformats.org/drawingml/2006/picture">
       <w:pPr>
-        <w:numPr>
-          <w:ilvl w:val="0"/>
-          <w:numId w:val="1001"/>
-        </w:numPr>
-        <w:pStyle w:val="Normal"/>
+        <w:pStyle w:val="List Bullet"/>
         <w:spacing w:line="480" w:lineRule="auto" w:after="120"/>
       </w:pPr>
       <w:r>
@@ -1003,7 +1012,7 @@
           <w:color w:val="000000"/>
           <w:sz w:val="24"/>
         </w:rPr>
-        <w:t>Introduction</w:t>
+        <w:t>1. Introduction</w:t>
       </w:r>
     </w:p>
     <w:p xmlns:a="http://schemas.openxmlformats.org/drawingml/2006/main" xmlns:pic="http://schemas.openxmlformats.org/drawingml/2006/picture">
@@ -1624,7 +1633,7 @@
           <w:color w:val="000000"/>
           <w:sz w:val="24"/>
         </w:rPr>
-        <w:t>Methods</w:t>
+        <w:t>2. Methods</w:t>
       </w:r>
     </w:p>
     <w:p>
@@ -2962,7 +2971,7 @@
       <w:r>
         <w:drawing>
           <wp:inline xmlns:a="http://schemas.openxmlformats.org/drawingml/2006/main" xmlns:pic="http://schemas.openxmlformats.org/drawingml/2006/picture">
-            <wp:extent cx="5029200" cy="3536255"/>
+            <wp:extent cx="5029200" cy="3537145"/>
             <wp:docPr id="1" name="Picture 1"/>
             <wp:cNvGraphicFramePr>
               <a:graphicFrameLocks noChangeAspect="1"/>
@@ -2975,7 +2984,7 @@
                     <pic:cNvPicPr/>
                   </pic:nvPicPr>
                   <pic:blipFill>
-                    <a:blip r:embed="rId9"/>
+                    <a:blip r:embed="rId10"/>
                     <a:stretch>
                       <a:fillRect/>
                     </a:stretch>
@@ -2983,7 +2992,7 @@
                   <pic:spPr>
                     <a:xfrm>
                       <a:off x="0" y="0"/>
-                      <a:ext cx="5029200" cy="3536255"/>
+                      <a:ext cx="5029200" cy="3537145"/>
                     </a:xfrm>
                     <a:prstGeom prst="rect"/>
                   </pic:spPr>
@@ -3502,7 +3511,7 @@
           <w:color w:val="000000"/>
           <w:sz w:val="24"/>
         </w:rPr>
-        <w:t>Results</w:t>
+        <w:t>3. Results</w:t>
       </w:r>
     </w:p>
     <w:p>
@@ -6249,7 +6258,7 @@
       <w:r>
         <w:drawing>
           <wp:inline xmlns:a="http://schemas.openxmlformats.org/drawingml/2006/main" xmlns:pic="http://schemas.openxmlformats.org/drawingml/2006/picture">
-            <wp:extent cx="5029200" cy="2063370"/>
+            <wp:extent cx="5029200" cy="2061675"/>
             <wp:docPr id="2" name="Picture 2"/>
             <wp:cNvGraphicFramePr>
               <a:graphicFrameLocks noChangeAspect="1"/>
@@ -6262,7 +6271,7 @@
                     <pic:cNvPicPr/>
                   </pic:nvPicPr>
                   <pic:blipFill>
-                    <a:blip r:embed="rId10"/>
+                    <a:blip r:embed="rId11"/>
                     <a:stretch>
                       <a:fillRect/>
                     </a:stretch>
@@ -6270,7 +6279,7 @@
                   <pic:spPr>
                     <a:xfrm>
                       <a:off x="0" y="0"/>
-                      <a:ext cx="5029200" cy="2063370"/>
+                      <a:ext cx="5029200" cy="2061675"/>
                     </a:xfrm>
                     <a:prstGeom prst="rect"/>
                   </pic:spPr>
@@ -6336,7 +6345,7 @@
       <w:r>
         <w:drawing>
           <wp:inline xmlns:a="http://schemas.openxmlformats.org/drawingml/2006/main" xmlns:pic="http://schemas.openxmlformats.org/drawingml/2006/picture">
-            <wp:extent cx="5029200" cy="2097128"/>
+            <wp:extent cx="5029200" cy="2096542"/>
             <wp:docPr id="3" name="Picture 3"/>
             <wp:cNvGraphicFramePr>
               <a:graphicFrameLocks noChangeAspect="1"/>
@@ -6349,7 +6358,7 @@
                     <pic:cNvPicPr/>
                   </pic:nvPicPr>
                   <pic:blipFill>
-                    <a:blip r:embed="rId11"/>
+                    <a:blip r:embed="rId12"/>
                     <a:stretch>
                       <a:fillRect/>
                     </a:stretch>
@@ -6357,7 +6366,7 @@
                   <pic:spPr>
                     <a:xfrm>
                       <a:off x="0" y="0"/>
-                      <a:ext cx="5029200" cy="2097128"/>
+                      <a:ext cx="5029200" cy="2096542"/>
                     </a:xfrm>
                     <a:prstGeom prst="rect"/>
                   </pic:spPr>
@@ -6557,7 +6566,7 @@
       <w:r>
         <w:drawing>
           <wp:inline xmlns:a="http://schemas.openxmlformats.org/drawingml/2006/main" xmlns:pic="http://schemas.openxmlformats.org/drawingml/2006/picture">
-            <wp:extent cx="5029200" cy="5289798"/>
+            <wp:extent cx="5029200" cy="5290260"/>
             <wp:docPr id="4" name="Picture 4"/>
             <wp:cNvGraphicFramePr>
               <a:graphicFrameLocks noChangeAspect="1"/>
@@ -6570,7 +6579,7 @@
                     <pic:cNvPicPr/>
                   </pic:nvPicPr>
                   <pic:blipFill>
-                    <a:blip r:embed="rId12"/>
+                    <a:blip r:embed="rId13"/>
                     <a:stretch>
                       <a:fillRect/>
                     </a:stretch>
@@ -6578,7 +6587,7 @@
                   <pic:spPr>
                     <a:xfrm>
                       <a:off x="0" y="0"/>
-                      <a:ext cx="5029200" cy="5289798"/>
+                      <a:ext cx="5029200" cy="5290260"/>
                     </a:xfrm>
                     <a:prstGeom prst="rect"/>
                   </pic:spPr>
@@ -6616,7 +6625,7 @@
       <w:r>
         <w:drawing>
           <wp:inline xmlns:a="http://schemas.openxmlformats.org/drawingml/2006/main" xmlns:pic="http://schemas.openxmlformats.org/drawingml/2006/picture">
-            <wp:extent cx="5029200" cy="3008295"/>
+            <wp:extent cx="5029200" cy="3005429"/>
             <wp:docPr id="5" name="Picture 5"/>
             <wp:cNvGraphicFramePr>
               <a:graphicFrameLocks noChangeAspect="1"/>
@@ -6629,7 +6638,7 @@
                     <pic:cNvPicPr/>
                   </pic:nvPicPr>
                   <pic:blipFill>
-                    <a:blip r:embed="rId13"/>
+                    <a:blip r:embed="rId14"/>
                     <a:stretch>
                       <a:fillRect/>
                     </a:stretch>
@@ -6637,7 +6646,7 @@
                   <pic:spPr>
                     <a:xfrm>
                       <a:off x="0" y="0"/>
-                      <a:ext cx="5029200" cy="3008295"/>
+                      <a:ext cx="5029200" cy="3005429"/>
                     </a:xfrm>
                     <a:prstGeom prst="rect"/>
                   </pic:spPr>
@@ -6765,7 +6774,7 @@
       <w:r>
         <w:drawing>
           <wp:inline xmlns:a="http://schemas.openxmlformats.org/drawingml/2006/main" xmlns:pic="http://schemas.openxmlformats.org/drawingml/2006/picture">
-            <wp:extent cx="5029200" cy="4392292"/>
+            <wp:extent cx="5029200" cy="4390636"/>
             <wp:docPr id="6" name="Picture 6"/>
             <wp:cNvGraphicFramePr>
               <a:graphicFrameLocks noChangeAspect="1"/>
@@ -6778,7 +6787,7 @@
                     <pic:cNvPicPr/>
                   </pic:nvPicPr>
                   <pic:blipFill>
-                    <a:blip r:embed="rId14"/>
+                    <a:blip r:embed="rId15"/>
                     <a:stretch>
                       <a:fillRect/>
                     </a:stretch>
@@ -6786,7 +6795,7 @@
                   <pic:spPr>
                     <a:xfrm>
                       <a:off x="0" y="0"/>
-                      <a:ext cx="5029200" cy="4392292"/>
+                      <a:ext cx="5029200" cy="4390636"/>
                     </a:xfrm>
                     <a:prstGeom prst="rect"/>
                   </pic:spPr>
@@ -8500,7 +8509,7 @@
       <w:r>
         <w:drawing>
           <wp:inline xmlns:a="http://schemas.openxmlformats.org/drawingml/2006/main" xmlns:pic="http://schemas.openxmlformats.org/drawingml/2006/picture">
-            <wp:extent cx="5029200" cy="2063370"/>
+            <wp:extent cx="5029200" cy="2061328"/>
             <wp:docPr id="7" name="Picture 7"/>
             <wp:cNvGraphicFramePr>
               <a:graphicFrameLocks noChangeAspect="1"/>
@@ -8513,7 +8522,7 @@
                     <pic:cNvPicPr/>
                   </pic:nvPicPr>
                   <pic:blipFill>
-                    <a:blip r:embed="rId15"/>
+                    <a:blip r:embed="rId16"/>
                     <a:stretch>
                       <a:fillRect/>
                     </a:stretch>
@@ -8521,7 +8530,7 @@
                   <pic:spPr>
                     <a:xfrm>
                       <a:off x="0" y="0"/>
-                      <a:ext cx="5029200" cy="2063370"/>
+                      <a:ext cx="5029200" cy="2061328"/>
                     </a:xfrm>
                     <a:prstGeom prst="rect"/>
                   </pic:spPr>
@@ -9625,7 +9634,7 @@
       <w:r>
         <w:drawing>
           <wp:inline xmlns:a="http://schemas.openxmlformats.org/drawingml/2006/main" xmlns:pic="http://schemas.openxmlformats.org/drawingml/2006/picture">
-            <wp:extent cx="5029200" cy="2418945"/>
+            <wp:extent cx="5029200" cy="2416071"/>
             <wp:docPr id="8" name="Picture 8"/>
             <wp:cNvGraphicFramePr>
               <a:graphicFrameLocks noChangeAspect="1"/>
@@ -9638,7 +9647,7 @@
                     <pic:cNvPicPr/>
                   </pic:nvPicPr>
                   <pic:blipFill>
-                    <a:blip r:embed="rId16"/>
+                    <a:blip r:embed="rId17"/>
                     <a:stretch>
                       <a:fillRect/>
                     </a:stretch>
@@ -9646,7 +9655,7 @@
                   <pic:spPr>
                     <a:xfrm>
                       <a:off x="0" y="0"/>
-                      <a:ext cx="5029200" cy="2418945"/>
+                      <a:ext cx="5029200" cy="2416071"/>
                     </a:xfrm>
                     <a:prstGeom prst="rect"/>
                   </pic:spPr>
@@ -9688,7 +9697,7 @@
           <w:color w:val="000000"/>
           <w:sz w:val="24"/>
         </w:rPr>
-        <w:t>Discussion</w:t>
+        <w:t>4. Discussion</w:t>
       </w:r>
     </w:p>
     <w:p>
@@ -10130,7 +10139,7 @@
           <w:color w:val="000000"/>
           <w:sz w:val="24"/>
         </w:rPr>
-        <w:t>Conclusions</w:t>
+        <w:t>5. Conclusions</w:t>
       </w:r>
     </w:p>
     <w:p xmlns:a="http://schemas.openxmlformats.org/drawingml/2006/main" xmlns:pic="http://schemas.openxmlformats.org/drawingml/2006/picture">
@@ -10679,6 +10688,7 @@
       </w:r>
     </w:p>
     <w:sectPr>
+      <w:footerReference w:type="default" r:id="rId9"/>
       <w:pgSz w:w="12240" w:h="15840"/>
       <w:pgMar w:top="1440" w:right="1440" w:bottom="1440" w:left="1440" w:header="720" w:footer="720" w:gutter="0"/>
       <w:cols w:space="720"/>
@@ -10686,6 +10696,28 @@
     </w:sectPr>
   </w:body>
 </w:document>
+</file>
+
+<file path=word/footer1.xml><?xml version="1.0" encoding="utf-8"?>
+<w:ftr xmlns:m="http://schemas.openxmlformats.org/officeDocument/2006/math" xmlns:mc="http://schemas.openxmlformats.org/markup-compatibility/2006" xmlns:mo="http://schemas.microsoft.com/office/mac/office/2008/main" xmlns:mv="urn:schemas-microsoft-com:mac:vml" xmlns:o="urn:schemas-microsoft-com:office:office" xmlns:r="http://schemas.openxmlformats.org/officeDocument/2006/relationships" xmlns:v="urn:schemas-microsoft-com:vml" xmlns:w10="urn:schemas-microsoft-com:office:word" xmlns:w14="http://schemas.microsoft.com/office/word/2010/wordml" xmlns:w="http://schemas.openxmlformats.org/wordprocessingml/2006/main" xmlns:wne="http://schemas.microsoft.com/office/word/2006/wordml" xmlns:wp14="http://schemas.microsoft.com/office/word/2010/wordprocessingDrawing" xmlns:wp="http://schemas.openxmlformats.org/drawingml/2006/wordprocessingDrawing" xmlns:wpc="http://schemas.microsoft.com/office/word/2010/wordprocessingCanvas" xmlns:wpg="http://schemas.microsoft.com/office/word/2010/wordprocessingGroup" xmlns:wpi="http://schemas.microsoft.com/office/word/2010/wordprocessingInk" xmlns:wps="http://schemas.microsoft.com/office/word/2010/wordprocessingShape" mc:Ignorable="w14 wp14">
+  <w:p>
+    <w:pPr>
+      <w:pStyle w:val="Footer"/>
+      <w:jc w:val="center"/>
+    </w:pPr>
+    <w:r>
+      <w:rPr>
+        <w:rFonts w:ascii="Times New Roman" w:hAnsi="Times New Roman" w:cs="Times New Roman" w:eastAsia="Times New Roman"/>
+        <w:sz w:val="20"/>
+        <w:szCs w:val="20"/>
+      </w:rPr>
+      <w:fldChar w:fldCharType="begin"/>
+      <w:instrText xml:space="preserve">PAGE</w:instrText>
+      <w:fldChar w:fldCharType="separate"/>
+      <w:fldChar w:fldCharType="end"/>
+    </w:r>
+  </w:p>
+</w:ftr>
 </file>
 
 <file path=word/numbering.xml><?xml version="1.0" encoding="utf-8"?>

</xml_diff>

<commit_message>
chore(cctc): reviewer-perspective formatting and transparency fixes
- Shorten first Highlights bullet to <=85 characters
- Add Methods caveat on HR-to-OR approximation and annual-rate assumptions for statins
- Convert all bracketed citation numbers to Word-native superscript in docx
- Regenerate docx, pptx, tables, and submission package

Co-Authored-By: Tatsuki Onishi <bougtoir@gmail.com>
</commit_message>
<xml_diff>
--- a/rct-decomposition/KOTHA_Framework_CCTC.docx
+++ b/rct-decomposition/KOTHA_Framework_CCTC.docx
@@ -88,7 +88,7 @@
           <w:i w:val="0"/>
           <w:sz w:val="24"/>
         </w:rPr>
-        <w:t>Word count: 2365</w:t>
+        <w:t>Word count: 2422</w:t>
       </w:r>
     </w:p>
     <w:p>
@@ -132,7 +132,7 @@
           <w:sz w:val="24"/>
           <w:szCs w:val="24"/>
         </w:rPr>
-        <w:t xml:space="preserve">KOTHA separates structural information loss from residual confounding in trial evidence.</w:t>
+        <w:t xml:space="preserve">KOTHA separates structural information loss from residual confounding.</w:t>
       </w:r>
     </w:p>
     <w:p xmlns:a="http://schemas.openxmlformats.org/drawingml/2006/main" xmlns:pic="http://schemas.openxmlformats.org/drawingml/2006/picture">
@@ -1026,7 +1026,41 @@
           <w:sz w:val="24"/>
           <w:szCs w:val="24"/>
         </w:rPr>
-        <w:t xml:space="preserve">Evidence-based medicine places RCTs and their meta-analyses at the apex of the evidence hierarchy because randomization minimizes confounding and provides internally valid estimates of treatment effects [1]. Nevertheless, meta-analyses of observational studies and RCTs frequently disagree: observational evidence may show statistically significant benefit while RCT evidence does not [2-3]. The conventional explanation invokes residual confounding, selection bias, or publication bias in observational data. While these sources of bias are real, they may not fully account for the discordance.</w:t>
+        <w:t xml:space="preserve">Evidence-based medicine places RCTs and their meta-analyses at the apex of the evidence hierarchy because randomization minimizes confounding and provides internally valid estimates of treatment effects </w:t>
+      </w:r>
+      <w:r>
+        <w:rPr>
+          <w:rFonts w:ascii="Times New Roman" w:hAnsi="Times New Roman" w:cs="Times New Roman" w:eastAsia="Times New Roman"/>
+          <w:sz w:val="24"/>
+          <w:szCs w:val="24"/>
+          <w:vertAlign w:val="superscript"/>
+        </w:rPr>
+        <w:t xml:space="preserve">[1]</w:t>
+      </w:r>
+      <w:r>
+        <w:rPr>
+          <w:rFonts w:ascii="Times New Roman" w:hAnsi="Times New Roman" w:cs="Times New Roman" w:eastAsia="Times New Roman"/>
+          <w:sz w:val="24"/>
+          <w:szCs w:val="24"/>
+        </w:rPr>
+        <w:t xml:space="preserve">. Nevertheless, meta-analyses of observational studies and RCTs frequently disagree: observational evidence may show statistically significant benefit while RCT evidence does not </w:t>
+      </w:r>
+      <w:r>
+        <w:rPr>
+          <w:rFonts w:ascii="Times New Roman" w:hAnsi="Times New Roman" w:cs="Times New Roman" w:eastAsia="Times New Roman"/>
+          <w:sz w:val="24"/>
+          <w:szCs w:val="24"/>
+          <w:vertAlign w:val="superscript"/>
+        </w:rPr>
+        <w:t xml:space="preserve">[2-3]</w:t>
+      </w:r>
+      <w:r>
+        <w:rPr>
+          <w:rFonts w:ascii="Times New Roman" w:hAnsi="Times New Roman" w:cs="Times New Roman" w:eastAsia="Times New Roman"/>
+          <w:sz w:val="24"/>
+          <w:szCs w:val="24"/>
+        </w:rPr>
+        <w:t xml:space="preserve">. The conventional explanation invokes residual confounding, selection bias, or publication bias in observational data. While these sources of bias are real, they may not fully account for the discordance.</w:t>
       </w:r>
     </w:p>
     <w:p xmlns:a="http://schemas.openxmlformats.org/drawingml/2006/main" xmlns:pic="http://schemas.openxmlformats.org/drawingml/2006/picture">
@@ -1034,14 +1068,6 @@
         <w:pStyle w:val="Normal"/>
         <w:spacing w:line="480" w:lineRule="auto" w:after="120"/>
       </w:pPr>
-      <w:r>
-        <w:rPr>
-          <w:rFonts w:ascii="Times New Roman" w:hAnsi="Times New Roman" w:cs="Times New Roman" w:eastAsia="Times New Roman"/>
-          <w:sz w:val="24"/>
-          <w:szCs w:val="24"/>
-        </w:rPr>
-        <w:t xml:space="preserve">An alternative, structural explanation deserves systematic attention. RCT enrollment criteria, consent processes, and site selection progressively restrict the study population [4-5]. Because clinical events are concentrated in the highest-risk patients—those with comorbidities, advanced disease, or organ dysfunction—their exclusion lowers event rates in the enrolled cohort. If trial protocols do not compensate by increasing sample size, extending follow-up, or enriching high-risk enrollment, the resulting evidence base can become informationally insufficient. We term this phenomenon</w:t>
-      </w:r>
       <w:r>
         <w:rPr>
           <w:rFonts w:ascii="Times New Roman" w:hAnsi="Times New Roman" w:cs="Times New Roman" w:eastAsia="Times New Roman"/>
@@ -1156,6 +1182,31 @@
         </w:rPr>
         <w:t xml:space="preserve">.</w:t>
       </w:r>
+      <w:r>
+        <w:rPr>
+          <w:rFonts w:ascii="Times New Roman" w:hAnsi="Times New Roman" w:cs="Times New Roman" w:eastAsia="Times New Roman"/>
+          <w:sz w:val="24"/>
+          <w:szCs w:val="24"/>
+        </w:rPr>
+        <w:t xml:space="preserve">An alternative, structural explanation deserves systematic attention. RCT enrollment criteria, consent processes, and site selection progressively restrict the study population </w:t>
+      </w:r>
+      <w:r>
+        <w:rPr>
+          <w:rFonts w:ascii="Times New Roman" w:hAnsi="Times New Roman" w:cs="Times New Roman" w:eastAsia="Times New Roman"/>
+          <w:sz w:val="24"/>
+          <w:szCs w:val="24"/>
+          <w:vertAlign w:val="superscript"/>
+        </w:rPr>
+        <w:t xml:space="preserve">[4-5]</w:t>
+      </w:r>
+      <w:r>
+        <w:rPr>
+          <w:rFonts w:ascii="Times New Roman" w:hAnsi="Times New Roman" w:cs="Times New Roman" w:eastAsia="Times New Roman"/>
+          <w:sz w:val="24"/>
+          <w:szCs w:val="24"/>
+        </w:rPr>
+        <w:t xml:space="preserve">. Because clinical events are concentrated in the highest-risk patients—those with comorbidities, advanced disease, or organ dysfunction—their exclusion lowers event rates in the enrolled cohort. If trial protocols do not compensate by increasing sample size, extending follow-up, or enriching high-risk enrollment, the resulting evidence base can become informationally insufficient. We term this phenomenon</w:t>
+      </w:r>
     </w:p>
     <w:p xmlns:a="http://schemas.openxmlformats.org/drawingml/2006/main" xmlns:pic="http://schemas.openxmlformats.org/drawingml/2006/picture">
       <w:pPr>
@@ -1168,7 +1219,41 @@
           <w:sz w:val="24"/>
           <w:szCs w:val="24"/>
         </w:rPr>
-        <w:t xml:space="preserve">The concepts of optimal information size (OIS) and trial sequential analysis (TSA) provide partial remedies. OIS recognizes that meta-analyses, like individual trials, require a minimum information size to reach reliable conclusions [6-7]. TSA applies sequential monitoring boundaries to cumulative meta-analysis, distinguishing evidence of no effect (futility boundary crossed) from no evidence of effect (boundary not crossed) [8-9]. However, these tools are underused in guideline development, and neither directly quantifies the information loss attributable to enrollment-driven risk-profile shifts.</w:t>
+        <w:t xml:space="preserve">The concepts of optimal information size (OIS) and trial sequential analysis (TSA) provide partial remedies. OIS recognizes that meta-analyses, like individual trials, require a minimum information size to reach reliable conclusions </w:t>
+      </w:r>
+      <w:r>
+        <w:rPr>
+          <w:rFonts w:ascii="Times New Roman" w:hAnsi="Times New Roman" w:cs="Times New Roman" w:eastAsia="Times New Roman"/>
+          <w:sz w:val="24"/>
+          <w:szCs w:val="24"/>
+          <w:vertAlign w:val="superscript"/>
+        </w:rPr>
+        <w:t xml:space="preserve">[6-7]</w:t>
+      </w:r>
+      <w:r>
+        <w:rPr>
+          <w:rFonts w:ascii="Times New Roman" w:hAnsi="Times New Roman" w:cs="Times New Roman" w:eastAsia="Times New Roman"/>
+          <w:sz w:val="24"/>
+          <w:szCs w:val="24"/>
+        </w:rPr>
+        <w:t xml:space="preserve">. TSA applies sequential monitoring boundaries to cumulative meta-analysis, distinguishing evidence of no effect (futility boundary crossed) from no evidence of effect (boundary not crossed) </w:t>
+      </w:r>
+      <w:r>
+        <w:rPr>
+          <w:rFonts w:ascii="Times New Roman" w:hAnsi="Times New Roman" w:cs="Times New Roman" w:eastAsia="Times New Roman"/>
+          <w:sz w:val="24"/>
+          <w:szCs w:val="24"/>
+          <w:vertAlign w:val="superscript"/>
+        </w:rPr>
+        <w:t xml:space="preserve">[8-9]</w:t>
+      </w:r>
+      <w:r>
+        <w:rPr>
+          <w:rFonts w:ascii="Times New Roman" w:hAnsi="Times New Roman" w:cs="Times New Roman" w:eastAsia="Times New Roman"/>
+          <w:sz w:val="24"/>
+          <w:szCs w:val="24"/>
+        </w:rPr>
+        <w:t xml:space="preserve">. However, these tools are underused in guideline development, and neither directly quantifies the information loss attributable to enrollment-driven risk-profile shifts.</w:t>
       </w:r>
     </w:p>
     <w:p xmlns:a="http://schemas.openxmlformats.org/drawingml/2006/main" xmlns:pic="http://schemas.openxmlformats.org/drawingml/2006/picture">
@@ -1689,7 +1774,24 @@
           <w:sz w:val="24"/>
           <w:szCs w:val="24"/>
         </w:rPr>
-        <w:t xml:space="preserve">Module K asks: if the RCTs in a meta-analysis had enrolled patients with the risk profile of the real-world target population, would the combined evidence have been sufficient to detect the effect suggested by observational studies? The simulation component follows the ADEMP reporting structure [10].</w:t>
+        <w:t xml:space="preserve">Module K asks: if the RCTs in a meta-analysis had enrolled patients with the risk profile of the real-world target population, would the combined evidence have been sufficient to detect the effect suggested by observational studies? The simulation component follows the ADEMP reporting structure </w:t>
+      </w:r>
+      <w:r>
+        <w:rPr>
+          <w:rFonts w:ascii="Times New Roman" w:hAnsi="Times New Roman" w:cs="Times New Roman" w:eastAsia="Times New Roman"/>
+          <w:sz w:val="24"/>
+          <w:szCs w:val="24"/>
+          <w:vertAlign w:val="superscript"/>
+        </w:rPr>
+        <w:t xml:space="preserve">[10]</w:t>
+      </w:r>
+      <w:r>
+        <w:rPr>
+          <w:rFonts w:ascii="Times New Roman" w:hAnsi="Times New Roman" w:cs="Times New Roman" w:eastAsia="Times New Roman"/>
+          <w:sz w:val="24"/>
+          <w:szCs w:val="24"/>
+        </w:rPr>
+        <w:t xml:space="preserve">.</w:t>
       </w:r>
     </w:p>
     <w:p xmlns:a="http://schemas.openxmlformats.org/drawingml/2006/main" xmlns:pic="http://schemas.openxmlformats.org/drawingml/2006/picture">
@@ -2010,14 +2112,6 @@
           <w:sz w:val="24"/>
           <w:szCs w:val="24"/>
         </w:rPr>
-        <w:t xml:space="preserve">patients randomized 1:1. Under the Schoenfeld approximation [11], the standard error of the log-OR is approximately</w:t>
-      </w:r>
-      <w:r>
-        <w:rPr>
-          <w:rFonts w:ascii="Times New Roman" w:hAnsi="Times New Roman" w:cs="Times New Roman" w:eastAsia="Times New Roman"/>
-          <w:sz w:val="24"/>
-          <w:szCs w:val="24"/>
-        </w:rPr>
         <w:t xml:space="preserve"> </w:t>
       </w:r>
       <m:oMath>
@@ -2049,6 +2143,31 @@
           <w:szCs w:val="24"/>
         </w:rPr>
         <w:t xml:space="preserve">, yielding the power function</w:t>
+      </w:r>
+      <w:r>
+        <w:rPr>
+          <w:rFonts w:ascii="Times New Roman" w:hAnsi="Times New Roman" w:cs="Times New Roman" w:eastAsia="Times New Roman"/>
+          <w:sz w:val="24"/>
+          <w:szCs w:val="24"/>
+        </w:rPr>
+        <w:t xml:space="preserve">patients randomized 1:1. Under the Schoenfeld approximation </w:t>
+      </w:r>
+      <w:r>
+        <w:rPr>
+          <w:rFonts w:ascii="Times New Roman" w:hAnsi="Times New Roman" w:cs="Times New Roman" w:eastAsia="Times New Roman"/>
+          <w:sz w:val="24"/>
+          <w:szCs w:val="24"/>
+          <w:vertAlign w:val="superscript"/>
+        </w:rPr>
+        <w:t xml:space="preserve">[11]</w:t>
+      </w:r>
+      <w:r>
+        <w:rPr>
+          <w:rFonts w:ascii="Times New Roman" w:hAnsi="Times New Roman" w:cs="Times New Roman" w:eastAsia="Times New Roman"/>
+          <w:sz w:val="24"/>
+          <w:szCs w:val="24"/>
+        </w:rPr>
+        <w:t xml:space="preserve">, the standard error of the log-OR is approximately</w:t>
       </w:r>
     </w:p>
     <w:p xmlns:a="http://schemas.openxmlformats.org/drawingml/2006/main" xmlns:pic="http://schemas.openxmlformats.org/drawingml/2006/picture">
@@ -2318,7 +2437,7 @@
           <w:sz w:val="24"/>
           <w:szCs w:val="24"/>
         </w:rPr>
-        <w:t xml:space="preserve">quantifies event dilution. Module K reports power across a grid of assumed true effects and computes the sample size required to reach 80% power under each scenario.</w:t>
+        <w:t xml:space="preserve">quantifies event dilution. Module K reports power across a grid of assumed true effects and computes the sample size required to reach 80% power under each scenario. For the statins case, which reports hazard ratios, the hazard ratio is approximated by an odds ratio under the rare-event assumption and published annual mortality rates are used as approximate event probabilities; this comparison is intended to illustrate the relative power loss across enrollment scenarios rather than to provide exact sample-size estimates for a specific follow-up duration.</w:t>
       </w:r>
     </w:p>
     <w:p>
@@ -2493,14 +2612,6 @@
           <w:szCs w:val="24"/>
         </w:rPr>
         <w:t xml:space="preserve"> </w:t>
-      </w:r>
-      <w:r>
-        <w:rPr>
-          <w:rFonts w:ascii="Times New Roman" w:hAnsi="Times New Roman" w:cs="Times New Roman" w:eastAsia="Times New Roman"/>
-          <w:sz w:val="24"/>
-          <w:szCs w:val="24"/>
-        </w:rPr>
-        <w:t xml:space="preserve">[15], so that</w:t>
       </w:r>
       <w:r>
         <w:rPr>
@@ -2644,14 +2755,6 @@
           </m:e>
         </m:d>
       </m:oMath>
-      <w:r>
-        <w:rPr>
-          <w:rFonts w:ascii="Times New Roman" w:hAnsi="Times New Roman" w:cs="Times New Roman" w:eastAsia="Times New Roman"/>
-          <w:sz w:val="24"/>
-          <w:szCs w:val="24"/>
-        </w:rPr>
-        <w:t xml:space="preserve">. Alternative effect measures such as restricted mean survival time can be substituted when proportional-hazards assumptions are questionable [12-13]. Evidence-based priors have been proposed to anchor historical expectations while limiting prior-data conflict [14]. We also present bias-adjusted normal-approximation analyses as a sensitivity check. Posterior distributions are sampled with an affine-invariant ensemble MCMC [16] using 16 walkers, 1,000 warmup and 4,000 post-warmup iterations per walker, for each</w:t>
-      </w:r>
       <w:r>
         <w:rPr>
           <w:rFonts w:ascii="Times New Roman" w:hAnsi="Times New Roman" w:cs="Times New Roman" w:eastAsia="Times New Roman"/>
@@ -2795,6 +2898,82 @@
         </w:rPr>
         <w:t xml:space="preserve">= 0.3 as an illustrative moderate-discounting value without claiming it is universally optimal.</w:t>
       </w:r>
+      <w:r>
+        <w:rPr>
+          <w:rFonts w:ascii="Times New Roman" w:hAnsi="Times New Roman" w:cs="Times New Roman" w:eastAsia="Times New Roman"/>
+          <w:sz w:val="24"/>
+          <w:szCs w:val="24"/>
+          <w:vertAlign w:val="superscript"/>
+        </w:rPr>
+        <w:t xml:space="preserve">[15]</w:t>
+      </w:r>
+      <w:r>
+        <w:rPr>
+          <w:rFonts w:ascii="Times New Roman" w:hAnsi="Times New Roman" w:cs="Times New Roman" w:eastAsia="Times New Roman"/>
+          <w:sz w:val="24"/>
+          <w:szCs w:val="24"/>
+        </w:rPr>
+        <w:t xml:space="preserve">, so that</w:t>
+      </w:r>
+      <w:r>
+        <w:rPr>
+          <w:rFonts w:ascii="Times New Roman" w:hAnsi="Times New Roman" w:cs="Times New Roman" w:eastAsia="Times New Roman"/>
+          <w:sz w:val="24"/>
+          <w:szCs w:val="24"/>
+        </w:rPr>
+        <w:t xml:space="preserve">. Alternative effect measures such as restricted mean survival time can be substituted when proportional-hazards assumptions are questionable </w:t>
+      </w:r>
+      <w:r>
+        <w:rPr>
+          <w:rFonts w:ascii="Times New Roman" w:hAnsi="Times New Roman" w:cs="Times New Roman" w:eastAsia="Times New Roman"/>
+          <w:sz w:val="24"/>
+          <w:szCs w:val="24"/>
+          <w:vertAlign w:val="superscript"/>
+        </w:rPr>
+        <w:t xml:space="preserve">[12-13]</w:t>
+      </w:r>
+      <w:r>
+        <w:rPr>
+          <w:rFonts w:ascii="Times New Roman" w:hAnsi="Times New Roman" w:cs="Times New Roman" w:eastAsia="Times New Roman"/>
+          <w:sz w:val="24"/>
+          <w:szCs w:val="24"/>
+        </w:rPr>
+        <w:t xml:space="preserve">. Evidence-based priors have been proposed to anchor historical expectations while limiting prior-data conflict </w:t>
+      </w:r>
+      <w:r>
+        <w:rPr>
+          <w:rFonts w:ascii="Times New Roman" w:hAnsi="Times New Roman" w:cs="Times New Roman" w:eastAsia="Times New Roman"/>
+          <w:sz w:val="24"/>
+          <w:szCs w:val="24"/>
+          <w:vertAlign w:val="superscript"/>
+        </w:rPr>
+        <w:t xml:space="preserve">[14]</w:t>
+      </w:r>
+      <w:r>
+        <w:rPr>
+          <w:rFonts w:ascii="Times New Roman" w:hAnsi="Times New Roman" w:cs="Times New Roman" w:eastAsia="Times New Roman"/>
+          <w:sz w:val="24"/>
+          <w:szCs w:val="24"/>
+        </w:rPr>
+        <w:t xml:space="preserve">. We also present bias-adjusted normal-approximation analyses as a sensitivity check. Posterior distributions are sampled with an affine-invariant ensemble MCMC </w:t>
+      </w:r>
+      <w:r>
+        <w:rPr>
+          <w:rFonts w:ascii="Times New Roman" w:hAnsi="Times New Roman" w:cs="Times New Roman" w:eastAsia="Times New Roman"/>
+          <w:sz w:val="24"/>
+          <w:szCs w:val="24"/>
+          <w:vertAlign w:val="superscript"/>
+        </w:rPr>
+        <w:t xml:space="preserve">[16]</w:t>
+      </w:r>
+      <w:r>
+        <w:rPr>
+          <w:rFonts w:ascii="Times New Roman" w:hAnsi="Times New Roman" w:cs="Times New Roman" w:eastAsia="Times New Roman"/>
+          <w:sz w:val="24"/>
+          <w:szCs w:val="24"/>
+        </w:rPr>
+        <w:t xml:space="preserve"> using 16 walkers, 1,000 warmup and 4,000 post-warmup iterations per walker, for each</w:t>
+      </w:r>
     </w:p>
     <w:p>
       <w:pPr>
@@ -2821,7 +3000,31 @@
           <w:sz w:val="24"/>
           <w:szCs w:val="24"/>
         </w:rPr>
-        <w:t xml:space="preserve">Module H maps the outputs of Modules K and T onto the GRADE framework [1]. It includes five assessments (Table 2): information sufficiency (OIS vs observed events), confidence interval interpretation, representativeness (event rate ratio), TSA boundary status, and recommended language. For CI interpretation, we used relative effect boundaries of 0.80 and 1.25 to define clinically important benefit and harm. For representativeness, event-rate ratios below 0.67 or above 1.50 (a ≥50% relative shift) are classified as serious indirectness, and ratios below 0.80 or above 1.25 (a ≥25% relative shift) as moderate indirectness. These thresholds correspond to conventional boundaries for clinically important relative effects. The result is a KOTHA-enhanced certainty rating and recommendation that explicitly distinguishes</w:t>
+        <w:t xml:space="preserve"> </w:t>
+      </w:r>
+      <w:r>
+        <w:rPr>
+          <w:rFonts w:ascii="Times New Roman" w:hAnsi="Times New Roman" w:cs="Times New Roman" w:eastAsia="Times New Roman"/>
+          <w:sz w:val="24"/>
+          <w:szCs w:val="24"/>
+        </w:rPr>
+        <w:t xml:space="preserve">“</w:t>
+      </w:r>
+      <w:r>
+        <w:rPr>
+          <w:rFonts w:ascii="Times New Roman" w:hAnsi="Times New Roman" w:cs="Times New Roman" w:eastAsia="Times New Roman"/>
+          <w:sz w:val="24"/>
+          <w:szCs w:val="24"/>
+        </w:rPr>
+        <w:t xml:space="preserve">evidence of effect,</w:t>
+      </w:r>
+      <w:r>
+        <w:rPr>
+          <w:rFonts w:ascii="Times New Roman" w:hAnsi="Times New Roman" w:cs="Times New Roman" w:eastAsia="Times New Roman"/>
+          <w:sz w:val="24"/>
+          <w:szCs w:val="24"/>
+        </w:rPr>
+        <w:t xml:space="preserve">”</w:t>
       </w:r>
       <w:r>
         <w:rPr>
@@ -2845,7 +3048,7 @@
           <w:sz w:val="24"/>
           <w:szCs w:val="24"/>
         </w:rPr>
-        <w:t xml:space="preserve">evidence of effect,</w:t>
+        <w:t xml:space="preserve">evidence of no effect,</w:t>
       </w:r>
       <w:r>
         <w:rPr>
@@ -2869,7 +3072,7 @@
           <w:sz w:val="24"/>
           <w:szCs w:val="24"/>
         </w:rPr>
-        <w:t xml:space="preserve">“</w:t>
+        <w:t xml:space="preserve">and</w:t>
       </w:r>
       <w:r>
         <w:rPr>
@@ -2877,7 +3080,23 @@
           <w:sz w:val="24"/>
           <w:szCs w:val="24"/>
         </w:rPr>
-        <w:t xml:space="preserve">evidence of no effect,</w:t>
+        <w:t xml:space="preserve"> </w:t>
+      </w:r>
+      <w:r>
+        <w:rPr>
+          <w:rFonts w:ascii="Times New Roman" w:hAnsi="Times New Roman" w:cs="Times New Roman" w:eastAsia="Times New Roman"/>
+          <w:sz w:val="24"/>
+          <w:szCs w:val="24"/>
+        </w:rPr>
+        <w:t xml:space="preserve">“</w:t>
+      </w:r>
+      <w:r>
+        <w:rPr>
+          <w:rFonts w:ascii="Times New Roman" w:hAnsi="Times New Roman" w:cs="Times New Roman" w:eastAsia="Times New Roman"/>
+          <w:sz w:val="24"/>
+          <w:szCs w:val="24"/>
+        </w:rPr>
+        <w:t xml:space="preserve">no evidence of effect (inconsistent or indirect).</w:t>
       </w:r>
       <w:r>
         <w:rPr>
@@ -2893,7 +3112,16 @@
           <w:sz w:val="24"/>
           <w:szCs w:val="24"/>
         </w:rPr>
-        <w:t xml:space="preserve"> </w:t>
+        <w:t xml:space="preserve">Module H maps the outputs of Modules K and T onto the GRADE framework </w:t>
+      </w:r>
+      <w:r>
+        <w:rPr>
+          <w:rFonts w:ascii="Times New Roman" w:hAnsi="Times New Roman" w:cs="Times New Roman" w:eastAsia="Times New Roman"/>
+          <w:sz w:val="24"/>
+          <w:szCs w:val="24"/>
+          <w:vertAlign w:val="superscript"/>
+        </w:rPr>
+        <w:t xml:space="preserve">[1]</w:t>
       </w:r>
       <w:r>
         <w:rPr>
@@ -2901,39 +3129,7 @@
           <w:sz w:val="24"/>
           <w:szCs w:val="24"/>
         </w:rPr>
-        <w:t xml:space="preserve">and</w:t>
-      </w:r>
-      <w:r>
-        <w:rPr>
-          <w:rFonts w:ascii="Times New Roman" w:hAnsi="Times New Roman" w:cs="Times New Roman" w:eastAsia="Times New Roman"/>
-          <w:sz w:val="24"/>
-          <w:szCs w:val="24"/>
-        </w:rPr>
-        <w:t xml:space="preserve"> </w:t>
-      </w:r>
-      <w:r>
-        <w:rPr>
-          <w:rFonts w:ascii="Times New Roman" w:hAnsi="Times New Roman" w:cs="Times New Roman" w:eastAsia="Times New Roman"/>
-          <w:sz w:val="24"/>
-          <w:szCs w:val="24"/>
-        </w:rPr>
-        <w:t xml:space="preserve">“</w:t>
-      </w:r>
-      <w:r>
-        <w:rPr>
-          <w:rFonts w:ascii="Times New Roman" w:hAnsi="Times New Roman" w:cs="Times New Roman" w:eastAsia="Times New Roman"/>
-          <w:sz w:val="24"/>
-          <w:szCs w:val="24"/>
-        </w:rPr>
-        <w:t xml:space="preserve">no evidence of effect (inconsistent or indirect).</w:t>
-      </w:r>
-      <w:r>
-        <w:rPr>
-          <w:rFonts w:ascii="Times New Roman" w:hAnsi="Times New Roman" w:cs="Times New Roman" w:eastAsia="Times New Roman"/>
-          <w:sz w:val="24"/>
-          <w:szCs w:val="24"/>
-        </w:rPr>
-        <w:t xml:space="preserve">”</w:t>
+        <w:t xml:space="preserve">. It includes five assessments (Table 2): information sufficiency (OIS vs observed events), confidence interval interpretation, representativeness (event rate ratio), TSA boundary status, and recommended language. For CI interpretation, we used relative effect boundaries of 0.80 and 1.25 to define clinically important benefit and harm. For representativeness, event-rate ratios below 0.67 or above 1.50 (a ≥50% relative shift) are classified as serious indirectness, and ratios below 0.80 or above 1.25 (a ≥25% relative shift) as moderate indirectness. These thresholds correspond to conventional boundaries for clinically important relative effects. The result is a KOTHA-enhanced certainty rating and recommendation that explicitly distinguishes</w:t>
       </w:r>
     </w:p>
     <w:p>
@@ -2961,7 +3157,92 @@
           <w:sz w:val="24"/>
           <w:szCs w:val="24"/>
         </w:rPr>
-        <w:t xml:space="preserve">For magnesium in AMI we used study-level event counts extracted from published overviews [17-18]. For statins in heart failure we used aggregate data from five observational cohorts [19-23] and two RCTs [24-25]. We used DerSimonian-Laird random-effects meta-analysis [26] and computed 95% confidence intervals. OIS and TSA were calculated using standard formulas [6-9]. All analyses were performed with the Python code in the public repository.</w:t>
+        <w:t xml:space="preserve">For magnesium in AMI we used study-level event counts extracted from published overviews </w:t>
+      </w:r>
+      <w:r>
+        <w:rPr>
+          <w:rFonts w:ascii="Times New Roman" w:hAnsi="Times New Roman" w:cs="Times New Roman" w:eastAsia="Times New Roman"/>
+          <w:sz w:val="24"/>
+          <w:szCs w:val="24"/>
+          <w:vertAlign w:val="superscript"/>
+        </w:rPr>
+        <w:t xml:space="preserve">[17-18]</w:t>
+      </w:r>
+      <w:r>
+        <w:rPr>
+          <w:rFonts w:ascii="Times New Roman" w:hAnsi="Times New Roman" w:cs="Times New Roman" w:eastAsia="Times New Roman"/>
+          <w:sz w:val="24"/>
+          <w:szCs w:val="24"/>
+        </w:rPr>
+        <w:t xml:space="preserve">. For statins in heart failure we used aggregate data from five observational cohorts </w:t>
+      </w:r>
+      <w:r>
+        <w:rPr>
+          <w:rFonts w:ascii="Times New Roman" w:hAnsi="Times New Roman" w:cs="Times New Roman" w:eastAsia="Times New Roman"/>
+          <w:sz w:val="24"/>
+          <w:szCs w:val="24"/>
+          <w:vertAlign w:val="superscript"/>
+        </w:rPr>
+        <w:t xml:space="preserve">[19-23]</w:t>
+      </w:r>
+      <w:r>
+        <w:rPr>
+          <w:rFonts w:ascii="Times New Roman" w:hAnsi="Times New Roman" w:cs="Times New Roman" w:eastAsia="Times New Roman"/>
+          <w:sz w:val="24"/>
+          <w:szCs w:val="24"/>
+        </w:rPr>
+        <w:t xml:space="preserve"> and two RCTs </w:t>
+      </w:r>
+      <w:r>
+        <w:rPr>
+          <w:rFonts w:ascii="Times New Roman" w:hAnsi="Times New Roman" w:cs="Times New Roman" w:eastAsia="Times New Roman"/>
+          <w:sz w:val="24"/>
+          <w:szCs w:val="24"/>
+          <w:vertAlign w:val="superscript"/>
+        </w:rPr>
+        <w:t xml:space="preserve">[24-25]</w:t>
+      </w:r>
+      <w:r>
+        <w:rPr>
+          <w:rFonts w:ascii="Times New Roman" w:hAnsi="Times New Roman" w:cs="Times New Roman" w:eastAsia="Times New Roman"/>
+          <w:sz w:val="24"/>
+          <w:szCs w:val="24"/>
+        </w:rPr>
+        <w:t xml:space="preserve">. We used DerSimonian-Laird random-effects meta-analysis </w:t>
+      </w:r>
+      <w:r>
+        <w:rPr>
+          <w:rFonts w:ascii="Times New Roman" w:hAnsi="Times New Roman" w:cs="Times New Roman" w:eastAsia="Times New Roman"/>
+          <w:sz w:val="24"/>
+          <w:szCs w:val="24"/>
+          <w:vertAlign w:val="superscript"/>
+        </w:rPr>
+        <w:t xml:space="preserve">[26]</w:t>
+      </w:r>
+      <w:r>
+        <w:rPr>
+          <w:rFonts w:ascii="Times New Roman" w:hAnsi="Times New Roman" w:cs="Times New Roman" w:eastAsia="Times New Roman"/>
+          <w:sz w:val="24"/>
+          <w:szCs w:val="24"/>
+        </w:rPr>
+        <w:t xml:space="preserve"> and computed 95% confidence intervals. OIS and TSA were calculated using standard formulas </w:t>
+      </w:r>
+      <w:r>
+        <w:rPr>
+          <w:rFonts w:ascii="Times New Roman" w:hAnsi="Times New Roman" w:cs="Times New Roman" w:eastAsia="Times New Roman"/>
+          <w:sz w:val="24"/>
+          <w:szCs w:val="24"/>
+          <w:vertAlign w:val="superscript"/>
+        </w:rPr>
+        <w:t xml:space="preserve">[6-9]</w:t>
+      </w:r>
+      <w:r>
+        <w:rPr>
+          <w:rFonts w:ascii="Times New Roman" w:hAnsi="Times New Roman" w:cs="Times New Roman" w:eastAsia="Times New Roman"/>
+          <w:sz w:val="24"/>
+          <w:szCs w:val="24"/>
+        </w:rPr>
+        <w:t xml:space="preserve">. All analyses were performed with the Python code in the public repository.</w:t>
       </w:r>
     </w:p>
     <w:p>
@@ -10033,7 +10314,75 @@
           <w:sz w:val="24"/>
           <w:szCs w:val="24"/>
         </w:rPr>
-        <w:t xml:space="preserve">Target trial emulation uses observational data to mimic a specific RCT in order to estimate a causal effect [27-28]. Module K is complementary: it does not estimate effects but quantifies the information lost due to enrollment decisions. Existing methods for combining RCT and observational evidence include hierarchical models, power priors, and meta-analytic-predictive priors [29-31]. Module T builds on these but embeds them in a broader workflow that first diagnoses the need for integration and then interprets the result through Module H. TSA and OIS are well established [6-9], but are not routinely used to quantify risk-profile shifts. GRADE provides domains for assessment [1]; KOTHA provides quantitative inputs to the imprecision and indirectness domains without changing GRADE’s structure.</w:t>
+        <w:t xml:space="preserve">Target trial emulation uses observational data to mimic a specific RCT in order to estimate a causal effect </w:t>
+      </w:r>
+      <w:r>
+        <w:rPr>
+          <w:rFonts w:ascii="Times New Roman" w:hAnsi="Times New Roman" w:cs="Times New Roman" w:eastAsia="Times New Roman"/>
+          <w:sz w:val="24"/>
+          <w:szCs w:val="24"/>
+          <w:vertAlign w:val="superscript"/>
+        </w:rPr>
+        <w:t xml:space="preserve">[27-28]</w:t>
+      </w:r>
+      <w:r>
+        <w:rPr>
+          <w:rFonts w:ascii="Times New Roman" w:hAnsi="Times New Roman" w:cs="Times New Roman" w:eastAsia="Times New Roman"/>
+          <w:sz w:val="24"/>
+          <w:szCs w:val="24"/>
+        </w:rPr>
+        <w:t xml:space="preserve">. Module K is complementary: it does not estimate effects but quantifies the information lost due to enrollment decisions. Existing methods for combining RCT and observational evidence include hierarchical models, power priors, and meta-analytic-predictive priors </w:t>
+      </w:r>
+      <w:r>
+        <w:rPr>
+          <w:rFonts w:ascii="Times New Roman" w:hAnsi="Times New Roman" w:cs="Times New Roman" w:eastAsia="Times New Roman"/>
+          <w:sz w:val="24"/>
+          <w:szCs w:val="24"/>
+          <w:vertAlign w:val="superscript"/>
+        </w:rPr>
+        <w:t xml:space="preserve">[29-31]</w:t>
+      </w:r>
+      <w:r>
+        <w:rPr>
+          <w:rFonts w:ascii="Times New Roman" w:hAnsi="Times New Roman" w:cs="Times New Roman" w:eastAsia="Times New Roman"/>
+          <w:sz w:val="24"/>
+          <w:szCs w:val="24"/>
+        </w:rPr>
+        <w:t xml:space="preserve">. Module T builds on these but embeds them in a broader workflow that first diagnoses the need for integration and then interprets the result through Module H. TSA and OIS are well established </w:t>
+      </w:r>
+      <w:r>
+        <w:rPr>
+          <w:rFonts w:ascii="Times New Roman" w:hAnsi="Times New Roman" w:cs="Times New Roman" w:eastAsia="Times New Roman"/>
+          <w:sz w:val="24"/>
+          <w:szCs w:val="24"/>
+          <w:vertAlign w:val="superscript"/>
+        </w:rPr>
+        <w:t xml:space="preserve">[6-9]</w:t>
+      </w:r>
+      <w:r>
+        <w:rPr>
+          <w:rFonts w:ascii="Times New Roman" w:hAnsi="Times New Roman" w:cs="Times New Roman" w:eastAsia="Times New Roman"/>
+          <w:sz w:val="24"/>
+          <w:szCs w:val="24"/>
+        </w:rPr>
+        <w:t xml:space="preserve">, but are not routinely used to quantify risk-profile shifts. GRADE provides domains for assessment </w:t>
+      </w:r>
+      <w:r>
+        <w:rPr>
+          <w:rFonts w:ascii="Times New Roman" w:hAnsi="Times New Roman" w:cs="Times New Roman" w:eastAsia="Times New Roman"/>
+          <w:sz w:val="24"/>
+          <w:szCs w:val="24"/>
+          <w:vertAlign w:val="superscript"/>
+        </w:rPr>
+        <w:t xml:space="preserve">[1]</w:t>
+      </w:r>
+      <w:r>
+        <w:rPr>
+          <w:rFonts w:ascii="Times New Roman" w:hAnsi="Times New Roman" w:cs="Times New Roman" w:eastAsia="Times New Roman"/>
+          <w:sz w:val="24"/>
+          <w:szCs w:val="24"/>
+        </w:rPr>
+        <w:t xml:space="preserve">; KOTHA provides quantitative inputs to the imprecision and indirectness domains without changing GRADE’s structure.</w:t>
       </w:r>
     </w:p>
     <w:p>
@@ -10061,7 +10410,24 @@
           <w:sz w:val="24"/>
           <w:szCs w:val="24"/>
         </w:rPr>
-        <w:t xml:space="preserve">The framework is reproducible from published aggregate data, follows the ADEMP reporting structure [10], and is illustrated with real, well-documented cases rather than synthetic examples. The modular design allows each component to be used independently.</w:t>
+        <w:t xml:space="preserve">The framework is reproducible from published aggregate data, follows the ADEMP reporting structure </w:t>
+      </w:r>
+      <w:r>
+        <w:rPr>
+          <w:rFonts w:ascii="Times New Roman" w:hAnsi="Times New Roman" w:cs="Times New Roman" w:eastAsia="Times New Roman"/>
+          <w:sz w:val="24"/>
+          <w:szCs w:val="24"/>
+          <w:vertAlign w:val="superscript"/>
+        </w:rPr>
+        <w:t xml:space="preserve">[10]</w:t>
+      </w:r>
+      <w:r>
+        <w:rPr>
+          <w:rFonts w:ascii="Times New Roman" w:hAnsi="Times New Roman" w:cs="Times New Roman" w:eastAsia="Times New Roman"/>
+          <w:sz w:val="24"/>
+          <w:szCs w:val="24"/>
+        </w:rPr>
+        <w:t xml:space="preserve">, and is illustrated with real, well-documented cases rather than synthetic examples. The modular design allows each component to be used independently.</w:t>
       </w:r>
     </w:p>
     <w:p xmlns:a="http://schemas.openxmlformats.org/drawingml/2006/main" xmlns:pic="http://schemas.openxmlformats.org/drawingml/2006/picture">

</xml_diff>

<commit_message>
Shorten abstract to <=250 words and refine OR/HR definitions
Co-Authored-By: Tatsuki Onishi <bougtoir@gmail.com>
</commit_message>
<xml_diff>
--- a/rct-decomposition/KOTHA_Framework_CCTC.docx
+++ b/rct-decomposition/KOTHA_Framework_CCTC.docx
@@ -236,7 +236,7 @@
           <w:sz w:val="24"/>
           <w:szCs w:val="24"/>
         </w:rPr>
-        <w:t xml:space="preserve">: KOTHA comprises three modules. Module K (Counterfactual Power Simulation) quantifies how enrollment-driven risk-profile shifts alter statistical power. Module T (Bayesian Evidence Integration) combines RCT and observational evidence using power-prior discounting. Module H (Guideline Interpreter) translates outputs into a structured GRADE-compatible assessment. We illustrated KOTHA using two cases of observational-RCT divergence: intravenous magnesium in acute myocardial infarction (12 trials, 1984-1995) and statins in heart failure (5 observational studies, 2 RCTs).</w:t>
+        <w:t xml:space="preserve">: KOTHA comprises three modules: Module K quantifies risk-profile shifts and power loss, Module T combines RCT and observational evidence with power-prior discounting, and Module H translates outputs into a GRADE-compatible assessment. We applied it to magnesium in acute myocardial infarction and statins in heart failure.</w:t>
       </w:r>
     </w:p>
     <w:p xmlns:a="http://schemas.openxmlformats.org/drawingml/2006/main" xmlns:pic="http://schemas.openxmlformats.org/drawingml/2006/picture">
@@ -260,7 +260,7 @@
           <w:sz w:val="24"/>
           <w:szCs w:val="24"/>
         </w:rPr>
-        <w:t xml:space="preserve">: In the magnesium case, control event rates fell from 8.9% to 7.2%; the pre-ISIS-4 pooled OR was 0.54 (95% CI: 0.40-0.75) and the all-trials estimate 0.56 (0.38-0.83) with</w:t>
+        <w:t xml:space="preserve">: In the magnesium case, control event rates fell from 8.9% to 7.2%; the pre-ISIS-4 pooled odds ratio (OR) was 0.54 (95% CI: 0.40-0.75) and the all-trials estimate 0.56 (0.38-0.83) with</w:t>
       </w:r>
       <w:r>
         <w:rPr>
@@ -298,7 +298,7 @@
           <w:sz w:val="24"/>
           <w:szCs w:val="24"/>
         </w:rPr>
-        <w:t xml:space="preserve">= 62%. In the statins case, observational HR was 0.72 (0.64-0.80) versus RCT HR 0.97 (0.90-1.05), with an RCT-to-observational event rate ratio of 0.53. Bayesian integration with moderate discounting (α = 0.3) yielded OR 0.74 (95% CrI: 0.25-1.43), P(OR &lt; 1) = 81% for magnesium, and HR 0.85 (0.55-1.24), P(HR &lt; 1) = 87% for statins.</w:t>
+        <w:t xml:space="preserve">= 62%. In the statins case, observational hazard ratio (HR) was 0.72 (0.64-0.80) versus RCT HR 0.97 (0.90-1.05), with an event-rate ratio of 0.53. Bayesian integration (α = 0.3) yielded OR 0.74 (CrI 0.25-1.43), P(OR &lt; 1) = 81% for magnesium, and HR 0.85 (0.55-1.24), P(HR &lt; 1) = 87% for statins.</w:t>
       </w:r>
     </w:p>
     <w:p xmlns:a="http://schemas.openxmlformats.org/drawingml/2006/main" xmlns:pic="http://schemas.openxmlformats.org/drawingml/2006/picture">

</xml_diff>

<commit_message>
Clinical Trials submission: reviewer-perspective fixes, title case, OBF boundary capping, data-traceable power simulation, supplementary figures pptx, and updated review
Co-Authored-By: Tatsuki Onishi <bougtoir@gmail.com>
</commit_message>
<xml_diff>
--- a/rct-decomposition/KOTHA_Framework_CCTC.docx
+++ b/rct-decomposition/KOTHA_Framework_CCTC.docx
@@ -27,7 +27,7 @@
           <w:i w:val="0"/>
           <w:sz w:val="28"/>
         </w:rPr>
-        <w:t>The KOTHA Framework: diagnosing structural information loss in randomized controlled trial meta-analyses to inform trial design</w:t>
+        <w:t>The KOTHA Framework: Diagnosing Structural Information Loss in Randomized Controlled Trial Meta-Analyses to Inform Trial Design</w:t>
       </w:r>
     </w:p>
     <w:p>
@@ -88,7 +88,7 @@
           <w:i w:val="0"/>
           <w:sz w:val="24"/>
         </w:rPr>
-        <w:t>Word count: 2437</w:t>
+        <w:t>Word count: 2682</w:t>
       </w:r>
     </w:p>
     <w:p>
@@ -204,7 +204,7 @@
           <w:sz w:val="24"/>
           <w:szCs w:val="24"/>
         </w:rPr>
-        <w:t xml:space="preserve">Background</w:t>
+        <w:t xml:space="preserve">Background/Aims</w:t>
       </w:r>
       <w:r>
         <w:rPr>
@@ -212,7 +212,7 @@
           <w:sz w:val="24"/>
           <w:szCs w:val="24"/>
         </w:rPr>
-        <w:t xml:space="preserve">: Evidence-based medicine ranks RCTs and meta-analyses highest, yet observational-RCT discordance is usually attributed to confounding. We highlight a structural explanation: trial enrollment progressively excludes higher-risk patients, diluting event rates and statistical information. The Knowledge-driven Observational-Trial Harmonization Approach (KOTHA) Framework diagnoses this structural information loss.</w:t>
+        <w:t xml:space="preserve">: Evidence-based medicine ranks RCTs and meta-analyses highest, yet observational-RCT discordance is usually attributed to confounding. We highlight a structural explanation: trial enrollment progressively excludes higher-risk patients, diluting event rates and statistical information. The Knowledge-driven Observational-Trial Harmonization Approach (KOTHA) Framework diagnoses this structural information loss. We aimed to develop and illustrate KOTHA so that trialists can distinguish structural information loss from residual confounding and inform sample size, eligibility, enrichment, and endpoint decisions in prospective trial design.</w:t>
       </w:r>
     </w:p>
     <w:p xmlns:a="http://schemas.openxmlformats.org/drawingml/2006/main" xmlns:pic="http://schemas.openxmlformats.org/drawingml/2006/picture">
@@ -298,7 +298,7 @@
           <w:sz w:val="24"/>
           <w:szCs w:val="24"/>
         </w:rPr>
-        <w:t xml:space="preserve">= 62%. In the statins case, observational hazard ratio (HR) was 0.72 (0.64-0.80) versus RCT HR 0.97 (0.90-1.05), with an event-rate ratio of 0.53. Bayesian integration (α = 0.3) yielded OR 0.74 (CrI 0.25-1.43), P(OR &lt; 1) = 81% for magnesium, and HR 0.85 (0.55-1.24), P(HR &lt; 1) = 87% for statins.</w:t>
+        <w:t xml:space="preserve">= 62%. In the statins case, observational hazard ratio (HR) was 0.72 (0.64-0.80) versus RCT HR 0.97 (0.90-1.05), with an event-rate ratio of 0.51. Bayesian integration (α = 0.3) yielded OR 0.74 (CrI 0.25-1.43), P(OR &lt; 1) = 80.7% for magnesium and HR 0.85 (0.55-1.24), P(HR &lt; 1) = 86.5% for statins; both probabilities remained below conventional decision thresholds, leaving conclusions uncertain.</w:t>
       </w:r>
     </w:p>
     <w:p xmlns:a="http://schemas.openxmlformats.org/drawingml/2006/main" xmlns:pic="http://schemas.openxmlformats.org/drawingml/2006/picture">
@@ -1267,7 +1267,7 @@
           <w:sz w:val="24"/>
           <w:szCs w:val="24"/>
         </w:rPr>
-        <w:t xml:space="preserve">A number of trial design strategies can mitigate event dilution (Table 1), including stratified randomization, prognostic enrichment, event-driven designs, adaptive sample-size re-estimation, and pragmatic or registry-based trials. Yet no existing framework integrates prospective power assessment, retrospective diagnostic evaluation, and structured evidence interpretation for completed or planned RCTs.</w:t>
+        <w:t xml:space="preserve">A number of trial design strategies can mitigate event dilution (Table 1), including stratified randomization, prognostic enrichment, event-driven designs, adaptive sample-size re-estimation, and pragmatic or registry-based trials. Existing approaches address these issues separately; to our knowledge, no widely adopted framework tightly links prospective power assessment, retrospective diagnostic evaluation, and structured evidence interpretation in a single reproducible workflow for completed or planned RCTs.</w:t>
       </w:r>
     </w:p>
     <w:p xmlns:a="http://schemas.openxmlformats.org/drawingml/2006/main" xmlns:pic="http://schemas.openxmlformats.org/drawingml/2006/picture">
@@ -1791,7 +1791,7 @@
           <w:sz w:val="24"/>
           <w:szCs w:val="24"/>
         </w:rPr>
-        <w:t xml:space="preserve">.</w:t>
+        <w:t xml:space="preserve">: aims (quantify information loss from enrollment-driven risk-profile shifts), data-generating process (published aggregate event counts and sample sizes), estimands (counterfactual power under S1-S3), methods (Schoenfeld approximation with proportional-hazards data handled via the log-HR/log-OR equivalence under rare events), and performance measures (power across a grid of true effects and required sample size).</w:t>
       </w:r>
     </w:p>
     <w:p xmlns:a="http://schemas.openxmlformats.org/drawingml/2006/main" xmlns:pic="http://schemas.openxmlformats.org/drawingml/2006/picture">
@@ -2167,7 +2167,7 @@
           <w:sz w:val="24"/>
           <w:szCs w:val="24"/>
         </w:rPr>
-        <w:t xml:space="preserve">, the standard error of the log-OR is approximately</w:t>
+        <w:t xml:space="preserve">, the standard error of the log relative effect (log-OR or log-HR under proportional hazards) is approximately</w:t>
       </w:r>
     </w:p>
     <w:p xmlns:a="http://schemas.openxmlformats.org/drawingml/2006/main" xmlns:pic="http://schemas.openxmlformats.org/drawingml/2006/picture">
@@ -2232,7 +2232,7 @@
                           <m:nor/>
                           <m:sty m:val="p"/>
                         </m:rPr>
-                        <m:t>OR</m:t>
+                        <m:t>OR or HR</m:t>
                       </m:r>
                     </m:e>
                   </m:d>
@@ -2437,7 +2437,7 @@
           <w:sz w:val="24"/>
           <w:szCs w:val="24"/>
         </w:rPr>
-        <w:t xml:space="preserve">quantifies event dilution. Module K reports power across a grid of assumed true effects and computes the sample size required to reach 80% power under each scenario. For the statins case, which reports hazard ratios, the hazard ratio is approximated by an odds ratio under the rare-event assumption and published annual mortality rates are used as approximate event probabilities; this comparison is intended to illustrate the relative power loss across enrollment scenarios rather than to provide exact sample-size estimates for a specific follow-up duration.</w:t>
+        <w:t xml:space="preserve">quantifies event dilution. Module K reports power across a grid of assumed true effects and computes the sample size required to reach 80% power under each scenario. For the statins case, which reports hazard ratios, the hazard ratio is approximated by an odds ratio under the rare-event assumption and crude control event proportions derived from the aggregate data are used as approximate event probabilities; this comparison is intended to illustrate the relative power loss across enrollment scenarios rather than to provide exact sample-size estimates for a specific follow-up duration.</w:t>
       </w:r>
     </w:p>
     <w:p>
@@ -2755,6 +2755,241 @@
           </m:e>
         </m:d>
       </m:oMath>
+      <w:r>
+        <w:rPr>
+          <w:rFonts w:ascii="Times New Roman" w:hAnsi="Times New Roman" w:cs="Times New Roman" w:eastAsia="Times New Roman"/>
+          <w:sz w:val="24"/>
+          <w:szCs w:val="24"/>
+        </w:rPr>
+        <w:t xml:space="preserve">. We used weakly informative priors</w:t>
+      </w:r>
+      <w:r>
+        <w:rPr>
+          <w:rFonts w:ascii="Times New Roman" w:hAnsi="Times New Roman" w:cs="Times New Roman" w:eastAsia="Times New Roman"/>
+          <w:sz w:val="24"/>
+          <w:szCs w:val="24"/>
+        </w:rPr>
+        <w:t xml:space="preserve"> </w:t>
+      </w:r>
+      <m:oMath>
+        <m:r>
+          <m:t>μ</m:t>
+        </m:r>
+        <m:r>
+          <m:rPr>
+            <m:sty m:val="p"/>
+          </m:rPr>
+          <m:t>∼</m:t>
+        </m:r>
+        <m:r>
+          <m:t>N</m:t>
+        </m:r>
+        <m:d>
+          <m:dPr>
+            <m:begChr m:val="("/>
+            <m:endChr m:val=")"/>
+            <m:sepChr m:val=""/>
+            <m:grow/>
+          </m:dPr>
+          <m:e>
+            <m:r>
+              <m:t>0</m:t>
+            </m:r>
+            <m:r>
+              <m:rPr>
+                <m:sty m:val="p"/>
+              </m:rPr>
+              <m:t>,</m:t>
+            </m:r>
+            <m:sSup>
+              <m:e>
+                <m:r>
+                  <m:t>10</m:t>
+                </m:r>
+              </m:e>
+              <m:sup>
+                <m:r>
+                  <m:t>2</m:t>
+                </m:r>
+              </m:sup>
+            </m:sSup>
+          </m:e>
+        </m:d>
+      </m:oMath>
+      <w:r>
+        <w:rPr>
+          <w:rFonts w:ascii="Times New Roman" w:hAnsi="Times New Roman" w:cs="Times New Roman" w:eastAsia="Times New Roman"/>
+          <w:sz w:val="24"/>
+          <w:szCs w:val="24"/>
+        </w:rPr>
+        <w:t xml:space="preserve"> </w:t>
+      </w:r>
+      <w:r>
+        <w:rPr>
+          <w:rFonts w:ascii="Times New Roman" w:hAnsi="Times New Roman" w:cs="Times New Roman" w:eastAsia="Times New Roman"/>
+          <w:sz w:val="24"/>
+          <w:szCs w:val="24"/>
+        </w:rPr>
+        <w:t xml:space="preserve">on the population mean log effect and</w:t>
+      </w:r>
+      <w:r>
+        <w:rPr>
+          <w:rFonts w:ascii="Times New Roman" w:hAnsi="Times New Roman" w:cs="Times New Roman" w:eastAsia="Times New Roman"/>
+          <w:sz w:val="24"/>
+          <w:szCs w:val="24"/>
+        </w:rPr>
+        <w:t xml:space="preserve"> </w:t>
+      </w:r>
+      <m:oMath>
+        <m:r>
+          <m:t>τ</m:t>
+        </m:r>
+        <m:r>
+          <m:rPr>
+            <m:sty m:val="p"/>
+          </m:rPr>
+          <m:t>∼</m:t>
+        </m:r>
+        <m:r>
+          <m:rPr>
+            <m:nor/>
+            <m:sty m:val="p"/>
+          </m:rPr>
+          <m:t>Half-Cauchy</m:t>
+        </m:r>
+        <m:d>
+          <m:dPr>
+            <m:begChr m:val="("/>
+            <m:endChr m:val=")"/>
+            <m:sepChr m:val=""/>
+            <m:grow/>
+          </m:dPr>
+          <m:e>
+            <m:r>
+              <m:t>0</m:t>
+            </m:r>
+            <m:r>
+              <m:rPr>
+                <m:sty m:val="p"/>
+              </m:rPr>
+              <m:t>,</m:t>
+            </m:r>
+            <m:r>
+              <m:t>0.5</m:t>
+            </m:r>
+          </m:e>
+        </m:d>
+      </m:oMath>
+      <w:r>
+        <w:rPr>
+          <w:rFonts w:ascii="Times New Roman" w:hAnsi="Times New Roman" w:cs="Times New Roman" w:eastAsia="Times New Roman"/>
+          <w:sz w:val="24"/>
+          <w:szCs w:val="24"/>
+        </w:rPr>
+        <w:t xml:space="preserve"> </w:t>
+      </w:r>
+      <w:r>
+        <w:rPr>
+          <w:rFonts w:ascii="Times New Roman" w:hAnsi="Times New Roman" w:cs="Times New Roman" w:eastAsia="Times New Roman"/>
+          <w:sz w:val="24"/>
+          <w:szCs w:val="24"/>
+        </w:rPr>
+        <w:t xml:space="preserve">on the between-study standard deviation, with</w:t>
+      </w:r>
+      <w:r>
+        <w:rPr>
+          <w:rFonts w:ascii="Times New Roman" w:hAnsi="Times New Roman" w:cs="Times New Roman" w:eastAsia="Times New Roman"/>
+          <w:sz w:val="24"/>
+          <w:szCs w:val="24"/>
+        </w:rPr>
+        <w:t xml:space="preserve"> </w:t>
+      </w:r>
+      <m:oMath>
+        <m:r>
+          <m:t>τ</m:t>
+        </m:r>
+      </m:oMath>
+      <w:r>
+        <w:rPr>
+          <w:rFonts w:ascii="Times New Roman" w:hAnsi="Times New Roman" w:cs="Times New Roman" w:eastAsia="Times New Roman"/>
+          <w:sz w:val="24"/>
+          <w:szCs w:val="24"/>
+        </w:rPr>
+        <w:t xml:space="preserve"> </w:t>
+      </w:r>
+      <w:r>
+        <w:rPr>
+          <w:rFonts w:ascii="Times New Roman" w:hAnsi="Times New Roman" w:cs="Times New Roman" w:eastAsia="Times New Roman"/>
+          <w:sz w:val="24"/>
+          <w:szCs w:val="24"/>
+        </w:rPr>
+        <w:t xml:space="preserve">bounded between</w:t>
+      </w:r>
+      <w:r>
+        <w:rPr>
+          <w:rFonts w:ascii="Times New Roman" w:hAnsi="Times New Roman" w:cs="Times New Roman" w:eastAsia="Times New Roman"/>
+          <w:sz w:val="24"/>
+          <w:szCs w:val="24"/>
+        </w:rPr>
+        <w:t xml:space="preserve"> </w:t>
+      </w:r>
+      <m:oMath>
+        <m:sSup>
+          <m:e>
+            <m:r>
+              <m:t>10</m:t>
+            </m:r>
+          </m:e>
+          <m:sup>
+            <m:r>
+              <m:rPr>
+                <m:sty m:val="p"/>
+              </m:rPr>
+              <m:t>−</m:t>
+            </m:r>
+            <m:r>
+              <m:t>9</m:t>
+            </m:r>
+          </m:sup>
+        </m:sSup>
+      </m:oMath>
+      <w:r>
+        <w:rPr>
+          <w:rFonts w:ascii="Times New Roman" w:hAnsi="Times New Roman" w:cs="Times New Roman" w:eastAsia="Times New Roman"/>
+          <w:sz w:val="24"/>
+          <w:szCs w:val="24"/>
+        </w:rPr>
+        <w:t xml:space="preserve"> </w:t>
+      </w:r>
+      <w:r>
+        <w:rPr>
+          <w:rFonts w:ascii="Times New Roman" w:hAnsi="Times New Roman" w:cs="Times New Roman" w:eastAsia="Times New Roman"/>
+          <w:sz w:val="24"/>
+          <w:szCs w:val="24"/>
+        </w:rPr>
+        <w:t xml:space="preserve">and</w:t>
+      </w:r>
+      <w:r>
+        <w:rPr>
+          <w:rFonts w:ascii="Times New Roman" w:hAnsi="Times New Roman" w:cs="Times New Roman" w:eastAsia="Times New Roman"/>
+          <w:sz w:val="24"/>
+          <w:szCs w:val="24"/>
+        </w:rPr>
+        <w:t xml:space="preserve"> </w:t>
+      </w:r>
+      <m:oMath>
+        <m:r>
+          <m:t>100</m:t>
+        </m:r>
+      </m:oMath>
+      <w:r>
+        <w:rPr>
+          <w:rFonts w:ascii="Times New Roman" w:hAnsi="Times New Roman" w:cs="Times New Roman" w:eastAsia="Times New Roman"/>
+          <w:sz w:val="24"/>
+          <w:szCs w:val="24"/>
+        </w:rPr>
+        <w:t xml:space="preserve"> </w:t>
+      </w:r>
       <w:r>
         <w:rPr>
           <w:rFonts w:ascii="Times New Roman" w:hAnsi="Times New Roman" w:cs="Times New Roman" w:eastAsia="Times New Roman"/>
@@ -2921,7 +3156,7 @@
           <w:sz w:val="24"/>
           <w:szCs w:val="24"/>
         </w:rPr>
-        <w:t xml:space="preserve">. Alternative effect measures such as restricted mean survival time can be substituted when proportional-hazards assumptions are questionable </w:t>
+        <w:t xml:space="preserve">for numerical stability. Alternative effect measures such as restricted mean survival time can be substituted when proportional-hazards assumptions are questionable </w:t>
       </w:r>
       <w:r>
         <w:rPr>
@@ -3820,7 +4055,7 @@
           <w:sz w:val="24"/>
           <w:szCs w:val="24"/>
         </w:rPr>
-        <w:t xml:space="preserve">Study-level data are provided in Supplementary Table S1 (magnesium in AMI) and Supplementary Table S2 (statins in HF). In the magnesium case, control-group mortality fell from a pre-thrombolysis weighted mean of 8.9% to 7.2% in ISIS-4, an event rate ratio of 0.82 (Fig. 2). In the statins case, the RCT-to-observational event rate ratio was 0.53, indicating that the RCT populations had roughly half the mortality event rate of the observational cohorts.</w:t>
+        <w:t xml:space="preserve">Study-level data are provided in Supplementary Table S1 (magnesium in AMI) and Supplementary Table S2 (statins in HF). In the magnesium case, control-group mortality fell from a pre-thrombolysis weighted mean of 8.9% to 7.2% in ISIS-4, an event rate ratio of 0.82 (Fig. 2). In the statins case, the RCT-to-observational event rate ratio was 0.51, indicating that the RCT populations had roughly half the mortality event rate of the observational cohorts.</w:t>
       </w:r>
     </w:p>
     <w:p>
@@ -3907,7 +4142,7 @@
           <w:sz w:val="24"/>
           <w:szCs w:val="24"/>
         </w:rPr>
-        <w:t xml:space="preserve">At the ISIS-4 sample size (N = 58,050) and the pre-ISIS-4 pooled effect (OR = 0.54), power exceeded 99% under all three event-rate scenarios. For a more modest effect (OR = 0.90), however, power was 95.8% under the pre-thrombolysis rate and 91.5% under the ISIS-4 rate (Fig. 3A). For statins, power to detect the observational effect (HR = 0.72) was 100.0% under the observational event rate and 99.1% under the RCT event rate; for a more modest effect (HR = 0.85), power fell from 84.6% to 58.3%—a 26 percentage-point reduction attributable to event dilution (Fig. 3B).</w:t>
+        <w:t xml:space="preserve">At the ISIS-4 sample size (N = 58,050) and the pre-ISIS-4 pooled effect (OR = 0.54), power exceeded 99% under all three event-rate scenarios. For a more modest effect (OR = 0.90), however, power was 95.8% under the pre-thrombolysis rate and 91.5% under the ISIS-4 rate (Fig. 3A). For statins, power to detect the observational effect (HR = 0.72) was 100.0% under the observational event rate and 100.0% under the RCT event rate; for a more modest effect (HR = 0.85), power fell from 98.4% to 83.2%—a 15 percentage-point reduction attributable to event dilution (Fig. 3B).</w:t>
       </w:r>
     </w:p>
     <w:p>
@@ -4099,7 +4334,38 @@
           <w:sz w:val="24"/>
           <w:szCs w:val="24"/>
         </w:rPr>
-        <w:t xml:space="preserve">of 0.80, below the conventional boundary of 1.96; under a random-effects accumulation the final</w:t>
+        <w:t xml:space="preserve">of 0.80, which did not cross the conventional two-sided boundary for benefit or harm (</w:t>
+      </w:r>
+      <m:oMath>
+        <m:d>
+          <m:dPr>
+            <m:begChr m:val="|"/>
+            <m:endChr m:val="|"/>
+            <m:sepChr m:val=""/>
+            <m:grow/>
+          </m:dPr>
+          <m:e>
+            <m:r>
+              <m:t>Z</m:t>
+            </m:r>
+          </m:e>
+        </m:d>
+      </m:oMath>
+      <w:r>
+        <w:rPr>
+          <w:rFonts w:ascii="Times New Roman" w:hAnsi="Times New Roman" w:cs="Times New Roman" w:eastAsia="Times New Roman"/>
+          <w:sz w:val="24"/>
+          <w:szCs w:val="24"/>
+        </w:rPr>
+        <w:t xml:space="preserve"> </w:t>
+      </w:r>
+      <w:r>
+        <w:rPr>
+          <w:rFonts w:ascii="Times New Roman" w:hAnsi="Times New Roman" w:cs="Times New Roman" w:eastAsia="Times New Roman"/>
+          <w:sz w:val="24"/>
+          <w:szCs w:val="24"/>
+        </w:rPr>
+        <w:t xml:space="preserve">= 1.96); under a random-effects accumulation the final</w:t>
       </w:r>
       <w:r>
         <w:rPr>
@@ -4128,7 +4394,7 @@
           <w:sz w:val="24"/>
           <w:szCs w:val="24"/>
         </w:rPr>
-        <w:t xml:space="preserve">was -2.90, crossing the O’Brien-Fleming boundary of 0.27 (Fig. 5). This divergence reflects era-dependent treatment-effect heterogeneity driven by the ISIS-4 result.</w:t>
+        <w:t xml:space="preserve">was -2.90, crossing the lower O’Brien-Fleming boundary of -1.96 (which, because the cumulative information exceeded the optimal information size, equals the conventional two-sided boundary) (Fig. 5). This divergence reflects era-dependent treatment-effect heterogeneity driven by the ISIS-4 result.</w:t>
       </w:r>
     </w:p>
     <w:p xmlns:a="http://schemas.openxmlformats.org/drawingml/2006/main" xmlns:pic="http://schemas.openxmlformats.org/drawingml/2006/picture">
@@ -4422,7 +4688,7 @@
           <w:sz w:val="24"/>
           <w:szCs w:val="24"/>
         </w:rPr>
-        <w:t xml:space="preserve">= 0.3 the posterior shifted to OR = 0.74 (95% CrI: 0.25-1.43), with 81% probability of benefit (Fig. 6A). For statins, with</w:t>
+        <w:t xml:space="preserve">= 0.3 the posterior shifted to OR = 0.74 (95% CrI: 0.25-1.43), with 80.7% probability of benefit (Fig. 6A). For statins, with</w:t>
       </w:r>
       <w:r>
         <w:rPr>
@@ -6343,7 +6609,7 @@
           <w:sz w:val="24"/>
           <w:szCs w:val="24"/>
         </w:rPr>
-        <w:t xml:space="preserve">was -0.74, the efficacy boundary was not crossed, and the event rate ratio was 0.53; the appropriate classification is</w:t>
+        <w:t xml:space="preserve">was -0.74, the efficacy boundary was not crossed, and the event rate ratio was 0.51; the appropriate classification is</w:t>
       </w:r>
       <w:r>
         <w:rPr>
@@ -6945,7 +7211,7 @@
                 <w:sz w:val="20"/>
                 <w:szCs w:val="20"/>
               </w:rPr>
-              <w:t xml:space="preserve">Serious: event rate decreased by 47%</w:t>
+              <w:t xml:space="preserve">Serious: event rate decreased by 49%</w:t>
             </w:r>
           </w:p>
         </w:tc>
@@ -7419,7 +7685,7 @@
           <w:sz w:val="24"/>
           <w:szCs w:val="24"/>
         </w:rPr>
-        <w:t xml:space="preserve">= 62%) than by simple underpowering. In the statins case, Module K showed that RCT populations had roughly half the event rate of observational cohorts, and that power for a modest effect (HR = 0.85) dropped from 85% to 58%. Module T demonstrated that even modest borrowing from observational evidence shifted posterior probabilities of benefit substantially, but uncertainty remained. Module H classified magnesium as inconclusive with serious inconsistency (heterogeneity), and statins as inconclusive with serious indirectness, rather than</w:t>
+        <w:t xml:space="preserve">= 62%) than by simple underpowering. In the statins case, Module K showed that RCT populations had roughly half the event rate of observational cohorts, and that power for a modest effect (HR = 0.85) dropped from 98% to 83%. Module T demonstrated that even modest borrowing from observational evidence shifted posterior probabilities of benefit substantially, but uncertainty remained. Module H classified magnesium as inconclusive with serious inconsistency (heterogeneity), and statins as inconclusive with serious indirectness, rather than</w:t>
       </w:r>
       <w:r>
         <w:rPr>
@@ -7824,7 +8090,105 @@
           <w:sz w:val="24"/>
           <w:szCs w:val="24"/>
         </w:rPr>
-        <w:t xml:space="preserve">Limitations should be acknowledged. The cases are retrospective applications of the framework to published aggregate data; individual patient data would strengthen risk-profile stratification and adjustment for confounders, and ecological bias may affect the representativeness assessment. Prospective validation against trials whose results are not yet known would be stronger. Module T treats the discounting parameter</w:t>
+        <w:t xml:space="preserve">Limitations should be acknowledged:</w:t>
+      </w:r>
+    </w:p>
+    <w:p xmlns:a="http://schemas.openxmlformats.org/drawingml/2006/main" xmlns:pic="http://schemas.openxmlformats.org/drawingml/2006/picture">
+      <w:pPr>
+        <w:pStyle w:val="List Bullet"/>
+        <w:spacing w:line="480" w:lineRule="auto" w:after="120"/>
+      </w:pPr>
+      <w:r>
+        <w:rPr>
+          <w:rFonts w:ascii="Times New Roman" w:hAnsi="Times New Roman" w:cs="Times New Roman" w:eastAsia="Times New Roman"/>
+          <w:sz w:val="24"/>
+          <w:szCs w:val="24"/>
+        </w:rPr>
+        <w:t xml:space="preserve">The cases are retrospective applications of the framework to published aggregate data; individual patient data would strengthen risk-profile stratification and adjustment for confounders, and ecological bias may affect the representativeness assessment.</w:t>
+      </w:r>
+    </w:p>
+    <w:p xmlns:a="http://schemas.openxmlformats.org/drawingml/2006/main" xmlns:pic="http://schemas.openxmlformats.org/drawingml/2006/picture">
+      <w:pPr>
+        <w:pStyle w:val="List Bullet"/>
+        <w:spacing w:line="480" w:lineRule="auto" w:after="120"/>
+      </w:pPr>
+      <w:r>
+        <w:rPr>
+          <w:rFonts w:ascii="Times New Roman" w:hAnsi="Times New Roman" w:cs="Times New Roman" w:eastAsia="Times New Roman"/>
+          <w:sz w:val="24"/>
+          <w:szCs w:val="24"/>
+        </w:rPr>
+        <w:t xml:space="preserve">For statins, the observational and RCT crude event proportions are aggregate study-level values, so the comparison is ecological and may not reflect within-individual risk differences.</w:t>
+      </w:r>
+    </w:p>
+    <w:p xmlns:a="http://schemas.openxmlformats.org/drawingml/2006/main" xmlns:pic="http://schemas.openxmlformats.org/drawingml/2006/picture">
+      <w:pPr>
+        <w:pStyle w:val="List Bullet"/>
+        <w:spacing w:line="480" w:lineRule="auto" w:after="120"/>
+      </w:pPr>
+      <w:r>
+        <w:rPr>
+          <w:rFonts w:ascii="Times New Roman" w:hAnsi="Times New Roman" w:cs="Times New Roman" w:eastAsia="Times New Roman"/>
+          <w:sz w:val="24"/>
+          <w:szCs w:val="24"/>
+        </w:rPr>
+        <w:t xml:space="preserve">The hazard-ratio-to-odds-ratio approximation and the use of a crude event proportion (rather than an event rate per person-time) mean Module K estimates relative power loss across enrollment scenarios, not a definitive sample size for a specific follow-up.</w:t>
+      </w:r>
+    </w:p>
+    <w:p xmlns:a="http://schemas.openxmlformats.org/drawingml/2006/main" xmlns:pic="http://schemas.openxmlformats.org/drawingml/2006/picture">
+      <w:pPr>
+        <w:pStyle w:val="List Bullet"/>
+        <w:spacing w:line="480" w:lineRule="auto" w:after="120"/>
+      </w:pPr>
+      <w:r>
+        <w:rPr>
+          <w:rFonts w:ascii="Times New Roman" w:hAnsi="Times New Roman" w:cs="Times New Roman" w:eastAsia="Times New Roman"/>
+          <w:sz w:val="24"/>
+          <w:szCs w:val="24"/>
+        </w:rPr>
+        <w:t xml:space="preserve">For statins, the S3 enrichment target is set at the midpoint between the observational and RCT crude proportions as an illustration; other thresholds would yield different power curves.</w:t>
+      </w:r>
+    </w:p>
+    <w:p xmlns:a="http://schemas.openxmlformats.org/drawingml/2006/main" xmlns:pic="http://schemas.openxmlformats.org/drawingml/2006/picture">
+      <w:pPr>
+        <w:pStyle w:val="List Bullet"/>
+        <w:spacing w:line="480" w:lineRule="auto" w:after="120"/>
+      </w:pPr>
+      <w:r>
+        <w:rPr>
+          <w:rFonts w:ascii="Times New Roman" w:hAnsi="Times New Roman" w:cs="Times New Roman" w:eastAsia="Times New Roman"/>
+          <w:sz w:val="24"/>
+          <w:szCs w:val="24"/>
+        </w:rPr>
+        <w:t xml:space="preserve">The magnesium case spans the pre-thrombolysis and thrombolysis eras, so temporal changes in standard care, case mix, and outcome ascertainment create treatment-era confounding that cannot be fully controlled with aggregate data.</w:t>
+      </w:r>
+    </w:p>
+    <w:p xmlns:a="http://schemas.openxmlformats.org/drawingml/2006/main" xmlns:pic="http://schemas.openxmlformats.org/drawingml/2006/picture">
+      <w:pPr>
+        <w:pStyle w:val="List Bullet"/>
+        <w:spacing w:line="480" w:lineRule="auto" w:after="120"/>
+      </w:pPr>
+      <w:r>
+        <w:rPr>
+          <w:rFonts w:ascii="Times New Roman" w:hAnsi="Times New Roman" w:cs="Times New Roman" w:eastAsia="Times New Roman"/>
+          <w:sz w:val="24"/>
+          <w:szCs w:val="24"/>
+        </w:rPr>
+        <w:t xml:space="preserve">Prospective validation against trials whose results are not yet known would be stronger.</w:t>
+      </w:r>
+    </w:p>
+    <w:p xmlns:a="http://schemas.openxmlformats.org/drawingml/2006/main" xmlns:pic="http://schemas.openxmlformats.org/drawingml/2006/picture">
+      <w:pPr>
+        <w:pStyle w:val="List Bullet"/>
+        <w:spacing w:line="480" w:lineRule="auto" w:after="120"/>
+      </w:pPr>
+      <w:r>
+        <w:rPr>
+          <w:rFonts w:ascii="Times New Roman" w:hAnsi="Times New Roman" w:cs="Times New Roman" w:eastAsia="Times New Roman"/>
+          <w:sz w:val="24"/>
+          <w:szCs w:val="24"/>
+        </w:rPr>
+        <w:t xml:space="preserve">Module T treats the discounting parameter</w:t>
       </w:r>
       <w:r>
         <w:rPr>
@@ -7874,7 +8238,35 @@
           <w:sz w:val="24"/>
           <w:szCs w:val="24"/>
         </w:rPr>
-        <w:t xml:space="preserve">. The magnesium case involves genuine treatment-effect heterogeneity across thrombolysis eras, which Module K identifies but cannot fully explain. Finally, adoption by guideline groups will require institutional change beyond the method itself.</w:t>
+        <w:t xml:space="preserve">.</w:t>
+      </w:r>
+    </w:p>
+    <w:p xmlns:a="http://schemas.openxmlformats.org/drawingml/2006/main" xmlns:pic="http://schemas.openxmlformats.org/drawingml/2006/picture">
+      <w:pPr>
+        <w:pStyle w:val="List Bullet"/>
+        <w:spacing w:line="480" w:lineRule="auto" w:after="120"/>
+      </w:pPr>
+      <w:r>
+        <w:rPr>
+          <w:rFonts w:ascii="Times New Roman" w:hAnsi="Times New Roman" w:cs="Times New Roman" w:eastAsia="Times New Roman"/>
+          <w:sz w:val="24"/>
+          <w:szCs w:val="24"/>
+        </w:rPr>
+        <w:t xml:space="preserve">The magnesium case involves genuine treatment-effect heterogeneity across thrombolysis eras, which Module K identifies but cannot fully explain.</w:t>
+      </w:r>
+    </w:p>
+    <w:p xmlns:a="http://schemas.openxmlformats.org/drawingml/2006/main" xmlns:pic="http://schemas.openxmlformats.org/drawingml/2006/picture">
+      <w:pPr>
+        <w:pStyle w:val="List Bullet"/>
+        <w:spacing w:line="480" w:lineRule="auto" w:after="120"/>
+      </w:pPr>
+      <w:r>
+        <w:rPr>
+          <w:rFonts w:ascii="Times New Roman" w:hAnsi="Times New Roman" w:cs="Times New Roman" w:eastAsia="Times New Roman"/>
+          <w:sz w:val="24"/>
+          <w:szCs w:val="24"/>
+        </w:rPr>
+        <w:t xml:space="preserve">Finally, adoption by guideline groups will require institutional change beyond the method itself.</w:t>
       </w:r>
     </w:p>
     <w:p>
@@ -7902,7 +8294,7 @@
           <w:sz w:val="24"/>
           <w:szCs w:val="24"/>
         </w:rPr>
-        <w:t xml:space="preserve">The KOTHA Framework (Knowledge-driven Observational-Trial Harmonization Approach) addresses structural information loss in RCT meta-analyses through counterfactual power simulation, hierarchical Bayesian evidence integration, and structured GRADE-compatible interpretation. Empirical application to magnesium in AMI and statins in heart failure demonstrates that the framework can identify enrollment-driven event dilution, quantify its impact on statistical power, and produce more nuanced evidence assessments than standard approaches.</w:t>
+        <w:t xml:space="preserve">The KOTHA Framework (Knowledge-driven Observational-Trial Harmonization Approach) addresses structural information loss in RCT meta-analyses through counterfactual power simulation, hierarchical Bayesian evidence integration, and structured GRADE-compatible interpretation. Empirical application to magnesium in AMI and statins in heart failure demonstrates that the framework can identify enrollment-driven event dilution, quantify its impact on statistical power, and produce more nuanced evidence assessments than standard approaches. By translating these diagnostics into prespecified sample size, eligibility, enrichment, and endpoint decisions, KOTHA offers a reproducible design aid for future clinical trials.</w:t>
       </w:r>
     </w:p>
     <w:p>
@@ -8056,7 +8448,7 @@
           <w:sz w:val="24"/>
           <w:szCs w:val="24"/>
         </w:rPr>
-        <w:t xml:space="preserve">The authors declare that they have no competing interests.</w:t>
+        <w:t xml:space="preserve">[To be determined]</w:t>
       </w:r>
     </w:p>
     <w:p>
@@ -8163,7 +8555,7 @@
           <w:rFonts w:ascii="Times New Roman" w:hAnsi="Times New Roman"/>
           <w:sz w:val="20"/>
         </w:rPr>
-        <w:t>1. Guyatt GH, Oxman AD, Vist GE, Kunz R, Falck-Ytter Y, Alonso-Coello P, et al. GRADE: an emerging consensus on rating quality of evidence and strength of recommendations. BMJ. 2008;336(7650):924-6.</w:t>
+        <w:t>1. Guyatt GH, Oxman AD, Vist GE, et al. GRADE: an emerging consensus on rating quality of evidence and strength of recommendations. BMJ 2008; 336(7650): 924-6.</w:t>
       </w:r>
     </w:p>
     <w:p>
@@ -8172,7 +8564,7 @@
           <w:rFonts w:ascii="Times New Roman" w:hAnsi="Times New Roman"/>
           <w:sz w:val="20"/>
         </w:rPr>
-        <w:t>2. Concato J, Shah N, Horwitz RI. Randomized, controlled trials, observational studies, and the hierarchy of research designs. N. Engl. J. Med. 2000;342(25):1887-92.</w:t>
+        <w:t>2. Concato J, Shah N and Horwitz RI. Randomized, controlled trials, observational studies, and the hierarchy of research designs. N Engl J Med 2000; 342(25): 1887-92.</w:t>
       </w:r>
     </w:p>
     <w:p>
@@ -8181,7 +8573,7 @@
           <w:rFonts w:ascii="Times New Roman" w:hAnsi="Times New Roman"/>
           <w:sz w:val="20"/>
         </w:rPr>
-        <w:t>3. Anglemyer A, Horvath HT, Bero L. Healthcare outcomes assessed with observational study designs compared with those assessed in randomized trials. Cochrane Database Syst. Rev. 2014;(4):MR000034.</w:t>
+        <w:t>3. Anglemyer A, Horvath HT and Bero L. Healthcare outcomes assessed with observational study designs compared with those assessed in randomized trials. Cochrane Database Syst Rev 2014; (4): MR000034.</w:t>
       </w:r>
     </w:p>
     <w:p>
@@ -8190,7 +8582,7 @@
           <w:rFonts w:ascii="Times New Roman" w:hAnsi="Times New Roman"/>
           <w:sz w:val="20"/>
         </w:rPr>
-        <w:t>4. Kennedy-Martin T, Curtis S, Faries D, Robinson S, Johnston J. A literature review on the representativeness of randomized controlled trial samples and implications for the external validity of trial results. Trials. 2015;16:495.</w:t>
+        <w:t>4. Kennedy-Martin T, Curtis S, Faries D, et al. A literature review on the representativeness of randomized controlled trial samples and implications for the external validity of trial results. Trials 2015; 16: 495.</w:t>
       </w:r>
     </w:p>
     <w:p>
@@ -8199,7 +8591,7 @@
           <w:rFonts w:ascii="Times New Roman" w:hAnsi="Times New Roman"/>
           <w:sz w:val="20"/>
         </w:rPr>
-        <w:t>5. Rothwell PM. External validity of randomised controlled trials: "to whom do the results of this trial apply?" Lancet. 2005;365(9453):82-93.</w:t>
+        <w:t>5. Rothwell PM. External validity of randomised controlled trials: "to whom do the results of this trial apply?" Lancet 2005; 365(9453): 82-93.</w:t>
       </w:r>
     </w:p>
     <w:p>
@@ -8208,7 +8600,7 @@
           <w:rFonts w:ascii="Times New Roman" w:hAnsi="Times New Roman"/>
           <w:sz w:val="20"/>
         </w:rPr>
-        <w:t>6. Pogue JM, Yusuf S. Cumulating evidence from randomized trials: utilizing sequential monitoring boundaries for cumulative meta-analysis. Control. Clin. Trials. 1997;18(6):580-93.</w:t>
+        <w:t>6. Pogue JM and Yusuf S. Cumulating evidence from randomized trials: utilizing sequential monitoring boundaries for cumulative meta-analysis. Control Clin Trials 1997; 18(6): 580-93.</w:t>
       </w:r>
     </w:p>
     <w:p>
@@ -8217,7 +8609,7 @@
           <w:rFonts w:ascii="Times New Roman" w:hAnsi="Times New Roman"/>
           <w:sz w:val="20"/>
         </w:rPr>
-        <w:t>7. Wetterslev J, Thorlund K, Brok J, Gluud C. Estimating required information size by quantifying diversity in random-effects model meta-analyses. BMC Med. Res. Methodol. 2009;9:86.</w:t>
+        <w:t>7. Wetterslev J, Thorlund K, Brok J, et al. Estimating required information size by quantifying diversity in random-effects model meta-analyses. BMC Med Res Methodol 2009; 9: 86.</w:t>
       </w:r>
     </w:p>
     <w:p>
@@ -8226,7 +8618,7 @@
           <w:rFonts w:ascii="Times New Roman" w:hAnsi="Times New Roman"/>
           <w:sz w:val="20"/>
         </w:rPr>
-        <w:t>8. Brok J, Thorlund K, Gluud C, Wetterslev J. Trial sequential analysis reveals insufficient information size and potentially false positive results in many meta-analyses. J. Clin. Epidemiol. 2008;61(8):763-9.</w:t>
+        <w:t>8. Brok J, Thorlund K, Gluud C, et al. Trial sequential analysis reveals insufficient information size and potentially false positive results in many meta-analyses. J Clin Epidemiol 2008; 61(8): 763-9.</w:t>
       </w:r>
     </w:p>
     <w:p>
@@ -8235,7 +8627,7 @@
           <w:rFonts w:ascii="Times New Roman" w:hAnsi="Times New Roman"/>
           <w:sz w:val="20"/>
         </w:rPr>
-        <w:t>9. Thorlund K, Engstrom J, Wetterslev J, Brok J, Imberger G, Gluud C. User manual for trial sequential analysis (TSA). Copenhagen Trial Unit, Centre for Clinical Intervention Research; 2011.</w:t>
+        <w:t>9. Thorlund K, Engstrom J, Wetterslev J, et al. User manual for trial sequential analysis (TSA). Copenhagen Trial Unit, Centre for Clinical Intervention Research; 2011.</w:t>
       </w:r>
     </w:p>
     <w:p>
@@ -8244,7 +8636,7 @@
           <w:rFonts w:ascii="Times New Roman" w:hAnsi="Times New Roman"/>
           <w:sz w:val="20"/>
         </w:rPr>
-        <w:t>10. Morris TP, White IR, Crowther MJ. Using simulation studies to evaluate statistical methods. Stat. Med. 2019;38(11):2074-102.</w:t>
+        <w:t>10. Morris TP, White IR and Crowther MJ. Using simulation studies to evaluate statistical methods. Stat Med 2019; 38(11): 2074-102.</w:t>
       </w:r>
     </w:p>
     <w:p>
@@ -8253,7 +8645,7 @@
           <w:rFonts w:ascii="Times New Roman" w:hAnsi="Times New Roman"/>
           <w:sz w:val="20"/>
         </w:rPr>
-        <w:t>11. Schoenfeld DA. Sample-size formula for the proportional-hazards regression model. Biometrics. 1983;39(2):499-503.</w:t>
+        <w:t>11. Schoenfeld DA. Sample-size formula for the proportional-hazards regression model. Biometrics 1983; 39(2): 499-503.</w:t>
       </w:r>
     </w:p>
     <w:p>
@@ -8262,7 +8654,7 @@
           <w:rFonts w:ascii="Times New Roman" w:hAnsi="Times New Roman"/>
           <w:sz w:val="20"/>
         </w:rPr>
-        <w:t>12. Ibrahim JG, Chen MH. Power prior distributions for regression models. Stat. Sci. 2000;15(1):46-60.</w:t>
+        <w:t>12. Ibrahim JG and Chen MH. Power prior distributions for regression models. Stat Sci 2000; 15(1): 46-60.</w:t>
       </w:r>
     </w:p>
     <w:p>
@@ -8271,7 +8663,7 @@
           <w:rFonts w:ascii="Times New Roman" w:hAnsi="Times New Roman"/>
           <w:sz w:val="20"/>
         </w:rPr>
-        <w:t>13. McCaw ZR, Yin G, Wei LJ. Using the restricted mean survival time difference as an alternative to the hazard ratio for analyzing clinical cardiovascular studies. Circulation. 2019;140(17):1366-8. doi:10.1161/CIRCULATIONAHA.119.040680.</w:t>
+        <w:t>13. McCaw ZR, Yin G and Wei LJ. Using the restricted mean survival time difference as an alternative to the hazard ratio for analyzing clinical cardiovascular studies. Circulation 2019; 140(17): 1366-8. doi:10.1161/CIRCULATIONAHA.119.040680.</w:t>
       </w:r>
     </w:p>
     <w:p>
@@ -8280,7 +8672,7 @@
           <w:rFonts w:ascii="Times New Roman" w:hAnsi="Times New Roman"/>
           <w:sz w:val="20"/>
         </w:rPr>
-        <w:t>14. Boyd AP, Kittelson JM, Gillen DL. Estimation of treatment effect under non-proportional hazards and conditionally independent censoring. Stat. Med. 2012;31(28):3504-15. doi:10.1002/sim.5440.</w:t>
+        <w:t>14. Boyd AP, Kittelson JM and Gillen DL. Estimation of treatment effect under non-proportional hazards and conditionally independent censoring. Stat Med 2012; 31(28): 3504-15. doi:10.1002/sim.5440.</w:t>
       </w:r>
     </w:p>
     <w:p>
@@ -8289,7 +8681,7 @@
           <w:rFonts w:ascii="Times New Roman" w:hAnsi="Times New Roman"/>
           <w:sz w:val="20"/>
         </w:rPr>
-        <w:t>15. Sherry AD, Msaouel P, Kupferman GS, Lin TA, Abi Jaoude J, Kouzy R, et al. Evidence-based prior for estimating the treatment effect of phase III randomized trials in oncology. JCO Precis. Oncol. 2024;8:e2400363. doi:10.1200/PO.24.00363.</w:t>
+        <w:t>15. Sherry AD, Msaouel P, Kupferman GS, et al. Evidence-based prior for estimating the treatment effect of phase III randomized trials in oncology. JCO Precis Oncol 2024; 8: e2400363. doi:10.1200/PO.24.00363.</w:t>
       </w:r>
     </w:p>
     <w:p>
@@ -8298,7 +8690,7 @@
           <w:rFonts w:ascii="Times New Roman" w:hAnsi="Times New Roman"/>
           <w:sz w:val="20"/>
         </w:rPr>
-        <w:t>16. Foreman-Mackey D, Hogg DW, Lang D, Goodman J. emcee: the MCMC hammer. Publ. Astron. Soc. Pac. 2013;125(925):306-12.</w:t>
+        <w:t>16. Foreman-Mackey D, Hogg DW, Lang D, et al. emcee: the MCMC hammer. Publ Astron Soc Pac 2013; 125(925): 306-12.</w:t>
       </w:r>
     </w:p>
     <w:p>
@@ -8307,7 +8699,7 @@
           <w:rFonts w:ascii="Times New Roman" w:hAnsi="Times New Roman"/>
           <w:sz w:val="20"/>
         </w:rPr>
-        <w:t>17. Teo KK, Yusuf S, Collins R, Held PH, Peto R. Effects of intravenous magnesium in suspected acute myocardial infarction: overview of randomised trials. BMJ. 1991;303(6816):1499-503.</w:t>
+        <w:t>17. Teo KK, Yusuf S, Collins R, et al. Effects of intravenous magnesium in suspected acute myocardial infarction: overview of randomised trials. BMJ 1991; 303(6816): 1499-503.</w:t>
       </w:r>
     </w:p>
     <w:p>
@@ -8316,7 +8708,7 @@
           <w:rFonts w:ascii="Times New Roman" w:hAnsi="Times New Roman"/>
           <w:sz w:val="20"/>
         </w:rPr>
-        <w:t>18. Li J, Zhang Q, Zhang M, Egger M. Intravenous magnesium for acute myocardial infarction. Cochrane Database Syst. Rev. 2007;(2):CD002755.</w:t>
+        <w:t>18. Li J, Zhang Q, Zhang M, et al. Intravenous magnesium for acute myocardial infarction. Cochrane Database Syst Rev 2007; (2): CD002755.</w:t>
       </w:r>
     </w:p>
     <w:p>
@@ -8325,7 +8717,7 @@
           <w:rFonts w:ascii="Times New Roman" w:hAnsi="Times New Roman"/>
           <w:sz w:val="20"/>
         </w:rPr>
-        <w:t>19. Anker SD, Clark AL, Winkler R, Zugck C, Cicoira M, Haehling S, et al. Statin use and survival in patients with chronic heart failure -- results from two observational studies with 5200 patients. Int. J. Cardiol. 2006;112(2):234-42.</w:t>
+        <w:t>19. Anker SD, Clark AL, Winkler R, et al. Statin use and survival in patients with chronic heart failure -- results from two observational studies with 5200 patients. Int J Cardiol 2006; 112(2): 234-42.</w:t>
       </w:r>
     </w:p>
     <w:p>
@@ -8334,7 +8726,7 @@
           <w:rFonts w:ascii="Times New Roman" w:hAnsi="Times New Roman"/>
           <w:sz w:val="20"/>
         </w:rPr>
-        <w:t>20. Mozaffarian D, Nye R, Levy WC. Statin therapy is associated with lower mortality among patients with severe heart failure. Am. J. Cardiol. 2004;93(9):1124-9.</w:t>
+        <w:t>20. Mozaffarian D, Nye R and Levy WC. Statin therapy is associated with lower mortality among patients with severe heart failure. Am J Cardiol 2004; 93(9): 1124-9.</w:t>
       </w:r>
     </w:p>
     <w:p>
@@ -8343,7 +8735,7 @@
           <w:rFonts w:ascii="Times New Roman" w:hAnsi="Times New Roman"/>
           <w:sz w:val="20"/>
         </w:rPr>
-        <w:t>21. Horwich TB, MacLellan WR, Fonarow GC. Statin therapy is associated with improved survival in ischemic and non-ischemic heart failure. J. Am. Coll. Cardiol. 2004;43(4):642-8.</w:t>
+        <w:t>21. Horwich TB, MacLellan WR and Fonarow GC. Statin therapy is associated with improved survival in ischemic and non-ischemic heart failure. J Am Coll Cardiol 2004; 43(4): 642-8.</w:t>
       </w:r>
     </w:p>
     <w:p>
@@ -8352,7 +8744,7 @@
           <w:rFonts w:ascii="Times New Roman" w:hAnsi="Times New Roman"/>
           <w:sz w:val="20"/>
         </w:rPr>
-        <w:t>22. Go AS, Lee WY, Yang J, Lo JC, Gurwitz JH. Statin therapy and risks for death and hospitalization in chronic heart failure. JAMA. 2006;296(17):2105-11.</w:t>
+        <w:t>22. Go AS, Lee WY, Yang J, et al. Statin therapy and risks for death and hospitalization in chronic heart failure. JAMA 2006; 296(17): 2105-11.</w:t>
       </w:r>
     </w:p>
     <w:p>
@@ -8361,7 +8753,7 @@
           <w:rFonts w:ascii="Times New Roman" w:hAnsi="Times New Roman"/>
           <w:sz w:val="20"/>
         </w:rPr>
-        <w:t>23. Foody JM, Shah R, Galusha D, Masoudi FA, Havranek EP, Krumholz HM. Statins and mortality among elderly patients hospitalized with heart failure. Circulation. 2006;113(8):1086-92.</w:t>
+        <w:t>23. Foody JM, Shah R, Galusha D, et al. Statins and mortality among elderly patients hospitalized with heart failure. Circulation 2006; 113(8): 1086-92.</w:t>
       </w:r>
     </w:p>
     <w:p>
@@ -8370,7 +8762,7 @@
           <w:rFonts w:ascii="Times New Roman" w:hAnsi="Times New Roman"/>
           <w:sz w:val="20"/>
         </w:rPr>
-        <w:t>24. Kjekshus J, Apetrei E, Barrios V, Bohm M, Cleland JG, Cornel JH, et al. Rosuvastatin in older patients with systolic heart failure. N. Engl. J. Med. 2007;357(22):2248-61.</w:t>
+        <w:t>24. Kjekshus J, Apetrei E, Barrios V, et al. Rosuvastatin in older patients with systolic heart failure. N Engl J Med 2007; 357(22): 2248-61.</w:t>
       </w:r>
     </w:p>
     <w:p>
@@ -8379,7 +8771,7 @@
           <w:rFonts w:ascii="Times New Roman" w:hAnsi="Times New Roman"/>
           <w:sz w:val="20"/>
         </w:rPr>
-        <w:t>25. GISSI-HF Investigators. Effect of rosuvastatin in patients with chronic heart failure (the GISSI-HF trial): a randomised, double-blind, placebo-controlled trial. Lancet. 2008;372(9645):1231-9.</w:t>
+        <w:t>25. GISSI-HF Investigators. Effect of rosuvastatin in patients with chronic heart failure (the GISSI-HF trial): a randomised, double-blind, placebo-controlled trial. Lancet 2008; 372(9645): 1231-9.</w:t>
       </w:r>
     </w:p>
     <w:p>
@@ -8388,7 +8780,7 @@
           <w:rFonts w:ascii="Times New Roman" w:hAnsi="Times New Roman"/>
           <w:sz w:val="20"/>
         </w:rPr>
-        <w:t>26. DerSimonian R, Laird N. Meta-analysis in clinical trials. Control. Clin. Trials. 1986;7(3):177-88.</w:t>
+        <w:t>26. DerSimonian R and Laird N. Meta-analysis in clinical trials. Control Clin Trials 1986; 7(3): 177-88.</w:t>
       </w:r>
     </w:p>
     <w:p>
@@ -8397,7 +8789,7 @@
           <w:rFonts w:ascii="Times New Roman" w:hAnsi="Times New Roman"/>
           <w:sz w:val="20"/>
         </w:rPr>
-        <w:t>27. Hernan MA, Robins JM. Using big data to emulate a target trial when a randomized trial is not available. Am. J. Epidemiol. 2016;183(8):758-64.</w:t>
+        <w:t>27. Hernan MA and Robins JM. Using big data to emulate a target trial when a randomized trial is not available. Am J Epidemiol 2016; 183(8): 758-64.</w:t>
       </w:r>
     </w:p>
     <w:p>
@@ -8406,7 +8798,7 @@
           <w:rFonts w:ascii="Times New Roman" w:hAnsi="Times New Roman"/>
           <w:sz w:val="20"/>
         </w:rPr>
-        <w:t>28. Hernan MA, Wang W, Leaf DE. Target trial emulation: a framework for causal inference from observational data. JAMA. 2022;328(24):2446-7.</w:t>
+        <w:t>28. Hernan MA, Wang W and Leaf DE. Target trial emulation: a framework for causal inference from observational data. JAMA 2022; 328(24): 2446-7.</w:t>
       </w:r>
     </w:p>
     <w:p>
@@ -8415,7 +8807,7 @@
           <w:rFonts w:ascii="Times New Roman" w:hAnsi="Times New Roman"/>
           <w:sz w:val="20"/>
         </w:rPr>
-        <w:t>29. Schmidli H, Gsteiger S, Roychoudhury S, O'Hagan A, Spiegelhalter D, Neuenschwander B. Robust meta-analytic-predictive priors in clinical trials with historical control information. Biometrics. 2014;70(4):1023-32.</w:t>
+        <w:t>29. Schmidli H, Gsteiger S, Roychoudhury S, et al. Robust meta-analytic-predictive priors in clinical trials with historical control information. Biometrics 2014; 70(4): 1023-32.</w:t>
       </w:r>
     </w:p>
     <w:p>
@@ -8424,7 +8816,7 @@
           <w:rFonts w:ascii="Times New Roman" w:hAnsi="Times New Roman"/>
           <w:sz w:val="20"/>
         </w:rPr>
-        <w:t>30. Verde PE, Ohmann C. Combining randomized and non-randomized evidence in clinical research: a review of methods and applications. Res. Synth. Methods. 2015;6(1):45-62.</w:t>
+        <w:t>30. Verde PE and Ohmann C. Combining randomized and non-randomized evidence in clinical research: a review of methods and applications. Res Synth Methods 2015; 6(1): 45-62.</w:t>
       </w:r>
     </w:p>
     <w:p>
@@ -8433,7 +8825,7 @@
           <w:rFonts w:ascii="Times New Roman" w:hAnsi="Times New Roman"/>
           <w:sz w:val="20"/>
         </w:rPr>
-        <w:t>31. Efthimiou O, Mavridis D, Debray TPA, Samara M, Belger M, Salanti G, et al. Combining randomized and non-randomized evidence in network meta-analysis. Stat. Med. 2017;36(8):1210-26.</w:t>
+        <w:t>31. Efthimiou O, Mavridis D, Debray TPA, et al. Combining randomized and non-randomized evidence in network meta-analysis. Stat Med 2017; 36(8): 1210-26.</w:t>
       </w:r>
     </w:p>
     <w:sectPr>

</xml_diff>

<commit_message>
fix: Clinical Trials submission checks - cross-references, Word OMML math, real refs, no double-byte chars, causal language, sanitize office outputs, reproducibility
Co-Authored-By: Tatsuki Onishi <bougtoir@gmail.com>
</commit_message>
<xml_diff>
--- a/rct-decomposition/KOTHA_Framework_CCTC.docx
+++ b/rct-decomposition/KOTHA_Framework_CCTC.docx
@@ -88,7 +88,7 @@
           <w:i w:val="0"/>
           <w:sz w:val="24"/>
         </w:rPr>
-        <w:t>Word count: 2682</w:t>
+        <w:t>Word count: 2686</w:t>
       </w:r>
     </w:p>
     <w:p>
@@ -298,7 +298,7 @@
           <w:sz w:val="24"/>
           <w:szCs w:val="24"/>
         </w:rPr>
-        <w:t xml:space="preserve">= 62%. In the statins case, observational hazard ratio (HR) was 0.72 (0.64-0.80) versus RCT HR 0.97 (0.90-1.05), with an event-rate ratio of 0.51. Bayesian integration (α = 0.3) yielded OR 0.74 (CrI 0.25-1.43), P(OR &lt; 1) = 80.7% for magnesium and HR 0.85 (0.55-1.24), P(HR &lt; 1) = 86.5% for statins; both probabilities remained below conventional decision thresholds, leaving conclusions uncertain.</w:t>
+        <w:t xml:space="preserve">= 62%. In the statins case, observational hazard ratio (HR) was 0.72 (0.64-0.80) versus RCT HR 0.97 (0.90-1.05), with an event-rate ratio of 0.51. Bayesian integration (alpha = 0.3) yielded OR 0.74 (CrI 0.25-1.43), P(OR &lt; 1) = 80.7% for magnesium and HR 0.85 (0.55-1.24), P(HR &lt; 1) = 86.5% for statins; both probabilities remained below conventional decision thresholds, leaving conclusions uncertain.</w:t>
       </w:r>
     </w:p>
     <w:p xmlns:a="http://schemas.openxmlformats.org/drawingml/2006/main" xmlns:pic="http://schemas.openxmlformats.org/drawingml/2006/picture">
@@ -322,95 +322,7 @@
           <w:sz w:val="24"/>
           <w:szCs w:val="24"/>
         </w:rPr>
-        <w:t xml:space="preserve">: KOTHA distinguishes</w:t>
-      </w:r>
-      <w:r>
-        <w:rPr>
-          <w:rFonts w:ascii="Times New Roman" w:hAnsi="Times New Roman" w:cs="Times New Roman" w:eastAsia="Times New Roman"/>
-          <w:sz w:val="24"/>
-          <w:szCs w:val="24"/>
-        </w:rPr>
-        <w:t xml:space="preserve"> </w:t>
-      </w:r>
-      <w:r>
-        <w:rPr>
-          <w:rFonts w:ascii="Times New Roman" w:hAnsi="Times New Roman" w:cs="Times New Roman" w:eastAsia="Times New Roman"/>
-          <w:sz w:val="24"/>
-          <w:szCs w:val="24"/>
-        </w:rPr>
-        <w:t xml:space="preserve">“</w:t>
-      </w:r>
-      <w:r>
-        <w:rPr>
-          <w:rFonts w:ascii="Times New Roman" w:hAnsi="Times New Roman" w:cs="Times New Roman" w:eastAsia="Times New Roman"/>
-          <w:sz w:val="24"/>
-          <w:szCs w:val="24"/>
-        </w:rPr>
-        <w:t xml:space="preserve">evidence of no effect</w:t>
-      </w:r>
-      <w:r>
-        <w:rPr>
-          <w:rFonts w:ascii="Times New Roman" w:hAnsi="Times New Roman" w:cs="Times New Roman" w:eastAsia="Times New Roman"/>
-          <w:sz w:val="24"/>
-          <w:szCs w:val="24"/>
-        </w:rPr>
-        <w:t xml:space="preserve">”</w:t>
-      </w:r>
-      <w:r>
-        <w:rPr>
-          <w:rFonts w:ascii="Times New Roman" w:hAnsi="Times New Roman" w:cs="Times New Roman" w:eastAsia="Times New Roman"/>
-          <w:sz w:val="24"/>
-          <w:szCs w:val="24"/>
-        </w:rPr>
-        <w:t xml:space="preserve"> </w:t>
-      </w:r>
-      <w:r>
-        <w:rPr>
-          <w:rFonts w:ascii="Times New Roman" w:hAnsi="Times New Roman" w:cs="Times New Roman" w:eastAsia="Times New Roman"/>
-          <w:sz w:val="24"/>
-          <w:szCs w:val="24"/>
-        </w:rPr>
-        <w:t xml:space="preserve">from</w:t>
-      </w:r>
-      <w:r>
-        <w:rPr>
-          <w:rFonts w:ascii="Times New Roman" w:hAnsi="Times New Roman" w:cs="Times New Roman" w:eastAsia="Times New Roman"/>
-          <w:sz w:val="24"/>
-          <w:szCs w:val="24"/>
-        </w:rPr>
-        <w:t xml:space="preserve"> </w:t>
-      </w:r>
-      <w:r>
-        <w:rPr>
-          <w:rFonts w:ascii="Times New Roman" w:hAnsi="Times New Roman" w:cs="Times New Roman" w:eastAsia="Times New Roman"/>
-          <w:sz w:val="24"/>
-          <w:szCs w:val="24"/>
-        </w:rPr>
-        <w:t xml:space="preserve">“</w:t>
-      </w:r>
-      <w:r>
-        <w:rPr>
-          <w:rFonts w:ascii="Times New Roman" w:hAnsi="Times New Roman" w:cs="Times New Roman" w:eastAsia="Times New Roman"/>
-          <w:sz w:val="24"/>
-          <w:szCs w:val="24"/>
-        </w:rPr>
-        <w:t xml:space="preserve">no evidence of effect</w:t>
-      </w:r>
-      <w:r>
-        <w:rPr>
-          <w:rFonts w:ascii="Times New Roman" w:hAnsi="Times New Roman" w:cs="Times New Roman" w:eastAsia="Times New Roman"/>
-          <w:sz w:val="24"/>
-          <w:szCs w:val="24"/>
-        </w:rPr>
-        <w:t xml:space="preserve">”</w:t>
-      </w:r>
-      <w:r>
-        <w:rPr>
-          <w:rFonts w:ascii="Times New Roman" w:hAnsi="Times New Roman" w:cs="Times New Roman" w:eastAsia="Times New Roman"/>
-          <w:sz w:val="24"/>
-          <w:szCs w:val="24"/>
-        </w:rPr>
-        <w:t xml:space="preserve">. Module H classified magnesium as inconclusive with serious inconsistency (heterogeneity), and statins as inconclusive with serious indirectness.</w:t>
+        <w:t xml:space="preserve">: KOTHA distinguishes "evidence of no effect" from "no evidence of effect". Module H classified magnesium as inconclusive with serious inconsistency (heterogeneity), and statins as inconclusive with serious indirectness.</w:t>
       </w:r>
     </w:p>
     <w:p xmlns:a="http://schemas.openxmlformats.org/drawingml/2006/main" xmlns:pic="http://schemas.openxmlformats.org/drawingml/2006/picture">
@@ -1092,7 +1004,7 @@
           <w:sz w:val="24"/>
           <w:szCs w:val="24"/>
         </w:rPr>
-        <w:t xml:space="preserve">, a five-step causal chain: representativeness loss; event concentration in excluded populations; inadequate design compensation; systematic underpowering; and, ultimately, distorted recommendations when</w:t>
+        <w:t xml:space="preserve">, a five-step causal chain: representativeness loss; event concentration in excluded populations; inadequate design compensation; systematic underpowering; and, ultimately, distorted recommendations when "no statistically significant difference" is interpreted as "no effect".</w:t>
       </w:r>
       <w:r>
         <w:rPr>
@@ -1100,95 +1012,7 @@
           <w:sz w:val="24"/>
           <w:szCs w:val="24"/>
         </w:rPr>
-        <w:t xml:space="preserve"> </w:t>
-      </w:r>
-      <w:r>
-        <w:rPr>
-          <w:rFonts w:ascii="Times New Roman" w:hAnsi="Times New Roman" w:cs="Times New Roman" w:eastAsia="Times New Roman"/>
-          <w:sz w:val="24"/>
-          <w:szCs w:val="24"/>
-        </w:rPr>
-        <w:t xml:space="preserve">“</w:t>
-      </w:r>
-      <w:r>
-        <w:rPr>
-          <w:rFonts w:ascii="Times New Roman" w:hAnsi="Times New Roman" w:cs="Times New Roman" w:eastAsia="Times New Roman"/>
-          <w:sz w:val="24"/>
-          <w:szCs w:val="24"/>
-        </w:rPr>
-        <w:t xml:space="preserve">no statistically significant difference</w:t>
-      </w:r>
-      <w:r>
-        <w:rPr>
-          <w:rFonts w:ascii="Times New Roman" w:hAnsi="Times New Roman" w:cs="Times New Roman" w:eastAsia="Times New Roman"/>
-          <w:sz w:val="24"/>
-          <w:szCs w:val="24"/>
-        </w:rPr>
-        <w:t xml:space="preserve">”</w:t>
-      </w:r>
-      <w:r>
-        <w:rPr>
-          <w:rFonts w:ascii="Times New Roman" w:hAnsi="Times New Roman" w:cs="Times New Roman" w:eastAsia="Times New Roman"/>
-          <w:sz w:val="24"/>
-          <w:szCs w:val="24"/>
-        </w:rPr>
-        <w:t xml:space="preserve"> </w:t>
-      </w:r>
-      <w:r>
-        <w:rPr>
-          <w:rFonts w:ascii="Times New Roman" w:hAnsi="Times New Roman" w:cs="Times New Roman" w:eastAsia="Times New Roman"/>
-          <w:sz w:val="24"/>
-          <w:szCs w:val="24"/>
-        </w:rPr>
-        <w:t xml:space="preserve">is interpreted as</w:t>
-      </w:r>
-      <w:r>
-        <w:rPr>
-          <w:rFonts w:ascii="Times New Roman" w:hAnsi="Times New Roman" w:cs="Times New Roman" w:eastAsia="Times New Roman"/>
-          <w:sz w:val="24"/>
-          <w:szCs w:val="24"/>
-        </w:rPr>
-        <w:t xml:space="preserve"> </w:t>
-      </w:r>
-      <w:r>
-        <w:rPr>
-          <w:rFonts w:ascii="Times New Roman" w:hAnsi="Times New Roman" w:cs="Times New Roman" w:eastAsia="Times New Roman"/>
-          <w:sz w:val="24"/>
-          <w:szCs w:val="24"/>
-        </w:rPr>
-        <w:t xml:space="preserve">“</w:t>
-      </w:r>
-      <w:r>
-        <w:rPr>
-          <w:rFonts w:ascii="Times New Roman" w:hAnsi="Times New Roman" w:cs="Times New Roman" w:eastAsia="Times New Roman"/>
-          <w:sz w:val="24"/>
-          <w:szCs w:val="24"/>
-        </w:rPr>
-        <w:t xml:space="preserve">no effect</w:t>
-      </w:r>
-      <w:r>
-        <w:rPr>
-          <w:rFonts w:ascii="Times New Roman" w:hAnsi="Times New Roman" w:cs="Times New Roman" w:eastAsia="Times New Roman"/>
-          <w:sz w:val="24"/>
-          <w:szCs w:val="24"/>
-        </w:rPr>
-        <w:t xml:space="preserve">”</w:t>
-      </w:r>
-      <w:r>
-        <w:rPr>
-          <w:rFonts w:ascii="Times New Roman" w:hAnsi="Times New Roman" w:cs="Times New Roman" w:eastAsia="Times New Roman"/>
-          <w:sz w:val="24"/>
-          <w:szCs w:val="24"/>
-        </w:rPr>
-        <w:t xml:space="preserve">.</w:t>
-      </w:r>
-      <w:r>
-        <w:rPr>
-          <w:rFonts w:ascii="Times New Roman" w:hAnsi="Times New Roman" w:cs="Times New Roman" w:eastAsia="Times New Roman"/>
-          <w:sz w:val="24"/>
-          <w:szCs w:val="24"/>
-        </w:rPr>
-        <w:t xml:space="preserve">An alternative, structural explanation deserves systematic attention. RCT enrollment criteria, consent processes, and site selection progressively restrict the study population </w:t>
+        <w:t xml:space="preserve">An alternative structural explanation deserves systematic attention. RCT enrollment criteria, consent processes, and site selection progressively restrict the study population </w:t>
       </w:r>
       <w:r>
         <w:rPr>
@@ -1205,7 +1029,7 @@
           <w:sz w:val="24"/>
           <w:szCs w:val="24"/>
         </w:rPr>
-        <w:t xml:space="preserve">. Because clinical events are concentrated in the highest-risk patients—those with comorbidities, advanced disease, or organ dysfunction—their exclusion lowers event rates in the enrolled cohort. If trial protocols do not compensate by increasing sample size, extending follow-up, or enriching high-risk enrollment, the resulting evidence base can become informationally insufficient. We term this phenomenon</w:t>
+        <w:t xml:space="preserve">. Because clinical events are concentrated in the highest-risk patients---those with comorbidities, advanced disease, or organ dysfunction---their exclusion lowers event rates in the enrolled cohort. If trial protocols do not compensate by increasing sample size, extending follow-up, or enriching high-risk enrollment, the resulting evidence base can become informationally insufficient. We call this phenomenon</w:t>
       </w:r>
     </w:p>
     <w:p xmlns:a="http://schemas.openxmlformats.org/drawingml/2006/main" xmlns:pic="http://schemas.openxmlformats.org/drawingml/2006/picture">
@@ -1253,7 +1077,7 @@
           <w:sz w:val="24"/>
           <w:szCs w:val="24"/>
         </w:rPr>
-        <w:t xml:space="preserve">. However, these tools are underused in guideline development, and neither directly quantifies the information loss attributable to enrollment-driven risk-profile shifts.</w:t>
+        <w:t xml:space="preserve">. However, these tools are underused in guideline development, and neither directly quantifies the information loss resulting from enrollment-driven risk-profile shifts.</w:t>
       </w:r>
     </w:p>
     <w:p xmlns:a="http://schemas.openxmlformats.org/drawingml/2006/main" xmlns:pic="http://schemas.openxmlformats.org/drawingml/2006/picture">
@@ -1267,7 +1091,7 @@
           <w:sz w:val="24"/>
           <w:szCs w:val="24"/>
         </w:rPr>
-        <w:t xml:space="preserve">A number of trial design strategies can mitigate event dilution (Table 1), including stratified randomization, prognostic enrichment, event-driven designs, adaptive sample-size re-estimation, and pragmatic or registry-based trials. Existing approaches address these issues separately; to our knowledge, no widely adopted framework tightly links prospective power assessment, retrospective diagnostic evaluation, and structured evidence interpretation in a single reproducible workflow for completed or planned RCTs.</w:t>
+        <w:t xml:space="preserve">Several trial design strategies can mitigate event dilution (Table 1), including stratified randomization, prognostic enrichment, event-driven designs, adaptive sample-size re-estimation, and pragmatic or registry-based trials. Existing approaches address these issues separately; to our knowledge, no widely adopted framework tightly links prospective power assessment, retrospective diagnostic evaluation, and structured evidence interpretation in a single reproducible workflow for completed or planned RCTs.</w:t>
       </w:r>
     </w:p>
     <w:p xmlns:a="http://schemas.openxmlformats.org/drawingml/2006/main" xmlns:pic="http://schemas.openxmlformats.org/drawingml/2006/picture">
@@ -3235,118 +3059,6 @@
           <w:sz w:val="24"/>
           <w:szCs w:val="24"/>
         </w:rPr>
-        <w:t xml:space="preserve"> </w:t>
-      </w:r>
-      <w:r>
-        <w:rPr>
-          <w:rFonts w:ascii="Times New Roman" w:hAnsi="Times New Roman" w:cs="Times New Roman" w:eastAsia="Times New Roman"/>
-          <w:sz w:val="24"/>
-          <w:szCs w:val="24"/>
-        </w:rPr>
-        <w:t xml:space="preserve">“</w:t>
-      </w:r>
-      <w:r>
-        <w:rPr>
-          <w:rFonts w:ascii="Times New Roman" w:hAnsi="Times New Roman" w:cs="Times New Roman" w:eastAsia="Times New Roman"/>
-          <w:sz w:val="24"/>
-          <w:szCs w:val="24"/>
-        </w:rPr>
-        <w:t xml:space="preserve">evidence of effect,</w:t>
-      </w:r>
-      <w:r>
-        <w:rPr>
-          <w:rFonts w:ascii="Times New Roman" w:hAnsi="Times New Roman" w:cs="Times New Roman" w:eastAsia="Times New Roman"/>
-          <w:sz w:val="24"/>
-          <w:szCs w:val="24"/>
-        </w:rPr>
-        <w:t xml:space="preserve">”</w:t>
-      </w:r>
-      <w:r>
-        <w:rPr>
-          <w:rFonts w:ascii="Times New Roman" w:hAnsi="Times New Roman" w:cs="Times New Roman" w:eastAsia="Times New Roman"/>
-          <w:sz w:val="24"/>
-          <w:szCs w:val="24"/>
-        </w:rPr>
-        <w:t xml:space="preserve"> </w:t>
-      </w:r>
-      <w:r>
-        <w:rPr>
-          <w:rFonts w:ascii="Times New Roman" w:hAnsi="Times New Roman" w:cs="Times New Roman" w:eastAsia="Times New Roman"/>
-          <w:sz w:val="24"/>
-          <w:szCs w:val="24"/>
-        </w:rPr>
-        <w:t xml:space="preserve">“</w:t>
-      </w:r>
-      <w:r>
-        <w:rPr>
-          <w:rFonts w:ascii="Times New Roman" w:hAnsi="Times New Roman" w:cs="Times New Roman" w:eastAsia="Times New Roman"/>
-          <w:sz w:val="24"/>
-          <w:szCs w:val="24"/>
-        </w:rPr>
-        <w:t xml:space="preserve">evidence of no effect,</w:t>
-      </w:r>
-      <w:r>
-        <w:rPr>
-          <w:rFonts w:ascii="Times New Roman" w:hAnsi="Times New Roman" w:cs="Times New Roman" w:eastAsia="Times New Roman"/>
-          <w:sz w:val="24"/>
-          <w:szCs w:val="24"/>
-        </w:rPr>
-        <w:t xml:space="preserve">”</w:t>
-      </w:r>
-      <w:r>
-        <w:rPr>
-          <w:rFonts w:ascii="Times New Roman" w:hAnsi="Times New Roman" w:cs="Times New Roman" w:eastAsia="Times New Roman"/>
-          <w:sz w:val="24"/>
-          <w:szCs w:val="24"/>
-        </w:rPr>
-        <w:t xml:space="preserve"> </w:t>
-      </w:r>
-      <w:r>
-        <w:rPr>
-          <w:rFonts w:ascii="Times New Roman" w:hAnsi="Times New Roman" w:cs="Times New Roman" w:eastAsia="Times New Roman"/>
-          <w:sz w:val="24"/>
-          <w:szCs w:val="24"/>
-        </w:rPr>
-        <w:t xml:space="preserve">and</w:t>
-      </w:r>
-      <w:r>
-        <w:rPr>
-          <w:rFonts w:ascii="Times New Roman" w:hAnsi="Times New Roman" w:cs="Times New Roman" w:eastAsia="Times New Roman"/>
-          <w:sz w:val="24"/>
-          <w:szCs w:val="24"/>
-        </w:rPr>
-        <w:t xml:space="preserve"> </w:t>
-      </w:r>
-      <w:r>
-        <w:rPr>
-          <w:rFonts w:ascii="Times New Roman" w:hAnsi="Times New Roman" w:cs="Times New Roman" w:eastAsia="Times New Roman"/>
-          <w:sz w:val="24"/>
-          <w:szCs w:val="24"/>
-        </w:rPr>
-        <w:t xml:space="preserve">“</w:t>
-      </w:r>
-      <w:r>
-        <w:rPr>
-          <w:rFonts w:ascii="Times New Roman" w:hAnsi="Times New Roman" w:cs="Times New Roman" w:eastAsia="Times New Roman"/>
-          <w:sz w:val="24"/>
-          <w:szCs w:val="24"/>
-        </w:rPr>
-        <w:t xml:space="preserve">no evidence of effect (inconsistent or indirect).</w:t>
-      </w:r>
-      <w:r>
-        <w:rPr>
-          <w:rFonts w:ascii="Times New Roman" w:hAnsi="Times New Roman" w:cs="Times New Roman" w:eastAsia="Times New Roman"/>
-          <w:sz w:val="24"/>
-          <w:szCs w:val="24"/>
-        </w:rPr>
-        <w:t xml:space="preserve">”</w:t>
-      </w:r>
-      <w:r>
-        <w:rPr>
-          <w:rFonts w:ascii="Times New Roman" w:hAnsi="Times New Roman" w:cs="Times New Roman" w:eastAsia="Times New Roman"/>
-          <w:sz w:val="24"/>
-          <w:szCs w:val="24"/>
-        </w:rPr>
         <w:t xml:space="preserve">Module H maps the outputs of Modules K and T onto the GRADE framework </w:t>
       </w:r>
       <w:r>
@@ -3364,120 +3076,7 @@
           <w:sz w:val="24"/>
           <w:szCs w:val="24"/>
         </w:rPr>
-        <w:t xml:space="preserve">. It includes five assessments (Table 2): information sufficiency (OIS vs observed events), confidence interval interpretation, representativeness (event rate ratio), TSA boundary status, and recommended language. For CI interpretation, we used relative effect boundaries of 0.80 and 1.25 to define clinically important benefit and harm. For representativeness, event-rate ratios below 0.67 or above 1.50 (a ≥50% relative shift) are classified as serious indirectness, and ratios below 0.80 or above 1.25 (a ≥25% relative shift) as moderate indirectness. These thresholds correspond to conventional boundaries for clinically important relative effects. The result is a KOTHA-enhanced certainty rating and recommendation that explicitly distinguishes</w:t>
-      </w:r>
-    </w:p>
-    <w:p>
-      <w:pPr>
-        <w:pStyle w:val="Heading3"/>
-      </w:pPr>
-      <w:r>
-        <w:rPr>
-          <w:rFonts w:ascii="Times New Roman" w:hAnsi="Times New Roman"/>
-          <w:b/>
-          <w:color w:val="000000"/>
-          <w:sz w:val="24"/>
-        </w:rPr>
-        <w:t>Data sources and statistical analysis</w:t>
-      </w:r>
-    </w:p>
-    <w:p xmlns:a="http://schemas.openxmlformats.org/drawingml/2006/main" xmlns:pic="http://schemas.openxmlformats.org/drawingml/2006/picture">
-      <w:pPr>
-        <w:pStyle w:val="Normal"/>
-        <w:spacing w:line="480" w:lineRule="auto" w:after="120"/>
-      </w:pPr>
-      <w:r>
-        <w:rPr>
-          <w:rFonts w:ascii="Times New Roman" w:hAnsi="Times New Roman" w:cs="Times New Roman" w:eastAsia="Times New Roman"/>
-          <w:sz w:val="24"/>
-          <w:szCs w:val="24"/>
-        </w:rPr>
-        <w:t xml:space="preserve">For magnesium in AMI we used study-level event counts extracted from published overviews </w:t>
-      </w:r>
-      <w:r>
-        <w:rPr>
-          <w:rFonts w:ascii="Times New Roman" w:hAnsi="Times New Roman" w:cs="Times New Roman" w:eastAsia="Times New Roman"/>
-          <w:sz w:val="24"/>
-          <w:szCs w:val="24"/>
-          <w:vertAlign w:val="superscript"/>
-        </w:rPr>
-        <w:t xml:space="preserve">[17-18]</w:t>
-      </w:r>
-      <w:r>
-        <w:rPr>
-          <w:rFonts w:ascii="Times New Roman" w:hAnsi="Times New Roman" w:cs="Times New Roman" w:eastAsia="Times New Roman"/>
-          <w:sz w:val="24"/>
-          <w:szCs w:val="24"/>
-        </w:rPr>
-        <w:t xml:space="preserve">. For statins in heart failure we used aggregate data from five observational cohorts </w:t>
-      </w:r>
-      <w:r>
-        <w:rPr>
-          <w:rFonts w:ascii="Times New Roman" w:hAnsi="Times New Roman" w:cs="Times New Roman" w:eastAsia="Times New Roman"/>
-          <w:sz w:val="24"/>
-          <w:szCs w:val="24"/>
-          <w:vertAlign w:val="superscript"/>
-        </w:rPr>
-        <w:t xml:space="preserve">[19-23]</w:t>
-      </w:r>
-      <w:r>
-        <w:rPr>
-          <w:rFonts w:ascii="Times New Roman" w:hAnsi="Times New Roman" w:cs="Times New Roman" w:eastAsia="Times New Roman"/>
-          <w:sz w:val="24"/>
-          <w:szCs w:val="24"/>
-        </w:rPr>
-        <w:t xml:space="preserve"> and two RCTs </w:t>
-      </w:r>
-      <w:r>
-        <w:rPr>
-          <w:rFonts w:ascii="Times New Roman" w:hAnsi="Times New Roman" w:cs="Times New Roman" w:eastAsia="Times New Roman"/>
-          <w:sz w:val="24"/>
-          <w:szCs w:val="24"/>
-          <w:vertAlign w:val="superscript"/>
-        </w:rPr>
-        <w:t xml:space="preserve">[24-25]</w:t>
-      </w:r>
-      <w:r>
-        <w:rPr>
-          <w:rFonts w:ascii="Times New Roman" w:hAnsi="Times New Roman" w:cs="Times New Roman" w:eastAsia="Times New Roman"/>
-          <w:sz w:val="24"/>
-          <w:szCs w:val="24"/>
-        </w:rPr>
-        <w:t xml:space="preserve">. We used DerSimonian-Laird random-effects meta-analysis </w:t>
-      </w:r>
-      <w:r>
-        <w:rPr>
-          <w:rFonts w:ascii="Times New Roman" w:hAnsi="Times New Roman" w:cs="Times New Roman" w:eastAsia="Times New Roman"/>
-          <w:sz w:val="24"/>
-          <w:szCs w:val="24"/>
-          <w:vertAlign w:val="superscript"/>
-        </w:rPr>
-        <w:t xml:space="preserve">[26]</w:t>
-      </w:r>
-      <w:r>
-        <w:rPr>
-          <w:rFonts w:ascii="Times New Roman" w:hAnsi="Times New Roman" w:cs="Times New Roman" w:eastAsia="Times New Roman"/>
-          <w:sz w:val="24"/>
-          <w:szCs w:val="24"/>
-        </w:rPr>
-        <w:t xml:space="preserve"> and computed 95% confidence intervals. OIS and TSA were calculated using standard formulas </w:t>
-      </w:r>
-      <w:r>
-        <w:rPr>
-          <w:rFonts w:ascii="Times New Roman" w:hAnsi="Times New Roman" w:cs="Times New Roman" w:eastAsia="Times New Roman"/>
-          <w:sz w:val="24"/>
-          <w:szCs w:val="24"/>
-          <w:vertAlign w:val="superscript"/>
-        </w:rPr>
-        <w:t xml:space="preserve">[6-9]</w:t>
-      </w:r>
-      <w:r>
-        <w:rPr>
-          <w:rFonts w:ascii="Times New Roman" w:hAnsi="Times New Roman" w:cs="Times New Roman" w:eastAsia="Times New Roman"/>
-          <w:sz w:val="24"/>
-          <w:szCs w:val="24"/>
-        </w:rPr>
-        <w:t xml:space="preserve">. All analyses were performed with the Python code in the public repository.</w:t>
+        <w:t xml:space="preserve">. It includes five assessments (Table 2): information sufficiency (OIS vs observed events), confidence interval interpretation, representativeness (event rate ratio), TSA boundary status, and recommended language. For CI interpretation, we used relative effect boundaries of 0.80 and 1.25 to define clinically important benefit and harm. For representativeness, event-rate ratios below 0.67 or above 1.50 (a relative shift of 50% or more) are classified as serious indirectness, and ratios below 0.80 or above 1.25 (a relative shift of 25% or more) as moderate indirectness. These thresholds correspond to conventional boundaries for clinically important relative effects. The result is a KOTHA-enhanced certainty rating and recommendation that explicitly distinguishes "evidence of effect," "evidence of no effect," and "no evidence of effect (inconsistent or indirect).</w:t>
       </w:r>
     </w:p>
     <w:p>
@@ -4018,6 +3617,119 @@
     </w:tbl>
     <w:p>
       <w:pPr>
+        <w:pStyle w:val="Heading3"/>
+      </w:pPr>
+      <w:r>
+        <w:rPr>
+          <w:rFonts w:ascii="Times New Roman" w:hAnsi="Times New Roman"/>
+          <w:b/>
+          <w:color w:val="000000"/>
+          <w:sz w:val="24"/>
+        </w:rPr>
+        <w:t>Data sources and statistical analysis</w:t>
+      </w:r>
+    </w:p>
+    <w:p xmlns:a="http://schemas.openxmlformats.org/drawingml/2006/main" xmlns:pic="http://schemas.openxmlformats.org/drawingml/2006/picture">
+      <w:pPr>
+        <w:pStyle w:val="Normal"/>
+        <w:spacing w:line="480" w:lineRule="auto" w:after="120"/>
+      </w:pPr>
+      <w:r>
+        <w:rPr>
+          <w:rFonts w:ascii="Times New Roman" w:hAnsi="Times New Roman" w:cs="Times New Roman" w:eastAsia="Times New Roman"/>
+          <w:sz w:val="24"/>
+          <w:szCs w:val="24"/>
+        </w:rPr>
+        <w:t xml:space="preserve">For magnesium in AMI we used study-level event counts extracted from published overviews </w:t>
+      </w:r>
+      <w:r>
+        <w:rPr>
+          <w:rFonts w:ascii="Times New Roman" w:hAnsi="Times New Roman" w:cs="Times New Roman" w:eastAsia="Times New Roman"/>
+          <w:sz w:val="24"/>
+          <w:szCs w:val="24"/>
+          <w:vertAlign w:val="superscript"/>
+        </w:rPr>
+        <w:t xml:space="preserve">[17-18]</w:t>
+      </w:r>
+      <w:r>
+        <w:rPr>
+          <w:rFonts w:ascii="Times New Roman" w:hAnsi="Times New Roman" w:cs="Times New Roman" w:eastAsia="Times New Roman"/>
+          <w:sz w:val="24"/>
+          <w:szCs w:val="24"/>
+        </w:rPr>
+        <w:t xml:space="preserve">. For statins in heart failure we used aggregate data from five observational cohorts </w:t>
+      </w:r>
+      <w:r>
+        <w:rPr>
+          <w:rFonts w:ascii="Times New Roman" w:hAnsi="Times New Roman" w:cs="Times New Roman" w:eastAsia="Times New Roman"/>
+          <w:sz w:val="24"/>
+          <w:szCs w:val="24"/>
+          <w:vertAlign w:val="superscript"/>
+        </w:rPr>
+        <w:t xml:space="preserve">[19-23]</w:t>
+      </w:r>
+      <w:r>
+        <w:rPr>
+          <w:rFonts w:ascii="Times New Roman" w:hAnsi="Times New Roman" w:cs="Times New Roman" w:eastAsia="Times New Roman"/>
+          <w:sz w:val="24"/>
+          <w:szCs w:val="24"/>
+        </w:rPr>
+        <w:t xml:space="preserve"> and two RCTs </w:t>
+      </w:r>
+      <w:r>
+        <w:rPr>
+          <w:rFonts w:ascii="Times New Roman" w:hAnsi="Times New Roman" w:cs="Times New Roman" w:eastAsia="Times New Roman"/>
+          <w:sz w:val="24"/>
+          <w:szCs w:val="24"/>
+          <w:vertAlign w:val="superscript"/>
+        </w:rPr>
+        <w:t xml:space="preserve">[24-25]</w:t>
+      </w:r>
+      <w:r>
+        <w:rPr>
+          <w:rFonts w:ascii="Times New Roman" w:hAnsi="Times New Roman" w:cs="Times New Roman" w:eastAsia="Times New Roman"/>
+          <w:sz w:val="24"/>
+          <w:szCs w:val="24"/>
+        </w:rPr>
+        <w:t xml:space="preserve">. We used DerSimonian-Laird random-effects meta-analysis </w:t>
+      </w:r>
+      <w:r>
+        <w:rPr>
+          <w:rFonts w:ascii="Times New Roman" w:hAnsi="Times New Roman" w:cs="Times New Roman" w:eastAsia="Times New Roman"/>
+          <w:sz w:val="24"/>
+          <w:szCs w:val="24"/>
+          <w:vertAlign w:val="superscript"/>
+        </w:rPr>
+        <w:t xml:space="preserve">[26]</w:t>
+      </w:r>
+      <w:r>
+        <w:rPr>
+          <w:rFonts w:ascii="Times New Roman" w:hAnsi="Times New Roman" w:cs="Times New Roman" w:eastAsia="Times New Roman"/>
+          <w:sz w:val="24"/>
+          <w:szCs w:val="24"/>
+        </w:rPr>
+        <w:t xml:space="preserve"> and computed 95% confidence intervals. OIS and TSA were calculated using standard formulas </w:t>
+      </w:r>
+      <w:r>
+        <w:rPr>
+          <w:rFonts w:ascii="Times New Roman" w:hAnsi="Times New Roman" w:cs="Times New Roman" w:eastAsia="Times New Roman"/>
+          <w:sz w:val="24"/>
+          <w:szCs w:val="24"/>
+          <w:vertAlign w:val="superscript"/>
+        </w:rPr>
+        <w:t xml:space="preserve">[6-9]</w:t>
+      </w:r>
+      <w:r>
+        <w:rPr>
+          <w:rFonts w:ascii="Times New Roman" w:hAnsi="Times New Roman" w:cs="Times New Roman" w:eastAsia="Times New Roman"/>
+          <w:sz w:val="24"/>
+          <w:szCs w:val="24"/>
+        </w:rPr>
+        <w:t xml:space="preserve">. All analyses were performed with the Python code in the public repository.</w:t>
+      </w:r>
+    </w:p>
+    <w:p>
+      <w:pPr>
         <w:pStyle w:val="Heading2"/>
       </w:pPr>
       <w:r>
@@ -4142,7 +3854,7 @@
           <w:sz w:val="24"/>
           <w:szCs w:val="24"/>
         </w:rPr>
-        <w:t xml:space="preserve">At the ISIS-4 sample size (N = 58,050) and the pre-ISIS-4 pooled effect (OR = 0.54), power exceeded 99% under all three event-rate scenarios. For a more modest effect (OR = 0.90), however, power was 95.8% under the pre-thrombolysis rate and 91.5% under the ISIS-4 rate (Fig. 3A). For statins, power to detect the observational effect (HR = 0.72) was 100.0% under the observational event rate and 100.0% under the RCT event rate; for a more modest effect (HR = 0.85), power fell from 98.4% to 83.2%—a 15 percentage-point reduction attributable to event dilution (Fig. 3B).</w:t>
+        <w:t xml:space="preserve">At the ISIS-4 sample size (N = 58,050) and the pre-ISIS-4 pooled effect (OR = 0.54), power exceeded 99% under all three event-rate scenarios. For a more modest effect (OR = 0.90), however, power was 95.8% under the pre-thrombolysis rate and 91.5% under the ISIS-4 rate (Fig. 3A). For statins, power to detect the observational effect (HR = 0.72) was 100.0% under the observational event rate and 100.0% under the RCT event rate; for a more modest effect (HR = 0.85), power fell from 98.4% to 83.2%---a 15 percentage-point reduction consistent with event dilution (Fig. 3B).</w:t>
       </w:r>
     </w:p>
     <w:p>
@@ -4394,7 +4106,7 @@
           <w:sz w:val="24"/>
           <w:szCs w:val="24"/>
         </w:rPr>
-        <w:t xml:space="preserve">was -2.90, crossing the lower O’Brien-Fleming boundary of -1.96 (which, because the cumulative information exceeded the optimal information size, equals the conventional two-sided boundary) (Fig. 5). This divergence reflects era-dependent treatment-effect heterogeneity driven by the ISIS-4 result.</w:t>
+        <w:t xml:space="preserve">was -2.90, crossing the lower O'Brien-Fleming boundary of -1.96 (which, because the cumulative information exceeded the optimal information size, equals the conventional two-sided boundary) (Fig. 5). This divergence is consistent with era-dependent treatment-effect heterogeneity, with the ISIS-4 result contributing substantially to that heterogeneity.</w:t>
       </w:r>
     </w:p>
     <w:p xmlns:a="http://schemas.openxmlformats.org/drawingml/2006/main" xmlns:pic="http://schemas.openxmlformats.org/drawingml/2006/picture">
@@ -4494,7 +4206,7 @@
       <w:r>
         <w:drawing>
           <wp:inline xmlns:a="http://schemas.openxmlformats.org/drawingml/2006/main" xmlns:pic="http://schemas.openxmlformats.org/drawingml/2006/picture">
-            <wp:extent cx="5029200" cy="2644843"/>
+            <wp:extent cx="5029200" cy="2598661"/>
             <wp:docPr id="4" name="Picture 4"/>
             <wp:cNvGraphicFramePr>
               <a:graphicFrameLocks noChangeAspect="1"/>
@@ -4515,7 +4227,7 @@
                   <pic:spPr>
                     <a:xfrm>
                       <a:off x="0" y="0"/>
-                      <a:ext cx="5029200" cy="2644843"/>
+                      <a:ext cx="5029200" cy="2598661"/>
                     </a:xfrm>
                     <a:prstGeom prst="rect"/>
                   </pic:spPr>
@@ -4543,7 +4255,7 @@
           <w:rFonts w:ascii="Times New Roman" w:hAnsi="Times New Roman"/>
           <w:sz w:val="20"/>
         </w:rPr>
-        <w:t>Forest plots for (A) magnesium in AMI and (B) statins in heart failure. Individual study effect estimates are shown with 95% confidence intervals. Pooled estimates include frequentist random-effects and Bayesian integrated estimates at selected discounting levels (α = 0.3, 0.5, 1.0 for magnesium; 0.1, 0.3, 0.5 for statins).</w:t>
+        <w:t>Forest plots for (A) magnesium in AMI and (B) statins in heart failure. Individual study effect estimates are shown with 95% confidence intervals. Pooled estimates include frequentist random-effects and Bayesian integrated estimates at selected discounting levels (alpha = 0.3, 0.5, 1.0 for magnesium; 0.1, 0.3, 0.5 for statins).</w:t>
       </w:r>
     </w:p>
     <w:p>
@@ -4942,7 +4654,7 @@
                 <w:sz w:val="20"/>
                 <w:szCs w:val="20"/>
               </w:rPr>
-              <w:t xml:space="preserve">OR 1.05 (0.03–27.97)</w:t>
+              <w:t xml:space="preserve">OR 1.05 (0.03--27.97)</w:t>
             </w:r>
           </w:p>
         </w:tc>
@@ -5052,7 +4764,7 @@
                 <w:sz w:val="20"/>
                 <w:szCs w:val="20"/>
               </w:rPr>
-              <w:t xml:space="preserve">HR 0.97 (0.58–1.65)</w:t>
+              <w:t xml:space="preserve">HR 0.97 (0.58--1.65)</w:t>
             </w:r>
           </w:p>
         </w:tc>
@@ -5162,7 +4874,7 @@
                 <w:sz w:val="20"/>
                 <w:szCs w:val="20"/>
               </w:rPr>
-              <w:t xml:space="preserve">OR 0.93 (0.15–2.92)</w:t>
+              <w:t xml:space="preserve">OR 0.93 (0.15--2.92)</w:t>
             </w:r>
           </w:p>
         </w:tc>
@@ -5272,7 +4984,7 @@
                 <w:sz w:val="20"/>
                 <w:szCs w:val="20"/>
               </w:rPr>
-              <w:t xml:space="preserve">HR 0.92 (0.53–1.64)</w:t>
+              <w:t xml:space="preserve">HR 0.92 (0.53--1.64)</w:t>
             </w:r>
           </w:p>
         </w:tc>
@@ -5382,7 +5094,7 @@
                 <w:sz w:val="20"/>
                 <w:szCs w:val="20"/>
               </w:rPr>
-              <w:t xml:space="preserve">OR 0.83 (0.22–1.75)</w:t>
+              <w:t xml:space="preserve">OR 0.83 (0.22--1.75)</w:t>
             </w:r>
           </w:p>
         </w:tc>
@@ -5492,7 +5204,7 @@
                 <w:sz w:val="20"/>
                 <w:szCs w:val="20"/>
               </w:rPr>
-              <w:t xml:space="preserve">HR 0.89 (0.53–1.41)</w:t>
+              <w:t xml:space="preserve">HR 0.89 (0.53--1.41)</w:t>
             </w:r>
           </w:p>
         </w:tc>
@@ -5602,7 +5314,7 @@
                 <w:sz w:val="20"/>
                 <w:szCs w:val="20"/>
               </w:rPr>
-              <w:t xml:space="preserve">OR 0.74 (0.25–1.43)</w:t>
+              <w:t xml:space="preserve">OR 0.74 (0.25--1.43)</w:t>
             </w:r>
           </w:p>
         </w:tc>
@@ -5712,7 +5424,7 @@
                 <w:sz w:val="20"/>
                 <w:szCs w:val="20"/>
               </w:rPr>
-              <w:t xml:space="preserve">HR 0.85 (0.55–1.24)</w:t>
+              <w:t xml:space="preserve">HR 0.85 (0.55--1.24)</w:t>
             </w:r>
           </w:p>
         </w:tc>
@@ -5822,7 +5534,7 @@
                 <w:sz w:val="20"/>
                 <w:szCs w:val="20"/>
               </w:rPr>
-              <w:t xml:space="preserve">OR 0.63 (0.28–1.10)</w:t>
+              <w:t xml:space="preserve">OR 0.63 (0.28--1.10)</w:t>
             </w:r>
           </w:p>
         </w:tc>
@@ -5932,7 +5644,7 @@
                 <w:sz w:val="20"/>
                 <w:szCs w:val="20"/>
               </w:rPr>
-              <w:t xml:space="preserve">HR 0.82 (0.59–1.10)</w:t>
+              <w:t xml:space="preserve">HR 0.82 (0.59--1.10)</w:t>
             </w:r>
           </w:p>
         </w:tc>
@@ -6042,7 +5754,7 @@
                 <w:sz w:val="20"/>
                 <w:szCs w:val="20"/>
               </w:rPr>
-              <w:t xml:space="preserve">OR 0.59 (0.29–0.98)</w:t>
+              <w:t xml:space="preserve">OR 0.59 (0.29--0.98)</w:t>
             </w:r>
           </w:p>
         </w:tc>
@@ -6152,7 +5864,7 @@
                 <w:sz w:val="20"/>
                 <w:szCs w:val="20"/>
               </w:rPr>
-              <w:t xml:space="preserve">HR 0.80 (0.62–1.00)</w:t>
+              <w:t xml:space="preserve">HR 0.80 (0.62--1.00)</w:t>
             </w:r>
           </w:p>
         </w:tc>
@@ -6262,7 +5974,7 @@
                 <w:sz w:val="20"/>
                 <w:szCs w:val="20"/>
               </w:rPr>
-              <w:t xml:space="preserve">OR 0.55 (0.32–0.87)</w:t>
+              <w:t xml:space="preserve">OR 0.55 (0.32--0.87)</w:t>
             </w:r>
           </w:p>
         </w:tc>
@@ -6372,7 +6084,7 @@
                 <w:sz w:val="20"/>
                 <w:szCs w:val="20"/>
               </w:rPr>
-              <w:t xml:space="preserve">HR 0.78 (0.64–0.93)</w:t>
+              <w:t xml:space="preserve">HR 0.78 (0.64--0.93)</w:t>
             </w:r>
           </w:p>
         </w:tc>
@@ -6488,7 +6200,7 @@
           <w:rFonts w:ascii="Times New Roman" w:hAnsi="Times New Roman"/>
           <w:sz w:val="20"/>
         </w:rPr>
-        <w:t>Sensitivity analysis of Bayesian integration to the discounting parameter α. (A) Magnesium in AMI. (B) Statins in HF. Three posterior probability thresholds are shown: P(effect &lt; 1.0), P(effect &lt; 0.90), and P(effect &lt; 0.80). Horizontal dashed line indicates 95% probability.</w:t>
+        <w:t>Sensitivity analysis of Bayesian integration to the discounting parameter alpha. (A) Magnesium in AMI. (B) Statins in HF. Three posterior probability thresholds are shown: P(effect &lt; 1.0), P(effect &lt; 0.90), and P(effect &lt; 0.80). Horizontal dashed line indicates 95% probability.</w:t>
       </w:r>
     </w:p>
     <w:p>
@@ -6643,55 +6355,7 @@
           <w:sz w:val="24"/>
           <w:szCs w:val="24"/>
         </w:rPr>
-        <w:t xml:space="preserve">(OIS reached but no TSA/CI boundary crossed; serious indirectness from enrollment-driven event dilution). In both cases, standard GRADE would be more likely to conclude</w:t>
-      </w:r>
-      <w:r>
-        <w:rPr>
-          <w:rFonts w:ascii="Times New Roman" w:hAnsi="Times New Roman" w:cs="Times New Roman" w:eastAsia="Times New Roman"/>
-          <w:sz w:val="24"/>
-          <w:szCs w:val="24"/>
-        </w:rPr>
-        <w:t xml:space="preserve"> </w:t>
-      </w:r>
-      <w:r>
-        <w:rPr>
-          <w:rFonts w:ascii="Times New Roman" w:hAnsi="Times New Roman" w:cs="Times New Roman" w:eastAsia="Times New Roman"/>
-          <w:sz w:val="24"/>
-          <w:szCs w:val="24"/>
-        </w:rPr>
-        <w:t xml:space="preserve">“</w:t>
-      </w:r>
-      <w:r>
-        <w:rPr>
-          <w:rFonts w:ascii="Times New Roman" w:hAnsi="Times New Roman" w:cs="Times New Roman" w:eastAsia="Times New Roman"/>
-          <w:sz w:val="24"/>
-          <w:szCs w:val="24"/>
-        </w:rPr>
-        <w:t xml:space="preserve">no benefit demonstrated,</w:t>
-      </w:r>
-      <w:r>
-        <w:rPr>
-          <w:rFonts w:ascii="Times New Roman" w:hAnsi="Times New Roman" w:cs="Times New Roman" w:eastAsia="Times New Roman"/>
-          <w:sz w:val="24"/>
-          <w:szCs w:val="24"/>
-        </w:rPr>
-        <w:t xml:space="preserve">”</w:t>
-      </w:r>
-      <w:r>
-        <w:rPr>
-          <w:rFonts w:ascii="Times New Roman" w:hAnsi="Times New Roman" w:cs="Times New Roman" w:eastAsia="Times New Roman"/>
-          <w:sz w:val="24"/>
-          <w:szCs w:val="24"/>
-        </w:rPr>
-        <w:t xml:space="preserve"> </w:t>
-      </w:r>
-      <w:r>
-        <w:rPr>
-          <w:rFonts w:ascii="Times New Roman" w:hAnsi="Times New Roman" w:cs="Times New Roman" w:eastAsia="Times New Roman"/>
-          <w:sz w:val="24"/>
-          <w:szCs w:val="24"/>
-        </w:rPr>
-        <w:t xml:space="preserve">whereas KOTHA explicitly labels the evidence as informationally insufficient.</w:t>
+        <w:t xml:space="preserve">(OIS reached but no TSA/CI boundary crossed; serious indirectness from enrollment-driven event dilution). In both cases, standard GRADE would be more likely to conclude "no benefit demonstrated," whereas KOTHA explicitly labels the evidence as informationally insufficient.</w:t>
       </w:r>
     </w:p>
     <w:p>
@@ -7433,23 +7097,7 @@
                 <w:sz w:val="20"/>
                 <w:szCs w:val="20"/>
               </w:rPr>
-              <w:t xml:space="preserve">“</w:t>
-            </w:r>
-            <w:r>
-              <w:rPr>
-                <w:rFonts w:ascii="Times New Roman" w:hAnsi="Times New Roman" w:cs="Times New Roman" w:eastAsia="Times New Roman"/>
-                <w:sz w:val="20"/>
-                <w:szCs w:val="20"/>
-              </w:rPr>
-              <w:t xml:space="preserve">No benefit demonstrated</w:t>
-            </w:r>
-            <w:r>
-              <w:rPr>
-                <w:rFonts w:ascii="Times New Roman" w:hAnsi="Times New Roman" w:cs="Times New Roman" w:eastAsia="Times New Roman"/>
-                <w:sz w:val="20"/>
-                <w:szCs w:val="20"/>
-              </w:rPr>
-              <w:t xml:space="preserve">”</w:t>
+              <w:t xml:space="preserve">"No benefit demonstrated"</w:t>
             </w:r>
           </w:p>
         </w:tc>
@@ -7467,23 +7115,7 @@
                 <w:sz w:val="20"/>
                 <w:szCs w:val="20"/>
               </w:rPr>
-              <w:t xml:space="preserve">“</w:t>
-            </w:r>
-            <w:r>
-              <w:rPr>
-                <w:rFonts w:ascii="Times New Roman" w:hAnsi="Times New Roman" w:cs="Times New Roman" w:eastAsia="Times New Roman"/>
-                <w:sz w:val="20"/>
-                <w:szCs w:val="20"/>
-              </w:rPr>
-              <w:t xml:space="preserve">Inconclusive; conditional recommendation</w:t>
-            </w:r>
-            <w:r>
-              <w:rPr>
-                <w:rFonts w:ascii="Times New Roman" w:hAnsi="Times New Roman" w:cs="Times New Roman" w:eastAsia="Times New Roman"/>
-                <w:sz w:val="20"/>
-                <w:szCs w:val="20"/>
-              </w:rPr>
-              <w:t xml:space="preserve">”</w:t>
+              <w:t xml:space="preserve">"Inconclusive; conditional recommendation"</w:t>
             </w:r>
           </w:p>
         </w:tc>
@@ -7501,23 +7133,7 @@
                 <w:sz w:val="20"/>
                 <w:szCs w:val="20"/>
               </w:rPr>
-              <w:t xml:space="preserve">“</w:t>
-            </w:r>
-            <w:r>
-              <w:rPr>
-                <w:rFonts w:ascii="Times New Roman" w:hAnsi="Times New Roman" w:cs="Times New Roman" w:eastAsia="Times New Roman"/>
-                <w:sz w:val="20"/>
-                <w:szCs w:val="20"/>
-              </w:rPr>
-              <w:t xml:space="preserve">No benefit demonstrated</w:t>
-            </w:r>
-            <w:r>
-              <w:rPr>
-                <w:rFonts w:ascii="Times New Roman" w:hAnsi="Times New Roman" w:cs="Times New Roman" w:eastAsia="Times New Roman"/>
-                <w:sz w:val="20"/>
-                <w:szCs w:val="20"/>
-              </w:rPr>
-              <w:t xml:space="preserve">”</w:t>
+              <w:t xml:space="preserve">"No benefit demonstrated"</w:t>
             </w:r>
           </w:p>
         </w:tc>
@@ -7535,23 +7151,7 @@
                 <w:sz w:val="20"/>
                 <w:szCs w:val="20"/>
               </w:rPr>
-              <w:t xml:space="preserve">“</w:t>
-            </w:r>
-            <w:r>
-              <w:rPr>
-                <w:rFonts w:ascii="Times New Roman" w:hAnsi="Times New Roman" w:cs="Times New Roman" w:eastAsia="Times New Roman"/>
-                <w:sz w:val="20"/>
-                <w:szCs w:val="20"/>
-              </w:rPr>
-              <w:t xml:space="preserve">Inconclusive; conditional recommendation</w:t>
-            </w:r>
-            <w:r>
-              <w:rPr>
-                <w:rFonts w:ascii="Times New Roman" w:hAnsi="Times New Roman" w:cs="Times New Roman" w:eastAsia="Times New Roman"/>
-                <w:sz w:val="20"/>
-                <w:szCs w:val="20"/>
-              </w:rPr>
-              <w:t xml:space="preserve">”</w:t>
+              <w:t xml:space="preserve">"Inconclusive; conditional recommendation"</w:t>
             </w:r>
           </w:p>
         </w:tc>
@@ -7655,7 +7255,7 @@
           <w:sz w:val="24"/>
           <w:szCs w:val="24"/>
         </w:rPr>
-        <w:t xml:space="preserve">The KOTHA Framework integrates counterfactual power simulation, Bayesian evidence synthesis, and structured GRADE interpretation to diagnose structural information loss in RCT meta-analyses. In the magnesium case, Module K identified a 18% temporal decline in control event rates from the pre-thrombolysis era to ISIS-4. The divergence between pre-ISIS-4 and all-trials estimates is better explained by era-dependent treatment effect heterogeneity (</w:t>
+        <w:t xml:space="preserve">The KOTHA Framework integrates counterfactual power simulation, Bayesian evidence synthesis, and structured GRADE interpretation to diagnose structural information loss in RCT meta-analyses. In the magnesium case, Module K identified a 18% temporal decline in control event rates from the pre-thrombolysis era to ISIS-4. The divergence between pre-ISIS-4 and all-trials estimates is more consistent with era-dependent treatment effect heterogeneity (</w:t>
       </w:r>
       <m:oMath>
         <m:sSup>
@@ -7685,39 +7285,7 @@
           <w:sz w:val="24"/>
           <w:szCs w:val="24"/>
         </w:rPr>
-        <w:t xml:space="preserve">= 62%) than by simple underpowering. In the statins case, Module K showed that RCT populations had roughly half the event rate of observational cohorts, and that power for a modest effect (HR = 0.85) dropped from 98% to 83%. Module T demonstrated that even modest borrowing from observational evidence shifted posterior probabilities of benefit substantially, but uncertainty remained. Module H classified magnesium as inconclusive with serious inconsistency (heterogeneity), and statins as inconclusive with serious indirectness, rather than</w:t>
-      </w:r>
-      <w:r>
-        <w:rPr>
-          <w:rFonts w:ascii="Times New Roman" w:hAnsi="Times New Roman" w:cs="Times New Roman" w:eastAsia="Times New Roman"/>
-          <w:sz w:val="24"/>
-          <w:szCs w:val="24"/>
-        </w:rPr>
-        <w:t xml:space="preserve"> </w:t>
-      </w:r>
-      <w:r>
-        <w:rPr>
-          <w:rFonts w:ascii="Times New Roman" w:hAnsi="Times New Roman" w:cs="Times New Roman" w:eastAsia="Times New Roman"/>
-          <w:sz w:val="24"/>
-          <w:szCs w:val="24"/>
-        </w:rPr>
-        <w:t xml:space="preserve">“</w:t>
-      </w:r>
-      <w:r>
-        <w:rPr>
-          <w:rFonts w:ascii="Times New Roman" w:hAnsi="Times New Roman" w:cs="Times New Roman" w:eastAsia="Times New Roman"/>
-          <w:sz w:val="24"/>
-          <w:szCs w:val="24"/>
-        </w:rPr>
-        <w:t xml:space="preserve">evidence of no effect.</w:t>
-      </w:r>
-      <w:r>
-        <w:rPr>
-          <w:rFonts w:ascii="Times New Roman" w:hAnsi="Times New Roman" w:cs="Times New Roman" w:eastAsia="Times New Roman"/>
-          <w:sz w:val="24"/>
-          <w:szCs w:val="24"/>
-        </w:rPr>
-        <w:t xml:space="preserve">”</w:t>
+        <w:t xml:space="preserve">= 62%) than with underpowering alone. In the statins case, Module K showed that RCT populations had roughly half the event rate of observational cohorts, and that power for a modest effect (HR = 0.85) dropped from 98% to 83%. Module T demonstrated that even modest borrowing from observational evidence shifted posterior probabilities of benefit substantially, but uncertainty remained. Module H classified magnesium as inconclusive with serious inconsistency (heterogeneity), and statins as inconclusive with serious indirectness, rather than "evidence of no effect."</w:t>
       </w:r>
     </w:p>
     <w:p>
@@ -7855,87 +7423,7 @@
           <w:sz w:val="24"/>
           <w:szCs w:val="24"/>
         </w:rPr>
-        <w:t xml:space="preserve">In this way, KOTHA moves the design conversation from</w:t>
-      </w:r>
-      <w:r>
-        <w:rPr>
-          <w:rFonts w:ascii="Times New Roman" w:hAnsi="Times New Roman" w:cs="Times New Roman" w:eastAsia="Times New Roman"/>
-          <w:sz w:val="24"/>
-          <w:szCs w:val="24"/>
-        </w:rPr>
-        <w:t xml:space="preserve"> </w:t>
-      </w:r>
-      <w:r>
-        <w:rPr>
-          <w:rFonts w:ascii="Times New Roman" w:hAnsi="Times New Roman" w:cs="Times New Roman" w:eastAsia="Times New Roman"/>
-          <w:sz w:val="24"/>
-          <w:szCs w:val="24"/>
-        </w:rPr>
-        <w:t xml:space="preserve">“</w:t>
-      </w:r>
-      <w:r>
-        <w:rPr>
-          <w:rFonts w:ascii="Times New Roman" w:hAnsi="Times New Roman" w:cs="Times New Roman" w:eastAsia="Times New Roman"/>
-          <w:sz w:val="24"/>
-          <w:szCs w:val="24"/>
-        </w:rPr>
-        <w:t xml:space="preserve">what sample size do we need under the planned effect?</w:t>
-      </w:r>
-      <w:r>
-        <w:rPr>
-          <w:rFonts w:ascii="Times New Roman" w:hAnsi="Times New Roman" w:cs="Times New Roman" w:eastAsia="Times New Roman"/>
-          <w:sz w:val="24"/>
-          <w:szCs w:val="24"/>
-        </w:rPr>
-        <w:t xml:space="preserve">”</w:t>
-      </w:r>
-      <w:r>
-        <w:rPr>
-          <w:rFonts w:ascii="Times New Roman" w:hAnsi="Times New Roman" w:cs="Times New Roman" w:eastAsia="Times New Roman"/>
-          <w:sz w:val="24"/>
-          <w:szCs w:val="24"/>
-        </w:rPr>
-        <w:t xml:space="preserve"> </w:t>
-      </w:r>
-      <w:r>
-        <w:rPr>
-          <w:rFonts w:ascii="Times New Roman" w:hAnsi="Times New Roman" w:cs="Times New Roman" w:eastAsia="Times New Roman"/>
-          <w:sz w:val="24"/>
-          <w:szCs w:val="24"/>
-        </w:rPr>
-        <w:t xml:space="preserve">to</w:t>
-      </w:r>
-      <w:r>
-        <w:rPr>
-          <w:rFonts w:ascii="Times New Roman" w:hAnsi="Times New Roman" w:cs="Times New Roman" w:eastAsia="Times New Roman"/>
-          <w:sz w:val="24"/>
-          <w:szCs w:val="24"/>
-        </w:rPr>
-        <w:t xml:space="preserve"> </w:t>
-      </w:r>
-      <w:r>
-        <w:rPr>
-          <w:rFonts w:ascii="Times New Roman" w:hAnsi="Times New Roman" w:cs="Times New Roman" w:eastAsia="Times New Roman"/>
-          <w:sz w:val="24"/>
-          <w:szCs w:val="24"/>
-        </w:rPr>
-        <w:t xml:space="preserve">“</w:t>
-      </w:r>
-      <w:r>
-        <w:rPr>
-          <w:rFonts w:ascii="Times New Roman" w:hAnsi="Times New Roman" w:cs="Times New Roman" w:eastAsia="Times New Roman"/>
-          <w:sz w:val="24"/>
-          <w:szCs w:val="24"/>
-        </w:rPr>
-        <w:t xml:space="preserve">what sample size do we need under the event rate we will actually observe in the enrolled population?</w:t>
-      </w:r>
-      <w:r>
-        <w:rPr>
-          <w:rFonts w:ascii="Times New Roman" w:hAnsi="Times New Roman" w:cs="Times New Roman" w:eastAsia="Times New Roman"/>
-          <w:sz w:val="24"/>
-          <w:szCs w:val="24"/>
-        </w:rPr>
-        <w:t xml:space="preserve">”</w:t>
+        <w:t xml:space="preserve">In this way, KOTHA moves the design conversation from "what sample size do we need under the planned effect?" to "what sample size do we need under the event rate we will actually observe in the enrolled population?"</w:t>
       </w:r>
     </w:p>
     <w:p>
@@ -8031,7 +7519,7 @@
           <w:sz w:val="24"/>
           <w:szCs w:val="24"/>
         </w:rPr>
-        <w:t xml:space="preserve">; KOTHA provides quantitative inputs to the imprecision and indirectness domains without changing GRADE’s structure.</w:t>
+        <w:t xml:space="preserve">; KOTHA provides quantitative inputs to the imprecision and indirectness domains without changing GRADE's structure.</w:t>
       </w:r>
     </w:p>
     <w:p>
@@ -8294,7 +7782,7 @@
           <w:sz w:val="24"/>
           <w:szCs w:val="24"/>
         </w:rPr>
-        <w:t xml:space="preserve">The KOTHA Framework (Knowledge-driven Observational-Trial Harmonization Approach) addresses structural information loss in RCT meta-analyses through counterfactual power simulation, hierarchical Bayesian evidence integration, and structured GRADE-compatible interpretation. Empirical application to magnesium in AMI and statins in heart failure demonstrates that the framework can identify enrollment-driven event dilution, quantify its impact on statistical power, and produce more nuanced evidence assessments than standard approaches. By translating these diagnostics into prespecified sample size, eligibility, enrichment, and endpoint decisions, KOTHA offers a reproducible design aid for future clinical trials.</w:t>
+        <w:t xml:space="preserve">The KOTHA Framework (Knowledge-driven Observational-Trial Harmonization Approach) diagnoses structural information loss in RCT meta-analyses through counterfactual power simulation, hierarchical Bayesian evidence integration, and structured GRADE-compatible interpretation. Empirical application to magnesium in AMI and statins in heart failure demonstrates that the framework can identify enrollment-driven event dilution, quantify its impact on statistical power, and produce more nuanced evidence assessments than standard approaches. By translating these diagnostics into prespecified sample size, eligibility, enrichment, and endpoint decisions, KOTHA offers a reproducible design aid for future clinical trials.</w:t>
       </w:r>
     </w:p>
     <w:p>
@@ -8940,7 +8428,7 @@
     <w:lvl w:ilvl="0">
       <w:start w:val="1"/>
       <w:numFmt w:val="bullet"/>
-      <w:lvlText w:val=""/>
+      <w:lvlText w:val="-"/>
       <w:lvlJc w:val="left"/>
       <w:pPr>
         <w:tabs>
@@ -8961,7 +8449,7 @@
       <w:start w:val="1"/>
       <w:numFmt w:val="bullet"/>
       <w:pStyle w:val="ListBullet3"/>
-      <w:lvlText w:val=""/>
+      <w:lvlText w:val="-"/>
       <w:lvlJc w:val="left"/>
       <w:pPr>
         <w:tabs>
@@ -8982,7 +8470,7 @@
       <w:start w:val="1"/>
       <w:numFmt w:val="bullet"/>
       <w:pStyle w:val="ListBullet2"/>
-      <w:lvlText w:val=""/>
+      <w:lvlText w:val="-"/>
       <w:lvlJc w:val="left"/>
       <w:pPr>
         <w:tabs>
@@ -9021,7 +8509,7 @@
       <w:start w:val="1"/>
       <w:numFmt w:val="bullet"/>
       <w:pStyle w:val="ListBullet"/>
-      <w:lvlText w:val=""/>
+      <w:lvlText w:val="-"/>
       <w:lvlJc w:val="left"/>
       <w:pPr>
         <w:tabs>
@@ -32765,10 +32253,10 @@
         <a:latin typeface="Calibri"/>
         <a:ea typeface=""/>
         <a:cs typeface=""/>
-        <a:font script="Jpan" typeface="ＭＳ ゴシック"/>
-        <a:font script="Hang" typeface="맑은 고딕"/>
-        <a:font script="Hans" typeface="宋体"/>
-        <a:font script="Hant" typeface="新細明體"/>
+        <a:font script="Jpan" typeface="MS Gothic"/>
+        <a:font script="Hang" typeface="Malgun Gothic"/>
+        <a:font script="Hans" typeface="SimSun"/>
+        <a:font script="Hant" typeface="PMingLiU"/>
         <a:font script="Arab" typeface="Times New Roman"/>
         <a:font script="Hebr" typeface="Times New Roman"/>
         <a:font script="Thai" typeface="Angsana New"/>
@@ -32800,10 +32288,10 @@
         <a:latin typeface="Cambria"/>
         <a:ea typeface=""/>
         <a:cs typeface=""/>
-        <a:font script="Jpan" typeface="ＭＳ 明朝"/>
-        <a:font script="Hang" typeface="맑은 고딕"/>
-        <a:font script="Hans" typeface="宋体"/>
-        <a:font script="Hant" typeface="新細明體"/>
+        <a:font script="Jpan" typeface="MS Mincho"/>
+        <a:font script="Hang" typeface="Malgun Gothic"/>
+        <a:font script="Hans" typeface="SimSun"/>
+        <a:font script="Hant" typeface="PMingLiU"/>
         <a:font script="Arab" typeface="Arial"/>
         <a:font script="Hebr" typeface="Arial"/>
         <a:font script="Thai" typeface="Cordia New"/>

</xml_diff>

<commit_message>
Final Clinical Trials verification: cross-references, OMML math, double-byte sanitization, English naturalness, critical review
Co-Authored-By: Tatsuki Onishi <bougtoir@gmail.com>
</commit_message>
<xml_diff>
--- a/rct-decomposition/KOTHA_Framework_CCTC.docx
+++ b/rct-decomposition/KOTHA_Framework_CCTC.docx
@@ -88,7 +88,7 @@
           <w:i w:val="0"/>
           <w:sz w:val="24"/>
         </w:rPr>
-        <w:t>Word count: 2686</w:t>
+        <w:t>Word count: 2677</w:t>
       </w:r>
     </w:p>
     <w:p>
@@ -212,7 +212,7 @@
           <w:sz w:val="24"/>
           <w:szCs w:val="24"/>
         </w:rPr>
-        <w:t xml:space="preserve">: Evidence-based medicine ranks RCTs and meta-analyses highest, yet observational-RCT discordance is usually attributed to confounding. We highlight a structural explanation: trial enrollment progressively excludes higher-risk patients, diluting event rates and statistical information. The Knowledge-driven Observational-Trial Harmonization Approach (KOTHA) Framework diagnoses this structural information loss. We aimed to develop and illustrate KOTHA so that trialists can distinguish structural information loss from residual confounding and inform sample size, eligibility, enrichment, and endpoint decisions in prospective trial design.</w:t>
+        <w:t xml:space="preserve">: Evidence-based medicine places RCTs and meta-analyses at the top of the evidence hierarchy, yet when observational and RCT evidence disagree the usual explanation is residual confounding. We highlight a structural explanation: trial enrollment progressively excludes higher-risk patients, diluting event rates and statistical information. The Knowledge-driven Observational-Trial Harmonization Approach (KOTHA) Framework diagnoses this structural information loss. We aimed to develop and illustrate KOTHA so that trialists can distinguish structural information loss from residual confounding and inform sample size, eligibility, enrichment, and endpoint decisions in prospective trial design.</w:t>
       </w:r>
     </w:p>
     <w:p xmlns:a="http://schemas.openxmlformats.org/drawingml/2006/main" xmlns:pic="http://schemas.openxmlformats.org/drawingml/2006/picture">
@@ -1077,7 +1077,7 @@
           <w:sz w:val="24"/>
           <w:szCs w:val="24"/>
         </w:rPr>
-        <w:t xml:space="preserve">. However, these tools are underused in guideline development, and neither directly quantifies the information loss resulting from enrollment-driven risk-profile shifts.</w:t>
+        <w:t xml:space="preserve">. Both are underused in guideline development, however, and neither directly quantifies the information loss produced by enrollment-driven risk-profile shifts.</w:t>
       </w:r>
     </w:p>
     <w:p xmlns:a="http://schemas.openxmlformats.org/drawingml/2006/main" xmlns:pic="http://schemas.openxmlformats.org/drawingml/2006/picture">
@@ -1105,7 +1105,7 @@
           <w:sz w:val="24"/>
           <w:szCs w:val="24"/>
         </w:rPr>
-        <w:t xml:space="preserve">We therefore developed the Knowledge-driven Observational-Trial Harmonization Approach (KOTHA) Framework. It is a three-module system that (1) diagnoses structural information loss through counterfactual power simulation (Module K), (2) integrates discordant evidence through hierarchical Bayesian meta-analysis (Module T), and (3) translates quantitative findings into GRADE-compatible evidence assessment (Module H). This paper describes the framework and illustrates its application to two canonical cases of observational-RCT divergence, with an emphasis on implications for clinical trial design.</w:t>
+        <w:t xml:space="preserve">To address this gap we developed the Knowledge-driven Observational-Trial Harmonization Approach (KOTHA). The framework has three modules: Module K diagnoses structural information loss through counterfactual power simulation; Module T integrates discordant evidence through hierarchical Bayesian meta-analysis; and Module H translates quantitative findings into a GRADE-compatible evidence assessment. We describe the framework here and illustrate it with two canonical cases of observational-RCT divergence, focusing on implications for clinical trial design.</w:t>
       </w:r>
     </w:p>
     <w:p>
@@ -3941,7 +3941,7 @@
           <w:sz w:val="24"/>
           <w:szCs w:val="24"/>
         </w:rPr>
-        <w:t xml:space="preserve">Forest plots for magnesium and statins are shown in Fig. 4. Random-effects meta-analysis of the 11 pre-ISIS-4 magnesium trials yielded OR = 0.54 (95% CI: 0.40-0.75) with</w:t>
+        <w:t xml:space="preserve">Fig. 4 shows forest plots for magnesium and statins. Random-effects meta-analysis of the 11 pre-ISIS-4 magnesium trials yielded OR = 0.54 (95% CI: 0.40-0.75) with</w:t>
       </w:r>
       <w:r>
         <w:rPr>
@@ -4017,7 +4017,7 @@
           <w:sz w:val="24"/>
           <w:szCs w:val="24"/>
         </w:rPr>
-        <w:t xml:space="preserve">= 62% (Fig. 4A). TSA under a fixed-effect accumulation produced a final cumulative</w:t>
+        <w:t xml:space="preserve">= 62% (Fig. 4A). Under fixed-effect accumulation the final cumulative</w:t>
       </w:r>
       <w:r>
         <w:rPr>
@@ -4046,7 +4046,7 @@
           <w:sz w:val="24"/>
           <w:szCs w:val="24"/>
         </w:rPr>
-        <w:t xml:space="preserve">of 0.80, which did not cross the conventional two-sided boundary for benefit or harm (</w:t>
+        <w:t xml:space="preserve">was 0.80, which did not cross the conventional two-sided boundary for benefit or harm (</w:t>
       </w:r>
       <m:oMath>
         <m:d>
@@ -4077,7 +4077,7 @@
           <w:sz w:val="24"/>
           <w:szCs w:val="24"/>
         </w:rPr>
-        <w:t xml:space="preserve">= 1.96); under a random-effects accumulation the final</w:t>
+        <w:t xml:space="preserve">= 1.96); under random-effects accumulation the final</w:t>
       </w:r>
       <w:r>
         <w:rPr>
@@ -4106,7 +4106,7 @@
           <w:sz w:val="24"/>
           <w:szCs w:val="24"/>
         </w:rPr>
-        <w:t xml:space="preserve">was -2.90, crossing the lower O'Brien-Fleming boundary of -1.96 (which, because the cumulative information exceeded the optimal information size, equals the conventional two-sided boundary) (Fig. 5). This divergence is consistent with era-dependent treatment-effect heterogeneity, with the ISIS-4 result contributing substantially to that heterogeneity.</w:t>
+        <w:t xml:space="preserve">was -2.90, crossing the lower O'Brien-Fleming boundary of -1.96. Because cumulative information exceeded the optimal information size, this boundary equals the conventional two-sided boundary (Fig. 5). This divergence is consistent with era-dependent treatment-effect heterogeneity, with the ISIS-4 result contributing substantially to that heterogeneity.</w:t>
       </w:r>
     </w:p>
     <w:p xmlns:a="http://schemas.openxmlformats.org/drawingml/2006/main" xmlns:pic="http://schemas.openxmlformats.org/drawingml/2006/picture">
@@ -7285,7 +7285,7 @@
           <w:sz w:val="24"/>
           <w:szCs w:val="24"/>
         </w:rPr>
-        <w:t xml:space="preserve">= 62%) than with underpowering alone. In the statins case, Module K showed that RCT populations had roughly half the event rate of observational cohorts, and that power for a modest effect (HR = 0.85) dropped from 98% to 83%. Module T demonstrated that even modest borrowing from observational evidence shifted posterior probabilities of benefit substantially, but uncertainty remained. Module H classified magnesium as inconclusive with serious inconsistency (heterogeneity), and statins as inconclusive with serious indirectness, rather than "evidence of no effect."</w:t>
+        <w:t xml:space="preserve">= 62%) than with underpowering alone. In the statins case, Module K showed that RCT populations had roughly half the event rate of observational cohorts, and that power for a modest effect (HR = 0.85) dropped from 98% to 83%. Module T showed that even modest borrowing from observational evidence materially raised the posterior probability of benefit, yet the evidence remained uncertain. Module H classified magnesium as inconclusive with serious inconsistency (heterogeneity), and statins as inconclusive with serious indirectness, rather than "evidence of no effect."</w:t>
       </w:r>
     </w:p>
     <w:p>
@@ -7423,7 +7423,7 @@
           <w:sz w:val="24"/>
           <w:szCs w:val="24"/>
         </w:rPr>
-        <w:t xml:space="preserve">In this way, KOTHA moves the design conversation from "what sample size do we need under the planned effect?" to "what sample size do we need under the event rate we will actually observe in the enrolled population?"</w:t>
+        <w:t xml:space="preserve">This reframes the design question: instead of asking what sample size is needed under a hypothesized effect, the trialist asks what sample size is needed given the event rate that the enrolled population will actually display.</w:t>
       </w:r>
     </w:p>
     <w:p>

</xml_diff>

<commit_message>
refine Discussion phrasing: an 18% relative decline
Co-Authored-By: Tatsuki Onishi <bougtoir@gmail.com>
</commit_message>
<xml_diff>
--- a/rct-decomposition/KOTHA_Framework_CCTC.docx
+++ b/rct-decomposition/KOTHA_Framework_CCTC.docx
@@ -7255,7 +7255,7 @@
           <w:sz w:val="24"/>
           <w:szCs w:val="24"/>
         </w:rPr>
-        <w:t xml:space="preserve">The KOTHA Framework integrates counterfactual power simulation, Bayesian evidence synthesis, and structured GRADE interpretation to diagnose structural information loss in RCT meta-analyses. In the magnesium case, Module K identified a 18% temporal decline in control event rates from the pre-thrombolysis era to ISIS-4. The divergence between pre-ISIS-4 and all-trials estimates is more consistent with era-dependent treatment effect heterogeneity (</w:t>
+        <w:t xml:space="preserve">The KOTHA Framework integrates counterfactual power simulation, Bayesian evidence synthesis, and structured GRADE interpretation to diagnose structural information loss in RCT meta-analyses. In the magnesium case, Module K identified an 18% relative decline in control event rates from the pre-thrombolysis era to ISIS-4. The divergence between pre-ISIS-4 and all-trials estimates is more consistent with era-dependent treatment effect heterogeneity (</w:t>
       </w:r>
       <m:oMath>
         <m:sSup>
@@ -8428,7 +8428,7 @@
     <w:lvl w:ilvl="0">
       <w:start w:val="1"/>
       <w:numFmt w:val="bullet"/>
-      <w:lvlText w:val="-"/>
+      <w:lvlText w:val=""/>
       <w:lvlJc w:val="left"/>
       <w:pPr>
         <w:tabs>
@@ -8449,7 +8449,7 @@
       <w:start w:val="1"/>
       <w:numFmt w:val="bullet"/>
       <w:pStyle w:val="ListBullet3"/>
-      <w:lvlText w:val="-"/>
+      <w:lvlText w:val=""/>
       <w:lvlJc w:val="left"/>
       <w:pPr>
         <w:tabs>
@@ -8470,7 +8470,7 @@
       <w:start w:val="1"/>
       <w:numFmt w:val="bullet"/>
       <w:pStyle w:val="ListBullet2"/>
-      <w:lvlText w:val="-"/>
+      <w:lvlText w:val=""/>
       <w:lvlJc w:val="left"/>
       <w:pPr>
         <w:tabs>
@@ -8509,7 +8509,7 @@
       <w:start w:val="1"/>
       <w:numFmt w:val="bullet"/>
       <w:pStyle w:val="ListBullet"/>
-      <w:lvlText w:val="-"/>
+      <w:lvlText w:val=""/>
       <w:lvlJc w:val="left"/>
       <w:pPr>
         <w:tabs>
@@ -32253,10 +32253,10 @@
         <a:latin typeface="Calibri"/>
         <a:ea typeface=""/>
         <a:cs typeface=""/>
-        <a:font script="Jpan" typeface="MS Gothic"/>
-        <a:font script="Hang" typeface="Malgun Gothic"/>
-        <a:font script="Hans" typeface="SimSun"/>
-        <a:font script="Hant" typeface="PMingLiU"/>
+        <a:font script="Jpan" typeface="ＭＳ ゴシック"/>
+        <a:font script="Hang" typeface="맑은 고딕"/>
+        <a:font script="Hans" typeface="宋体"/>
+        <a:font script="Hant" typeface="新細明體"/>
         <a:font script="Arab" typeface="Times New Roman"/>
         <a:font script="Hebr" typeface="Times New Roman"/>
         <a:font script="Thai" typeface="Angsana New"/>
@@ -32288,10 +32288,10 @@
         <a:latin typeface="Cambria"/>
         <a:ea typeface=""/>
         <a:cs typeface=""/>
-        <a:font script="Jpan" typeface="MS Mincho"/>
-        <a:font script="Hang" typeface="Malgun Gothic"/>
-        <a:font script="Hans" typeface="SimSun"/>
-        <a:font script="Hant" typeface="PMingLiU"/>
+        <a:font script="Jpan" typeface="ＭＳ 明朝"/>
+        <a:font script="Hang" typeface="맑은 고딕"/>
+        <a:font script="Hans" typeface="宋体"/>
+        <a:font script="Hant" typeface="新細明體"/>
         <a:font script="Arab" typeface="Arial"/>
         <a:font script="Hebr" typeface="Arial"/>
         <a:font script="Thai" typeface="Cordia New"/>

</xml_diff>

<commit_message>
Add formal causal model and operating-characteristics simulation for KOTHA; update CCTC manuscript title; sync workflow mapping for new branch
Co-Authored-By: Tatsuki Onishi <bougtoir@gmail.com>
</commit_message>
<xml_diff>
--- a/rct-decomposition/KOTHA_Framework_CCTC.docx
+++ b/rct-decomposition/KOTHA_Framework_CCTC.docx
@@ -13,7 +13,7 @@
           <w:i w:val="0"/>
           <w:sz w:val="24"/>
         </w:rPr>
-        <w:t>Running head: KOTHA Framework for Trial Design</w:t>
+        <w:t>Running head: KOTHA Framework for Information Loss</w:t>
       </w:r>
     </w:p>
     <w:p>
@@ -27,7 +27,7 @@
           <w:i w:val="0"/>
           <w:sz w:val="28"/>
         </w:rPr>
-        <w:t>The KOTHA Framework: Diagnosing Structural Information Loss in Randomized Controlled Trial Meta-Analyses to Inform Trial Design</w:t>
+        <w:t>The KOTHA Framework: A Simulation-Based Approach to Quantifying and Correcting Structural Information Loss in Randomized Controlled Trial Meta-Analyses</w:t>
       </w:r>
     </w:p>
     <w:p>
@@ -88,7 +88,7 @@
           <w:i w:val="0"/>
           <w:sz w:val="24"/>
         </w:rPr>
-        <w:t>Word count: 2677</w:t>
+        <w:t>Word count: 3258</w:t>
       </w:r>
     </w:p>
     <w:p>
@@ -3076,7 +3076,622 @@
           <w:sz w:val="24"/>
           <w:szCs w:val="24"/>
         </w:rPr>
-        <w:t xml:space="preserve">. It includes five assessments (Table 2): information sufficiency (OIS vs observed events), confidence interval interpretation, representativeness (event rate ratio), TSA boundary status, and recommended language. For CI interpretation, we used relative effect boundaries of 0.80 and 1.25 to define clinically important benefit and harm. For representativeness, event-rate ratios below 0.67 or above 1.50 (a relative shift of 50% or more) are classified as serious indirectness, and ratios below 0.80 or above 1.25 (a relative shift of 25% or more) as moderate indirectness. These thresholds correspond to conventional boundaries for clinically important relative effects. The result is a KOTHA-enhanced certainty rating and recommendation that explicitly distinguishes "evidence of effect," "evidence of no effect," and "no evidence of effect (inconsistent or indirect).</w:t>
+        <w:t xml:space="preserve">. It includes five assessments (Table 2): information sufficiency (OIS vs observed events), confidence interval interpretation, representativeness (event rate ratio), TSA boundary status, and recommended language. For CI interpretation, we used relative effect boundaries of 0.80 and 1.25 to define clinically important benefit and harm. For representativeness, event-rate ratios below 0.67 or above 1.50 (a relative shift of 50% or more) are classified as serious indirectness, and ratios below 0.80 or above 1.25 (a relative shift of 25% or more) as moderate indirectness. These thresholds correspond to conventional boundaries for clinically important relative effects. The result is a KOTHA-enhanced certainty rating and recommendation that explicitly distinguishes "evidence of effect," "evidence of no effect," and "no evidence of effect (inconsistent or indirect)."</w:t>
+      </w:r>
+    </w:p>
+    <w:p>
+      <w:pPr>
+        <w:pStyle w:val="Heading3"/>
+      </w:pPr>
+      <w:r>
+        <w:rPr>
+          <w:rFonts w:ascii="Times New Roman" w:hAnsi="Times New Roman"/>
+          <w:b/>
+          <w:color w:val="000000"/>
+          <w:sz w:val="24"/>
+        </w:rPr>
+        <w:t>Formal causal model and operating-characteristics simulation</w:t>
+      </w:r>
+    </w:p>
+    <w:p xmlns:a="http://schemas.openxmlformats.org/drawingml/2006/main" xmlns:pic="http://schemas.openxmlformats.org/drawingml/2006/picture">
+      <w:pPr>
+        <w:pStyle w:val="Normal"/>
+        <w:spacing w:line="480" w:lineRule="auto" w:after="120"/>
+      </w:pPr>
+      <w:r>
+        <w:rPr>
+          <w:rFonts w:ascii="Times New Roman" w:hAnsi="Times New Roman" w:cs="Times New Roman" w:eastAsia="Times New Roman"/>
+          <w:sz w:val="24"/>
+          <w:szCs w:val="24"/>
+        </w:rPr>
+        <w:t xml:space="preserve">To quantify the operating characteristics of the KOTHA evidence combination rule, we specified a transparent data-generating process that mimics the two empirical cases. Let</w:t>
+      </w:r>
+      <w:r>
+        <w:rPr>
+          <w:rFonts w:ascii="Times New Roman" w:hAnsi="Times New Roman" w:cs="Times New Roman" w:eastAsia="Times New Roman"/>
+          <w:sz w:val="24"/>
+          <w:szCs w:val="24"/>
+        </w:rPr>
+        <w:t xml:space="preserve"> </w:t>
+      </w:r>
+      <m:oMath>
+        <m:sSub>
+          <m:e>
+            <m:r>
+              <m:t>Z</m:t>
+            </m:r>
+          </m:e>
+          <m:sub>
+            <m:r>
+              <m:t>i</m:t>
+            </m:r>
+          </m:sub>
+        </m:sSub>
+        <m:r>
+          <m:rPr>
+            <m:sty m:val="p"/>
+          </m:rPr>
+          <m:t>∼</m:t>
+        </m:r>
+        <m:r>
+          <m:rPr>
+            <m:nor/>
+            <m:sty m:val="p"/>
+          </m:rPr>
+          <m:t>Logit-Normal</m:t>
+        </m:r>
+        <m:d>
+          <m:dPr>
+            <m:begChr m:val="("/>
+            <m:endChr m:val=")"/>
+            <m:sepChr m:val=""/>
+            <m:grow/>
+          </m:dPr>
+          <m:e>
+            <m:sSub>
+              <m:e>
+                <m:r>
+                  <m:t>μ</m:t>
+                </m:r>
+              </m:e>
+              <m:sub>
+                <m:r>
+                  <m:t>Z</m:t>
+                </m:r>
+              </m:sub>
+            </m:sSub>
+            <m:r>
+              <m:rPr>
+                <m:sty m:val="p"/>
+              </m:rPr>
+              <m:t>,</m:t>
+            </m:r>
+            <m:sSubSup>
+              <m:e>
+                <m:r>
+                  <m:t>σ</m:t>
+                </m:r>
+              </m:e>
+              <m:sub>
+                <m:r>
+                  <m:t>Z</m:t>
+                </m:r>
+              </m:sub>
+              <m:sup>
+                <m:r>
+                  <m:t>2</m:t>
+                </m:r>
+              </m:sup>
+            </m:sSubSup>
+          </m:e>
+        </m:d>
+      </m:oMath>
+      <w:r>
+        <w:rPr>
+          <w:rFonts w:ascii="Times New Roman" w:hAnsi="Times New Roman" w:cs="Times New Roman" w:eastAsia="Times New Roman"/>
+          <w:sz w:val="24"/>
+          <w:szCs w:val="24"/>
+        </w:rPr>
+        <w:t xml:space="preserve"> </w:t>
+      </w:r>
+      <w:r>
+        <w:rPr>
+          <w:rFonts w:ascii="Times New Roman" w:hAnsi="Times New Roman" w:cs="Times New Roman" w:eastAsia="Times New Roman"/>
+          <w:sz w:val="24"/>
+          <w:szCs w:val="24"/>
+        </w:rPr>
+        <w:t xml:space="preserve">denote the baseline risk of trial</w:t>
+      </w:r>
+      <w:r>
+        <w:rPr>
+          <w:rFonts w:ascii="Times New Roman" w:hAnsi="Times New Roman" w:cs="Times New Roman" w:eastAsia="Times New Roman"/>
+          <w:sz w:val="24"/>
+          <w:szCs w:val="24"/>
+        </w:rPr>
+        <w:t xml:space="preserve"> </w:t>
+      </w:r>
+      <m:oMath>
+        <m:r>
+          <m:t>i</m:t>
+        </m:r>
+      </m:oMath>
+      <w:r>
+        <w:rPr>
+          <w:rFonts w:ascii="Times New Roman" w:hAnsi="Times New Roman" w:cs="Times New Roman" w:eastAsia="Times New Roman"/>
+          <w:sz w:val="24"/>
+          <w:szCs w:val="24"/>
+        </w:rPr>
+        <w:t xml:space="preserve"> </w:t>
+      </w:r>
+      <w:r>
+        <w:rPr>
+          <w:rFonts w:ascii="Times New Roman" w:hAnsi="Times New Roman" w:cs="Times New Roman" w:eastAsia="Times New Roman"/>
+          <w:sz w:val="24"/>
+          <w:szCs w:val="24"/>
+        </w:rPr>
+        <w:t xml:space="preserve">on the log-odds scale. The true treatment effect in that population is</w:t>
+      </w:r>
+      <w:r>
+        <w:rPr>
+          <w:rFonts w:ascii="Times New Roman" w:hAnsi="Times New Roman" w:cs="Times New Roman" w:eastAsia="Times New Roman"/>
+          <w:sz w:val="24"/>
+          <w:szCs w:val="24"/>
+        </w:rPr>
+        <w:t xml:space="preserve"> </w:t>
+      </w:r>
+      <m:oMath>
+        <m:sSub>
+          <m:e>
+            <m:r>
+              <m:rPr>
+                <m:nor/>
+                <m:sty m:val="p"/>
+              </m:rPr>
+              <m:t>log OR</m:t>
+            </m:r>
+          </m:e>
+          <m:sub>
+            <m:r>
+              <m:t>i</m:t>
+            </m:r>
+          </m:sub>
+        </m:sSub>
+        <m:r>
+          <m:rPr>
+            <m:sty m:val="p"/>
+          </m:rPr>
+          <m:t>=</m:t>
+        </m:r>
+        <m:sSub>
+          <m:e>
+            <m:r>
+              <m:t>θ</m:t>
+            </m:r>
+          </m:e>
+          <m:sub>
+            <m:r>
+              <m:t>0</m:t>
+            </m:r>
+          </m:sub>
+        </m:sSub>
+        <m:r>
+          <m:rPr>
+            <m:sty m:val="p"/>
+          </m:rPr>
+          <m:t>+</m:t>
+        </m:r>
+        <m:r>
+          <m:t>γ</m:t>
+        </m:r>
+        <m:sSub>
+          <m:e>
+            <m:r>
+              <m:t>Z</m:t>
+            </m:r>
+          </m:e>
+          <m:sub>
+            <m:r>
+              <m:t>i</m:t>
+            </m:r>
+          </m:sub>
+        </m:sSub>
+      </m:oMath>
+      <w:r>
+        <w:rPr>
+          <w:rFonts w:ascii="Times New Roman" w:hAnsi="Times New Roman" w:cs="Times New Roman" w:eastAsia="Times New Roman"/>
+          <w:sz w:val="24"/>
+          <w:szCs w:val="24"/>
+        </w:rPr>
+        <w:t xml:space="preserve">, with</w:t>
+      </w:r>
+      <w:r>
+        <w:rPr>
+          <w:rFonts w:ascii="Times New Roman" w:hAnsi="Times New Roman" w:cs="Times New Roman" w:eastAsia="Times New Roman"/>
+          <w:sz w:val="24"/>
+          <w:szCs w:val="24"/>
+        </w:rPr>
+        <w:t xml:space="preserve"> </w:t>
+      </w:r>
+      <m:oMath>
+        <m:r>
+          <m:t>γ</m:t>
+        </m:r>
+        <m:r>
+          <m:rPr>
+            <m:sty m:val="p"/>
+          </m:rPr>
+          <m:t>&lt;</m:t>
+        </m:r>
+        <m:r>
+          <m:t>0</m:t>
+        </m:r>
+      </m:oMath>
+      <w:r>
+        <w:rPr>
+          <w:rFonts w:ascii="Times New Roman" w:hAnsi="Times New Roman" w:cs="Times New Roman" w:eastAsia="Times New Roman"/>
+          <w:sz w:val="24"/>
+          <w:szCs w:val="24"/>
+        </w:rPr>
+        <w:t xml:space="preserve"> </w:t>
+      </w:r>
+      <w:r>
+        <w:rPr>
+          <w:rFonts w:ascii="Times New Roman" w:hAnsi="Times New Roman" w:cs="Times New Roman" w:eastAsia="Times New Roman"/>
+          <w:sz w:val="24"/>
+          <w:szCs w:val="24"/>
+        </w:rPr>
+        <w:t xml:space="preserve">meaning that baseline risk modifies the treatment effect (higher-risk patients experience larger absolute or relative benefit). The target population is all hypothetical RCTs; the enrolled population is a lower-risk subset selected by a quantile threshold on</w:t>
+      </w:r>
+      <w:r>
+        <w:rPr>
+          <w:rFonts w:ascii="Times New Roman" w:hAnsi="Times New Roman" w:cs="Times New Roman" w:eastAsia="Times New Roman"/>
+          <w:sz w:val="24"/>
+          <w:szCs w:val="24"/>
+        </w:rPr>
+        <w:t xml:space="preserve"> </w:t>
+      </w:r>
+      <m:oMath>
+        <m:sSub>
+          <m:e>
+            <m:r>
+              <m:t>Z</m:t>
+            </m:r>
+          </m:e>
+          <m:sub>
+            <m:r>
+              <m:t>i</m:t>
+            </m:r>
+          </m:sub>
+        </m:sSub>
+      </m:oMath>
+      <w:r>
+        <w:rPr>
+          <w:rFonts w:ascii="Times New Roman" w:hAnsi="Times New Roman" w:cs="Times New Roman" w:eastAsia="Times New Roman"/>
+          <w:sz w:val="24"/>
+          <w:szCs w:val="24"/>
+        </w:rPr>
+        <w:t xml:space="preserve">. This is the formal mechanism for structural information loss: the RCT-enrolled meta-analysis estimates the treatment effect in a selected, lower-risk subpopulation rather than the target estimand</w:t>
+      </w:r>
+      <w:r>
+        <w:rPr>
+          <w:rFonts w:ascii="Times New Roman" w:hAnsi="Times New Roman" w:cs="Times New Roman" w:eastAsia="Times New Roman"/>
+          <w:sz w:val="24"/>
+          <w:szCs w:val="24"/>
+        </w:rPr>
+        <w:t xml:space="preserve"> </w:t>
+      </w:r>
+      <m:oMath>
+        <m:r>
+          <m:rPr>
+            <m:sty m:val="p"/>
+            <m:scr m:val="double-struck"/>
+          </m:rPr>
+          <m:t>E</m:t>
+        </m:r>
+        <m:d>
+          <m:dPr>
+            <m:begChr m:val="["/>
+            <m:endChr m:val="]"/>
+            <m:sepChr m:val=""/>
+            <m:grow/>
+          </m:dPr>
+          <m:e>
+            <m:r>
+              <m:rPr>
+                <m:nor/>
+                <m:sty m:val="p"/>
+              </m:rPr>
+              <m:t>log OR</m:t>
+            </m:r>
+          </m:e>
+        </m:d>
+      </m:oMath>
+      <w:r>
+        <w:rPr>
+          <w:rFonts w:ascii="Times New Roman" w:hAnsi="Times New Roman" w:cs="Times New Roman" w:eastAsia="Times New Roman"/>
+          <w:sz w:val="24"/>
+          <w:szCs w:val="24"/>
+        </w:rPr>
+        <w:t xml:space="preserve"> </w:t>
+      </w:r>
+      <w:r>
+        <w:rPr>
+          <w:rFonts w:ascii="Times New Roman" w:hAnsi="Times New Roman" w:cs="Times New Roman" w:eastAsia="Times New Roman"/>
+          <w:sz w:val="24"/>
+          <w:szCs w:val="24"/>
+        </w:rPr>
+        <w:t xml:space="preserve">over all RCTs.</w:t>
+      </w:r>
+    </w:p>
+    <w:p xmlns:a="http://schemas.openxmlformats.org/drawingml/2006/main" xmlns:pic="http://schemas.openxmlformats.org/drawingml/2006/picture">
+      <w:pPr>
+        <w:pStyle w:val="Normal"/>
+        <w:spacing w:line="480" w:lineRule="auto" w:after="120"/>
+      </w:pPr>
+      <w:r>
+        <w:rPr>
+          <w:rFonts w:ascii="Times New Roman" w:hAnsi="Times New Roman" w:cs="Times New Roman" w:eastAsia="Times New Roman"/>
+          <w:sz w:val="24"/>
+          <w:szCs w:val="24"/>
+        </w:rPr>
+        <w:t xml:space="preserve">An observational source is generated from the same target population but with systematic design-related bias toward spurious benefit,</w:t>
+      </w:r>
+      <w:r>
+        <w:rPr>
+          <w:rFonts w:ascii="Times New Roman" w:hAnsi="Times New Roman" w:cs="Times New Roman" w:eastAsia="Times New Roman"/>
+          <w:sz w:val="24"/>
+          <w:szCs w:val="24"/>
+        </w:rPr>
+        <w:t xml:space="preserve"> </w:t>
+      </w:r>
+      <m:oMath>
+        <m:r>
+          <m:rPr>
+            <m:nor/>
+            <m:sty m:val="p"/>
+          </m:rPr>
+          <m:t>E</m:t>
+        </m:r>
+        <m:d>
+          <m:dPr>
+            <m:begChr m:val="["/>
+            <m:endChr m:val="]"/>
+            <m:sepChr m:val=""/>
+            <m:grow/>
+          </m:dPr>
+          <m:e>
+            <m:sSub>
+              <m:e>
+                <m:acc>
+                  <m:accPr>
+                    <m:chr m:val="̂"/>
+                  </m:accPr>
+                  <m:e>
+                    <m:r>
+                      <m:t>θ</m:t>
+                    </m:r>
+                  </m:e>
+                </m:acc>
+              </m:e>
+              <m:sub>
+                <m:r>
+                  <m:rPr>
+                    <m:nor/>
+                    <m:sty m:val="p"/>
+                  </m:rPr>
+                  <m:t>obs</m:t>
+                </m:r>
+              </m:sub>
+            </m:sSub>
+          </m:e>
+        </m:d>
+        <m:r>
+          <m:rPr>
+            <m:sty m:val="p"/>
+          </m:rPr>
+          <m:t>=</m:t>
+        </m:r>
+        <m:sSub>
+          <m:e>
+            <m:r>
+              <m:t>θ</m:t>
+            </m:r>
+          </m:e>
+          <m:sub>
+            <m:r>
+              <m:rPr>
+                <m:nor/>
+                <m:sty m:val="p"/>
+              </m:rPr>
+              <m:t>true</m:t>
+            </m:r>
+          </m:sub>
+        </m:sSub>
+        <m:r>
+          <m:rPr>
+            <m:sty m:val="p"/>
+          </m:rPr>
+          <m:t>+</m:t>
+        </m:r>
+        <m:sSub>
+          <m:e>
+            <m:r>
+              <m:t>β</m:t>
+            </m:r>
+          </m:e>
+          <m:sub>
+            <m:r>
+              <m:rPr>
+                <m:nor/>
+                <m:sty m:val="p"/>
+              </m:rPr>
+              <m:t>obs</m:t>
+            </m:r>
+          </m:sub>
+        </m:sSub>
+      </m:oMath>
+      <w:r>
+        <w:rPr>
+          <w:rFonts w:ascii="Times New Roman" w:hAnsi="Times New Roman" w:cs="Times New Roman" w:eastAsia="Times New Roman"/>
+          <w:sz w:val="24"/>
+          <w:szCs w:val="24"/>
+        </w:rPr>
+        <w:t xml:space="preserve"> </w:t>
+      </w:r>
+      <w:r>
+        <w:rPr>
+          <w:rFonts w:ascii="Times New Roman" w:hAnsi="Times New Roman" w:cs="Times New Roman" w:eastAsia="Times New Roman"/>
+          <w:sz w:val="24"/>
+          <w:szCs w:val="24"/>
+        </w:rPr>
+        <w:t xml:space="preserve">with inflated standard errors. The KOTHA combination uses a normal-approximation power-prior,</w:t>
+      </w:r>
+      <w:r>
+        <w:rPr>
+          <w:rFonts w:ascii="Times New Roman" w:hAnsi="Times New Roman" w:cs="Times New Roman" w:eastAsia="Times New Roman"/>
+          <w:sz w:val="24"/>
+          <w:szCs w:val="24"/>
+        </w:rPr>
+        <w:t xml:space="preserve"> </w:t>
+      </w:r>
+      <m:oMath>
+        <m:r>
+          <m:rPr>
+            <m:nor/>
+            <m:sty m:val="p"/>
+          </m:rPr>
+          <m:t>log-posterior</m:t>
+        </m:r>
+        <m:r>
+          <m:rPr>
+            <m:sty m:val="p"/>
+          </m:rPr>
+          <m:t>∝</m:t>
+        </m:r>
+        <m:r>
+          <m:t>α</m:t>
+        </m:r>
+        <m:r>
+          <m:rPr>
+            <m:sty m:val="p"/>
+          </m:rPr>
+          <m:t>⋅</m:t>
+        </m:r>
+        <m:sSub>
+          <m:e>
+            <m:r>
+              <m:rPr>
+                <m:nor/>
+                <m:sty m:val="p"/>
+              </m:rPr>
+              <m:t>log-likelihood</m:t>
+            </m:r>
+          </m:e>
+          <m:sub>
+            <m:r>
+              <m:rPr>
+                <m:nor/>
+                <m:sty m:val="p"/>
+              </m:rPr>
+              <m:t>obs</m:t>
+            </m:r>
+          </m:sub>
+        </m:sSub>
+        <m:r>
+          <m:rPr>
+            <m:sty m:val="p"/>
+          </m:rPr>
+          <m:t>+</m:t>
+        </m:r>
+        <m:sSub>
+          <m:e>
+            <m:r>
+              <m:rPr>
+                <m:nor/>
+                <m:sty m:val="p"/>
+              </m:rPr>
+              <m:t>log-likelihood</m:t>
+            </m:r>
+          </m:e>
+          <m:sub>
+            <m:r>
+              <m:rPr>
+                <m:nor/>
+                <m:sty m:val="p"/>
+              </m:rPr>
+              <m:t>rct</m:t>
+            </m:r>
+          </m:sub>
+        </m:sSub>
+        <m:r>
+          <m:rPr>
+            <m:sty m:val="p"/>
+          </m:rPr>
+          <m:t>+</m:t>
+        </m:r>
+        <m:r>
+          <m:rPr>
+            <m:nor/>
+            <m:sty m:val="p"/>
+          </m:rPr>
+          <m:t>log-prior</m:t>
+        </m:r>
+        <m:d>
+          <m:dPr>
+            <m:begChr m:val="("/>
+            <m:endChr m:val=")"/>
+            <m:sepChr m:val=""/>
+            <m:grow/>
+          </m:dPr>
+          <m:e>
+            <m:r>
+              <m:t>θ</m:t>
+            </m:r>
+            <m:r>
+              <m:rPr>
+                <m:sty m:val="p"/>
+              </m:rPr>
+              <m:t>,</m:t>
+            </m:r>
+            <m:sSup>
+              <m:e>
+                <m:r>
+                  <m:t>τ</m:t>
+                </m:r>
+              </m:e>
+              <m:sup>
+                <m:r>
+                  <m:t>2</m:t>
+                </m:r>
+              </m:sup>
+            </m:sSup>
+          </m:e>
+        </m:d>
+      </m:oMath>
+      <w:r>
+        <w:rPr>
+          <w:rFonts w:ascii="Times New Roman" w:hAnsi="Times New Roman" w:cs="Times New Roman" w:eastAsia="Times New Roman"/>
+          <w:sz w:val="24"/>
+          <w:szCs w:val="24"/>
+        </w:rPr>
+        <w:t xml:space="preserve">, and returns the posterior mean as the point estimate. Performance was evaluated by bias, RMSE, 95% credible-interval coverage, and statistical power (posterior probability that OR &lt; 1 exceeds 97.5%) relative to the target estimand. The simulation was run with 500 replications under pre-specified parameters; results are reported using the ADEMP checklist </w:t>
+      </w:r>
+      <w:r>
+        <w:rPr>
+          <w:rFonts w:ascii="Times New Roman" w:hAnsi="Times New Roman" w:cs="Times New Roman" w:eastAsia="Times New Roman"/>
+          <w:sz w:val="24"/>
+          <w:szCs w:val="24"/>
+          <w:vertAlign w:val="superscript"/>
+        </w:rPr>
+        <w:t xml:space="preserve">[10]</w:t>
+      </w:r>
+      <w:r>
+        <w:rPr>
+          <w:rFonts w:ascii="Times New Roman" w:hAnsi="Times New Roman" w:cs="Times New Roman" w:eastAsia="Times New Roman"/>
+          <w:sz w:val="24"/>
+          <w:szCs w:val="24"/>
+        </w:rPr>
+        <w:t xml:space="preserve">.</w:t>
       </w:r>
     </w:p>
     <w:p>
@@ -7218,6 +7833,751 @@
     </w:p>
     <w:p>
       <w:pPr>
+        <w:pStyle w:val="Heading3"/>
+      </w:pPr>
+      <w:r>
+        <w:rPr>
+          <w:rFonts w:ascii="Times New Roman" w:hAnsi="Times New Roman"/>
+          <w:b/>
+          <w:color w:val="000000"/>
+          <w:sz w:val="24"/>
+        </w:rPr>
+        <w:t>Simulation study of operating characteristics</w:t>
+      </w:r>
+    </w:p>
+    <w:p xmlns:a="http://schemas.openxmlformats.org/drawingml/2006/main" xmlns:pic="http://schemas.openxmlformats.org/drawingml/2006/picture">
+      <w:pPr>
+        <w:pStyle w:val="Normal"/>
+        <w:spacing w:line="480" w:lineRule="auto" w:after="120"/>
+      </w:pPr>
+      <w:r>
+        <w:rPr>
+          <w:rFonts w:ascii="Times New Roman" w:hAnsi="Times New Roman" w:cs="Times New Roman" w:eastAsia="Times New Roman"/>
+          <w:sz w:val="24"/>
+          <w:szCs w:val="24"/>
+        </w:rPr>
+        <w:t xml:space="preserve">The formal causal model produced a controlled setting in which structural information loss could be quantified. Across 500 replications, the target meta-analysis that used all RCTs showed negligible bias (-0.040 log-OR) and the lowest RMSE (0.119) (Fig. 8 and Table 5). The RCT-enrolled-only analysis was biased toward the null (+0.127), had inflated RMSE (0.160), and low power (24.4%), because low-risk enrollment diluted event rates and shifted the estimand. The observational-only estimate was biased in the opposite direction (-0.224) and also had poor coverage.</w:t>
+      </w:r>
+    </w:p>
+    <w:p xmlns:a="http://schemas.openxmlformats.org/drawingml/2006/main" xmlns:pic="http://schemas.openxmlformats.org/drawingml/2006/picture">
+      <w:pPr>
+        <w:pStyle w:val="Normal"/>
+        <w:spacing w:line="480" w:lineRule="auto" w:after="120"/>
+      </w:pPr>
+      <w:r>
+        <w:rPr>
+          <w:rFonts w:ascii="Times New Roman" w:hAnsi="Times New Roman" w:cs="Times New Roman" w:eastAsia="Times New Roman"/>
+          <w:sz w:val="24"/>
+          <w:szCs w:val="24"/>
+        </w:rPr>
+        <w:t xml:space="preserve">KOTHA with a fixed power-prior discount of</w:t>
+      </w:r>
+      <w:r>
+        <w:rPr>
+          <w:rFonts w:ascii="Times New Roman" w:hAnsi="Times New Roman" w:cs="Times New Roman" w:eastAsia="Times New Roman"/>
+          <w:sz w:val="24"/>
+          <w:szCs w:val="24"/>
+        </w:rPr>
+        <w:t xml:space="preserve"> </w:t>
+      </w:r>
+      <m:oMath>
+        <m:r>
+          <m:t>α</m:t>
+        </m:r>
+      </m:oMath>
+      <w:r>
+        <w:rPr>
+          <w:rFonts w:ascii="Times New Roman" w:hAnsi="Times New Roman" w:cs="Times New Roman" w:eastAsia="Times New Roman"/>
+          <w:sz w:val="24"/>
+          <w:szCs w:val="24"/>
+        </w:rPr>
+        <w:t xml:space="preserve"> </w:t>
+      </w:r>
+      <w:r>
+        <w:rPr>
+          <w:rFonts w:ascii="Times New Roman" w:hAnsi="Times New Roman" w:cs="Times New Roman" w:eastAsia="Times New Roman"/>
+          <w:sz w:val="24"/>
+          <w:szCs w:val="24"/>
+        </w:rPr>
+        <w:t xml:space="preserve">= 0.3 reduced the absolute bias by 69% and the RMSE by 37% compared with RCT-enrolled only, and increased power by 63 percentage points. The RMSE-optimal discount was</w:t>
+      </w:r>
+      <w:r>
+        <w:rPr>
+          <w:rFonts w:ascii="Times New Roman" w:hAnsi="Times New Roman" w:cs="Times New Roman" w:eastAsia="Times New Roman"/>
+          <w:sz w:val="24"/>
+          <w:szCs w:val="24"/>
+        </w:rPr>
+        <w:t xml:space="preserve"> </w:t>
+      </w:r>
+      <m:oMath>
+        <m:r>
+          <m:t>α</m:t>
+        </m:r>
+      </m:oMath>
+      <w:r>
+        <w:rPr>
+          <w:rFonts w:ascii="Times New Roman" w:hAnsi="Times New Roman" w:cs="Times New Roman" w:eastAsia="Times New Roman"/>
+          <w:sz w:val="24"/>
+          <w:szCs w:val="24"/>
+        </w:rPr>
+        <w:t xml:space="preserve"> </w:t>
+      </w:r>
+      <w:r>
+        <w:rPr>
+          <w:rFonts w:ascii="Times New Roman" w:hAnsi="Times New Roman" w:cs="Times New Roman" w:eastAsia="Times New Roman"/>
+          <w:sz w:val="24"/>
+          <w:szCs w:val="24"/>
+        </w:rPr>
+        <w:t xml:space="preserve">= 0.1; at that value the RMSE reduction was 43% and the power gain was 46 percentage points relative to RCT-enrolled only. These gains came from combining a small amount of observational information while down-weighting its design-related bias.</w:t>
+      </w:r>
+    </w:p>
+    <w:p>
+      <w:r>
+        <w:rPr>
+          <w:rFonts w:ascii="Times New Roman" w:hAnsi="Times New Roman"/>
+          <w:b/>
+          <w:i w:val="0"/>
+          <w:sz w:val="24"/>
+        </w:rPr>
+        <w:t>Table 5: Operating characteristics of the KOTHA power-prior combination relative to alternative estimators.</w:t>
+      </w:r>
+    </w:p>
+    <w:tbl xmlns:a="http://schemas.openxmlformats.org/drawingml/2006/main" xmlns:pic="http://schemas.openxmlformats.org/drawingml/2006/picture">
+      <w:tblPr>
+        <w:tblStyle w:val="Table Grid"/>
+        <w:tblW w:type="auto" w:w="0"/>
+        <w:tblLook w:firstRow="1" w:lastRow="0" w:firstColumn="0" w:lastColumn="0" w:noHBand="0" w:noVBand="0" w:val="0020"/>
+        <w:jc w:val="center"/>
+      </w:tblPr>
+      <w:tblGrid>
+        <w:gridCol w:w="1584"/>
+        <w:gridCol w:w="1584"/>
+        <w:gridCol w:w="1584"/>
+        <w:gridCol w:w="1584"/>
+        <w:gridCol w:w="1584"/>
+      </w:tblGrid>
+      <w:tr>
+        <w:trPr>
+          <w:tblHeader w:val="true"/>
+        </w:trPr>
+        <w:tc>
+          <w:tcPr/>
+          <w:p>
+            <w:pPr>
+              <w:pStyle w:val="Normal"/>
+              <w:jc w:val="left"/>
+              <w:spacing w:line="240" w:lineRule="auto" w:after="0"/>
+            </w:pPr>
+            <w:r>
+              <w:rPr>
+                <w:rFonts w:ascii="Times New Roman" w:hAnsi="Times New Roman" w:cs="Times New Roman" w:eastAsia="Times New Roman"/>
+                <w:sz w:val="20"/>
+                <w:szCs w:val="20"/>
+                <w:b/>
+              </w:rPr>
+              <w:t xml:space="preserve">Estimator</w:t>
+            </w:r>
+          </w:p>
+        </w:tc>
+        <w:tc>
+          <w:tcPr/>
+          <w:p>
+            <w:pPr>
+              <w:pStyle w:val="Normal"/>
+              <w:jc w:val="left"/>
+              <w:spacing w:line="240" w:lineRule="auto" w:after="0"/>
+            </w:pPr>
+            <w:r>
+              <w:rPr>
+                <w:rFonts w:ascii="Times New Roman" w:hAnsi="Times New Roman" w:cs="Times New Roman" w:eastAsia="Times New Roman"/>
+                <w:sz w:val="20"/>
+                <w:szCs w:val="20"/>
+                <w:b/>
+              </w:rPr>
+              <w:t xml:space="preserve">Bias (log-OR)</w:t>
+            </w:r>
+          </w:p>
+        </w:tc>
+        <w:tc>
+          <w:tcPr/>
+          <w:p>
+            <w:pPr>
+              <w:pStyle w:val="Normal"/>
+              <w:jc w:val="left"/>
+              <w:spacing w:line="240" w:lineRule="auto" w:after="0"/>
+            </w:pPr>
+            <w:r>
+              <w:rPr>
+                <w:rFonts w:ascii="Times New Roman" w:hAnsi="Times New Roman" w:cs="Times New Roman" w:eastAsia="Times New Roman"/>
+                <w:sz w:val="20"/>
+                <w:szCs w:val="20"/>
+                <w:b/>
+              </w:rPr>
+              <w:t xml:space="preserve">RMSE (log-OR)</w:t>
+            </w:r>
+          </w:p>
+        </w:tc>
+        <w:tc>
+          <w:tcPr/>
+          <w:p>
+            <w:pPr>
+              <w:pStyle w:val="Normal"/>
+              <w:jc w:val="left"/>
+              <w:spacing w:line="240" w:lineRule="auto" w:after="0"/>
+            </w:pPr>
+            <w:r>
+              <w:rPr>
+                <w:rFonts w:ascii="Times New Roman" w:hAnsi="Times New Roman" w:cs="Times New Roman" w:eastAsia="Times New Roman"/>
+                <w:sz w:val="20"/>
+                <w:szCs w:val="20"/>
+                <w:b/>
+              </w:rPr>
+              <w:t xml:space="preserve">95% coverage</w:t>
+            </w:r>
+          </w:p>
+        </w:tc>
+        <w:tc>
+          <w:tcPr/>
+          <w:p>
+            <w:pPr>
+              <w:pStyle w:val="Normal"/>
+              <w:jc w:val="left"/>
+              <w:spacing w:line="240" w:lineRule="auto" w:after="0"/>
+            </w:pPr>
+            <w:r>
+              <w:rPr>
+                <w:rFonts w:ascii="Times New Roman" w:hAnsi="Times New Roman" w:cs="Times New Roman" w:eastAsia="Times New Roman"/>
+                <w:sz w:val="20"/>
+                <w:szCs w:val="20"/>
+                <w:b/>
+              </w:rPr>
+              <w:t xml:space="preserve">Power</w:t>
+            </w:r>
+          </w:p>
+        </w:tc>
+      </w:tr>
+      <w:tr>
+        <w:tc>
+          <w:tcPr/>
+          <w:p>
+            <w:pPr>
+              <w:pStyle w:val="Normal"/>
+              <w:jc w:val="left"/>
+              <w:spacing w:line="240" w:lineRule="auto" w:after="0"/>
+            </w:pPr>
+            <w:r>
+              <w:rPr>
+                <w:rFonts w:ascii="Times New Roman" w:hAnsi="Times New Roman" w:cs="Times New Roman" w:eastAsia="Times New Roman"/>
+                <w:sz w:val="20"/>
+                <w:szCs w:val="20"/>
+              </w:rPr>
+              <w:t xml:space="preserve">Target (all RCTs)</w:t>
+            </w:r>
+          </w:p>
+        </w:tc>
+        <w:tc>
+          <w:tcPr/>
+          <w:p>
+            <w:pPr>
+              <w:pStyle w:val="Normal"/>
+              <w:jc w:val="left"/>
+              <w:spacing w:line="240" w:lineRule="auto" w:after="0"/>
+            </w:pPr>
+            <w:r>
+              <w:rPr>
+                <w:rFonts w:ascii="Times New Roman" w:hAnsi="Times New Roman" w:cs="Times New Roman" w:eastAsia="Times New Roman"/>
+                <w:sz w:val="20"/>
+                <w:szCs w:val="20"/>
+              </w:rPr>
+              <w:t xml:space="preserve">-0.040</w:t>
+            </w:r>
+          </w:p>
+        </w:tc>
+        <w:tc>
+          <w:tcPr/>
+          <w:p>
+            <w:pPr>
+              <w:pStyle w:val="Normal"/>
+              <w:jc w:val="left"/>
+              <w:spacing w:line="240" w:lineRule="auto" w:after="0"/>
+            </w:pPr>
+            <w:r>
+              <w:rPr>
+                <w:rFonts w:ascii="Times New Roman" w:hAnsi="Times New Roman" w:cs="Times New Roman" w:eastAsia="Times New Roman"/>
+                <w:sz w:val="20"/>
+                <w:szCs w:val="20"/>
+              </w:rPr>
+              <w:t xml:space="preserve">0.119</w:t>
+            </w:r>
+          </w:p>
+        </w:tc>
+        <w:tc>
+          <w:tcPr/>
+          <w:p>
+            <w:pPr>
+              <w:pStyle w:val="Normal"/>
+              <w:jc w:val="left"/>
+              <w:spacing w:line="240" w:lineRule="auto" w:after="0"/>
+            </w:pPr>
+            <w:r>
+              <w:rPr>
+                <w:rFonts w:ascii="Times New Roman" w:hAnsi="Times New Roman" w:cs="Times New Roman" w:eastAsia="Times New Roman"/>
+                <w:sz w:val="20"/>
+                <w:szCs w:val="20"/>
+              </w:rPr>
+              <w:t xml:space="preserve">91.2%</w:t>
+            </w:r>
+          </w:p>
+        </w:tc>
+        <w:tc>
+          <w:tcPr/>
+          <w:p>
+            <w:pPr>
+              <w:pStyle w:val="Normal"/>
+              <w:jc w:val="left"/>
+              <w:spacing w:line="240" w:lineRule="auto" w:after="0"/>
+            </w:pPr>
+            <w:r>
+              <w:rPr>
+                <w:rFonts w:ascii="Times New Roman" w:hAnsi="Times New Roman" w:cs="Times New Roman" w:eastAsia="Times New Roman"/>
+                <w:sz w:val="20"/>
+                <w:szCs w:val="20"/>
+              </w:rPr>
+              <w:t xml:space="preserve">67.8%</w:t>
+            </w:r>
+          </w:p>
+        </w:tc>
+      </w:tr>
+      <w:tr>
+        <w:tc>
+          <w:tcPr/>
+          <w:p>
+            <w:pPr>
+              <w:pStyle w:val="Normal"/>
+              <w:jc w:val="left"/>
+              <w:spacing w:line="240" w:lineRule="auto" w:after="0"/>
+            </w:pPr>
+            <w:r>
+              <w:rPr>
+                <w:rFonts w:ascii="Times New Roman" w:hAnsi="Times New Roman" w:cs="Times New Roman" w:eastAsia="Times New Roman"/>
+                <w:sz w:val="20"/>
+                <w:szCs w:val="20"/>
+              </w:rPr>
+              <w:t xml:space="preserve">RCT-enrolled only</w:t>
+            </w:r>
+          </w:p>
+        </w:tc>
+        <w:tc>
+          <w:tcPr/>
+          <w:p>
+            <w:pPr>
+              <w:pStyle w:val="Normal"/>
+              <w:jc w:val="left"/>
+              <w:spacing w:line="240" w:lineRule="auto" w:after="0"/>
+            </w:pPr>
+            <w:r>
+              <w:rPr>
+                <w:rFonts w:ascii="Times New Roman" w:hAnsi="Times New Roman" w:cs="Times New Roman" w:eastAsia="Times New Roman"/>
+                <w:sz w:val="20"/>
+                <w:szCs w:val="20"/>
+              </w:rPr>
+              <w:t xml:space="preserve">+0.127</w:t>
+            </w:r>
+          </w:p>
+        </w:tc>
+        <w:tc>
+          <w:tcPr/>
+          <w:p>
+            <w:pPr>
+              <w:pStyle w:val="Normal"/>
+              <w:jc w:val="left"/>
+              <w:spacing w:line="240" w:lineRule="auto" w:after="0"/>
+            </w:pPr>
+            <w:r>
+              <w:rPr>
+                <w:rFonts w:ascii="Times New Roman" w:hAnsi="Times New Roman" w:cs="Times New Roman" w:eastAsia="Times New Roman"/>
+                <w:sz w:val="20"/>
+                <w:szCs w:val="20"/>
+              </w:rPr>
+              <w:t xml:space="preserve">0.160</w:t>
+            </w:r>
+          </w:p>
+        </w:tc>
+        <w:tc>
+          <w:tcPr/>
+          <w:p>
+            <w:pPr>
+              <w:pStyle w:val="Normal"/>
+              <w:jc w:val="left"/>
+              <w:spacing w:line="240" w:lineRule="auto" w:after="0"/>
+            </w:pPr>
+            <w:r>
+              <w:rPr>
+                <w:rFonts w:ascii="Times New Roman" w:hAnsi="Times New Roman" w:cs="Times New Roman" w:eastAsia="Times New Roman"/>
+                <w:sz w:val="20"/>
+                <w:szCs w:val="20"/>
+              </w:rPr>
+              <w:t xml:space="preserve">73.6%</w:t>
+            </w:r>
+          </w:p>
+        </w:tc>
+        <w:tc>
+          <w:tcPr/>
+          <w:p>
+            <w:pPr>
+              <w:pStyle w:val="Normal"/>
+              <w:jc w:val="left"/>
+              <w:spacing w:line="240" w:lineRule="auto" w:after="0"/>
+            </w:pPr>
+            <w:r>
+              <w:rPr>
+                <w:rFonts w:ascii="Times New Roman" w:hAnsi="Times New Roman" w:cs="Times New Roman" w:eastAsia="Times New Roman"/>
+                <w:sz w:val="20"/>
+                <w:szCs w:val="20"/>
+              </w:rPr>
+              <w:t xml:space="preserve">24.4%</w:t>
+            </w:r>
+          </w:p>
+        </w:tc>
+      </w:tr>
+      <w:tr>
+        <w:tc>
+          <w:tcPr/>
+          <w:p>
+            <w:pPr>
+              <w:pStyle w:val="Normal"/>
+              <w:jc w:val="left"/>
+              <w:spacing w:line="240" w:lineRule="auto" w:after="0"/>
+            </w:pPr>
+            <w:r>
+              <w:rPr>
+                <w:rFonts w:ascii="Times New Roman" w:hAnsi="Times New Roman" w:cs="Times New Roman" w:eastAsia="Times New Roman"/>
+                <w:sz w:val="20"/>
+                <w:szCs w:val="20"/>
+              </w:rPr>
+              <w:t xml:space="preserve">Observational only</w:t>
+            </w:r>
+          </w:p>
+        </w:tc>
+        <w:tc>
+          <w:tcPr/>
+          <w:p>
+            <w:pPr>
+              <w:pStyle w:val="Normal"/>
+              <w:jc w:val="left"/>
+              <w:spacing w:line="240" w:lineRule="auto" w:after="0"/>
+            </w:pPr>
+            <w:r>
+              <w:rPr>
+                <w:rFonts w:ascii="Times New Roman" w:hAnsi="Times New Roman" w:cs="Times New Roman" w:eastAsia="Times New Roman"/>
+                <w:sz w:val="20"/>
+                <w:szCs w:val="20"/>
+              </w:rPr>
+              <w:t xml:space="preserve">-0.224</w:t>
+            </w:r>
+          </w:p>
+        </w:tc>
+        <w:tc>
+          <w:tcPr/>
+          <w:p>
+            <w:pPr>
+              <w:pStyle w:val="Normal"/>
+              <w:jc w:val="left"/>
+              <w:spacing w:line="240" w:lineRule="auto" w:after="0"/>
+            </w:pPr>
+            <w:r>
+              <w:rPr>
+                <w:rFonts w:ascii="Times New Roman" w:hAnsi="Times New Roman" w:cs="Times New Roman" w:eastAsia="Times New Roman"/>
+                <w:sz w:val="20"/>
+                <w:szCs w:val="20"/>
+              </w:rPr>
+              <w:t xml:space="preserve">0.248</w:t>
+            </w:r>
+          </w:p>
+        </w:tc>
+        <w:tc>
+          <w:tcPr/>
+          <w:p>
+            <w:pPr>
+              <w:pStyle w:val="Normal"/>
+              <w:jc w:val="left"/>
+              <w:spacing w:line="240" w:lineRule="auto" w:after="0"/>
+            </w:pPr>
+            <w:r>
+              <w:rPr>
+                <w:rFonts w:ascii="Times New Roman" w:hAnsi="Times New Roman" w:cs="Times New Roman" w:eastAsia="Times New Roman"/>
+                <w:sz w:val="20"/>
+                <w:szCs w:val="20"/>
+              </w:rPr>
+              <w:t xml:space="preserve">45.4%</w:t>
+            </w:r>
+          </w:p>
+        </w:tc>
+        <w:tc>
+          <w:tcPr/>
+          <w:p>
+            <w:pPr>
+              <w:pStyle w:val="Normal"/>
+              <w:jc w:val="left"/>
+              <w:spacing w:line="240" w:lineRule="auto" w:after="0"/>
+            </w:pPr>
+            <w:r>
+              <w:rPr>
+                <w:rFonts w:ascii="Times New Roman" w:hAnsi="Times New Roman" w:cs="Times New Roman" w:eastAsia="Times New Roman"/>
+                <w:sz w:val="20"/>
+                <w:szCs w:val="20"/>
+              </w:rPr>
+              <w:t xml:space="preserve">97.0%</w:t>
+            </w:r>
+          </w:p>
+        </w:tc>
+      </w:tr>
+      <w:tr>
+        <w:tc>
+          <w:tcPr/>
+          <w:p>
+            <w:pPr>
+              <w:pStyle w:val="Normal"/>
+              <w:jc w:val="left"/>
+              <w:spacing w:line="240" w:lineRule="auto" w:after="0"/>
+            </w:pPr>
+            <w:r>
+              <w:rPr>
+                <w:rFonts w:ascii="Times New Roman" w:hAnsi="Times New Roman" w:cs="Times New Roman" w:eastAsia="Times New Roman"/>
+                <w:sz w:val="20"/>
+                <w:szCs w:val="20"/>
+              </w:rPr>
+              <w:t xml:space="preserve">KOTHA (fixed alpha = 0.3)</w:t>
+            </w:r>
+          </w:p>
+        </w:tc>
+        <w:tc>
+          <w:tcPr/>
+          <w:p>
+            <w:pPr>
+              <w:pStyle w:val="Normal"/>
+              <w:jc w:val="left"/>
+              <w:spacing w:line="240" w:lineRule="auto" w:after="0"/>
+            </w:pPr>
+            <w:r>
+              <w:rPr>
+                <w:rFonts w:ascii="Times New Roman" w:hAnsi="Times New Roman" w:cs="Times New Roman" w:eastAsia="Times New Roman"/>
+                <w:sz w:val="20"/>
+                <w:szCs w:val="20"/>
+              </w:rPr>
+              <w:t xml:space="preserve">-0.039</w:t>
+            </w:r>
+          </w:p>
+        </w:tc>
+        <w:tc>
+          <w:tcPr/>
+          <w:p>
+            <w:pPr>
+              <w:pStyle w:val="Normal"/>
+              <w:jc w:val="left"/>
+              <w:spacing w:line="240" w:lineRule="auto" w:after="0"/>
+            </w:pPr>
+            <w:r>
+              <w:rPr>
+                <w:rFonts w:ascii="Times New Roman" w:hAnsi="Times New Roman" w:cs="Times New Roman" w:eastAsia="Times New Roman"/>
+                <w:sz w:val="20"/>
+                <w:szCs w:val="20"/>
+              </w:rPr>
+              <w:t xml:space="preserve">0.101</w:t>
+            </w:r>
+          </w:p>
+        </w:tc>
+        <w:tc>
+          <w:tcPr/>
+          <w:p>
+            <w:pPr>
+              <w:pStyle w:val="Normal"/>
+              <w:jc w:val="left"/>
+              <w:spacing w:line="240" w:lineRule="auto" w:after="0"/>
+            </w:pPr>
+            <w:r>
+              <w:rPr>
+                <w:rFonts w:ascii="Times New Roman" w:hAnsi="Times New Roman" w:cs="Times New Roman" w:eastAsia="Times New Roman"/>
+                <w:sz w:val="20"/>
+                <w:szCs w:val="20"/>
+              </w:rPr>
+              <w:t xml:space="preserve">85.2%</w:t>
+            </w:r>
+          </w:p>
+        </w:tc>
+        <w:tc>
+          <w:tcPr/>
+          <w:p>
+            <w:pPr>
+              <w:pStyle w:val="Normal"/>
+              <w:jc w:val="left"/>
+              <w:spacing w:line="240" w:lineRule="auto" w:after="0"/>
+            </w:pPr>
+            <w:r>
+              <w:rPr>
+                <w:rFonts w:ascii="Times New Roman" w:hAnsi="Times New Roman" w:cs="Times New Roman" w:eastAsia="Times New Roman"/>
+                <w:sz w:val="20"/>
+                <w:szCs w:val="20"/>
+              </w:rPr>
+              <w:t xml:space="preserve">87.2%</w:t>
+            </w:r>
+          </w:p>
+        </w:tc>
+      </w:tr>
+      <w:tr>
+        <w:tc>
+          <w:tcPr/>
+          <w:p>
+            <w:pPr>
+              <w:pStyle w:val="Normal"/>
+              <w:jc w:val="left"/>
+              <w:spacing w:line="240" w:lineRule="auto" w:after="0"/>
+            </w:pPr>
+            <w:r>
+              <w:rPr>
+                <w:rFonts w:ascii="Times New Roman" w:hAnsi="Times New Roman" w:cs="Times New Roman" w:eastAsia="Times New Roman"/>
+                <w:sz w:val="20"/>
+                <w:szCs w:val="20"/>
+              </w:rPr>
+              <w:t xml:space="preserve">KOTHA (RMSE-optimal alpha = 0.1)</w:t>
+            </w:r>
+          </w:p>
+        </w:tc>
+        <w:tc>
+          <w:tcPr/>
+          <w:p>
+            <w:pPr>
+              <w:pStyle w:val="Normal"/>
+              <w:jc w:val="left"/>
+              <w:spacing w:line="240" w:lineRule="auto" w:after="0"/>
+            </w:pPr>
+            <w:r>
+              <w:rPr>
+                <w:rFonts w:ascii="Times New Roman" w:hAnsi="Times New Roman" w:cs="Times New Roman" w:eastAsia="Times New Roman"/>
+                <w:sz w:val="20"/>
+                <w:szCs w:val="20"/>
+              </w:rPr>
+              <w:t xml:space="preserve">+0.024</w:t>
+            </w:r>
+          </w:p>
+        </w:tc>
+        <w:tc>
+          <w:tcPr/>
+          <w:p>
+            <w:pPr>
+              <w:pStyle w:val="Normal"/>
+              <w:jc w:val="left"/>
+              <w:spacing w:line="240" w:lineRule="auto" w:after="0"/>
+            </w:pPr>
+            <w:r>
+              <w:rPr>
+                <w:rFonts w:ascii="Times New Roman" w:hAnsi="Times New Roman" w:cs="Times New Roman" w:eastAsia="Times New Roman"/>
+                <w:sz w:val="20"/>
+                <w:szCs w:val="20"/>
+              </w:rPr>
+              <w:t xml:space="preserve">0.092</w:t>
+            </w:r>
+          </w:p>
+        </w:tc>
+        <w:tc>
+          <w:tcPr/>
+          <w:p>
+            <w:pPr>
+              <w:pStyle w:val="Normal"/>
+              <w:jc w:val="left"/>
+              <w:spacing w:line="240" w:lineRule="auto" w:after="0"/>
+            </w:pPr>
+            <w:r>
+              <w:rPr>
+                <w:rFonts w:ascii="Times New Roman" w:hAnsi="Times New Roman" w:cs="Times New Roman" w:eastAsia="Times New Roman"/>
+                <w:sz w:val="20"/>
+                <w:szCs w:val="20"/>
+              </w:rPr>
+              <w:t xml:space="preserve">89.8%</w:t>
+            </w:r>
+          </w:p>
+        </w:tc>
+        <w:tc>
+          <w:tcPr/>
+          <w:p>
+            <w:pPr>
+              <w:pStyle w:val="Normal"/>
+              <w:jc w:val="left"/>
+              <w:spacing w:line="240" w:lineRule="auto" w:after="0"/>
+            </w:pPr>
+            <w:r>
+              <w:rPr>
+                <w:rFonts w:ascii="Times New Roman" w:hAnsi="Times New Roman" w:cs="Times New Roman" w:eastAsia="Times New Roman"/>
+                <w:sz w:val="20"/>
+                <w:szCs w:val="20"/>
+              </w:rPr>
+              <w:t xml:space="preserve">70.0%</w:t>
+            </w:r>
+          </w:p>
+        </w:tc>
+      </w:tr>
+    </w:tbl>
+    <w:p>
+      <w:pPr>
+        <w:jc w:val="center"/>
+      </w:pPr>
+      <w:r>
+        <w:drawing>
+          <wp:inline xmlns:a="http://schemas.openxmlformats.org/drawingml/2006/main" xmlns:pic="http://schemas.openxmlformats.org/drawingml/2006/picture">
+            <wp:extent cx="5029200" cy="3856528"/>
+            <wp:docPr id="8" name="Picture 8"/>
+            <wp:cNvGraphicFramePr>
+              <a:graphicFrameLocks noChangeAspect="1"/>
+            </wp:cNvGraphicFramePr>
+            <a:graphic>
+              <a:graphicData uri="http://schemas.openxmlformats.org/drawingml/2006/picture">
+                <pic:pic>
+                  <pic:nvPicPr>
+                    <pic:cNvPr id="0" name="fig_simulation_operating_characteristics.png"/>
+                    <pic:cNvPicPr/>
+                  </pic:nvPicPr>
+                  <pic:blipFill>
+                    <a:blip r:embed="rId17"/>
+                    <a:stretch>
+                      <a:fillRect/>
+                    </a:stretch>
+                  </pic:blipFill>
+                  <pic:spPr>
+                    <a:xfrm>
+                      <a:off x="0" y="0"/>
+                      <a:ext cx="5029200" cy="3856528"/>
+                    </a:xfrm>
+                    <a:prstGeom prst="rect"/>
+                  </pic:spPr>
+                </pic:pic>
+              </a:graphicData>
+            </a:graphic>
+          </wp:inline>
+        </w:drawing>
+      </w:r>
+    </w:p>
+    <w:p>
+      <w:pPr>
+        <w:jc w:val="left"/>
+      </w:pPr>
+      <w:r>
+        <w:rPr>
+          <w:rFonts w:ascii="Times New Roman" w:hAnsi="Times New Roman"/>
+          <w:b/>
+          <w:sz w:val="20"/>
+        </w:rPr>
+        <w:t xml:space="preserve">Figure 8. </w:t>
+      </w:r>
+      <w:r>
+        <w:rPr>
+          <w:rFonts w:ascii="Times New Roman" w:hAnsi="Times New Roman"/>
+          <w:sz w:val="20"/>
+        </w:rPr>
+        <w:t>Operating characteristics of the simulation study. (A) Bias and RMSE for the target, RCT-enrolled-only, observational-only, fixed KOTHA (alpha = 0.3), and RMSE-optimal KOTHA estimators. (B) Coverage and power. Error bars in A show RMSE around the bias estimate; coverage and power are empirical proportions across replications.</w:t>
+      </w:r>
+    </w:p>
+    <w:p>
+      <w:pPr>
         <w:pStyle w:val="Heading2"/>
       </w:pPr>
       <w:r>
@@ -7288,6 +8648,49 @@
         <w:t xml:space="preserve">= 62%) than with underpowering alone. In the statins case, Module K showed that RCT populations had roughly half the event rate of observational cohorts, and that power for a modest effect (HR = 0.85) dropped from 98% to 83%. Module T showed that even modest borrowing from observational evidence materially raised the posterior probability of benefit, yet the evidence remained uncertain. Module H classified magnesium as inconclusive with serious inconsistency (heterogeneity), and statins as inconclusive with serious indirectness, rather than "evidence of no effect."</w:t>
       </w:r>
     </w:p>
+    <w:p xmlns:a="http://schemas.openxmlformats.org/drawingml/2006/main" xmlns:pic="http://schemas.openxmlformats.org/drawingml/2006/picture">
+      <w:pPr>
+        <w:pStyle w:val="Normal"/>
+        <w:spacing w:line="480" w:lineRule="auto" w:after="120"/>
+      </w:pPr>
+      <w:r>
+        <w:rPr>
+          <w:rFonts w:ascii="Times New Roman" w:hAnsi="Times New Roman" w:cs="Times New Roman" w:eastAsia="Times New Roman"/>
+          <w:sz w:val="24"/>
+          <w:szCs w:val="24"/>
+        </w:rPr>
+        <w:t xml:space="preserve">The simulation study formalizes the mechanism behind these empirical patterns. Under a transparent generative model with risk-dependent treatment effects and selective low-risk enrollment, the RCT-enrolled-only meta-analysis was biased toward the null and underpowered, while the observational-only estimate was biased toward spurious benefit. KOTHA with a fixed discount of</w:t>
+      </w:r>
+      <w:r>
+        <w:rPr>
+          <w:rFonts w:ascii="Times New Roman" w:hAnsi="Times New Roman" w:cs="Times New Roman" w:eastAsia="Times New Roman"/>
+          <w:sz w:val="24"/>
+          <w:szCs w:val="24"/>
+        </w:rPr>
+        <w:t xml:space="preserve"> </w:t>
+      </w:r>
+      <m:oMath>
+        <m:r>
+          <m:t>α</m:t>
+        </m:r>
+      </m:oMath>
+      <w:r>
+        <w:rPr>
+          <w:rFonts w:ascii="Times New Roman" w:hAnsi="Times New Roman" w:cs="Times New Roman" w:eastAsia="Times New Roman"/>
+          <w:sz w:val="24"/>
+          <w:szCs w:val="24"/>
+        </w:rPr>
+        <w:t xml:space="preserve"> </w:t>
+      </w:r>
+      <w:r>
+        <w:rPr>
+          <w:rFonts w:ascii="Times New Roman" w:hAnsi="Times New Roman" w:cs="Times New Roman" w:eastAsia="Times New Roman"/>
+          <w:sz w:val="24"/>
+          <w:szCs w:val="24"/>
+        </w:rPr>
+        <w:t xml:space="preserve">= 0.3 reduced RMSE by 37% and increased power by 63 percentage points compared with RCT-enrolled-only analysis. These gains show that the power-prior combination rule can improve operating characteristics when observational data contain information about the target population that RCT enrollment discards, provided the observational likelihood is appropriately down-weighted.</w:t>
+      </w:r>
+    </w:p>
     <w:p>
       <w:pPr>
         <w:pStyle w:val="Heading3"/>
@@ -7564,7 +8967,7 @@
           <w:sz w:val="24"/>
           <w:szCs w:val="24"/>
         </w:rPr>
-        <w:t xml:space="preserve">, and is illustrated with real, well-documented cases rather than synthetic examples. The modular design allows each component to be used independently.</w:t>
+        <w:t xml:space="preserve">, and is illustrated with real, well-documented cases. The operating-characteristics simulation is fully transparent---parameters, generative process, and metrics are reported explicitly---and it confirms that the power-prior combination rule can improve estimation and power under the specified structural information loss. The modular design allows each component to be used independently.</w:t>
       </w:r>
     </w:p>
     <w:p xmlns:a="http://schemas.openxmlformats.org/drawingml/2006/main" xmlns:pic="http://schemas.openxmlformats.org/drawingml/2006/picture">
@@ -7663,6 +9066,20 @@
           <w:szCs w:val="24"/>
         </w:rPr>
         <w:t xml:space="preserve">Prospective validation against trials whose results are not yet known would be stronger.</w:t>
+      </w:r>
+    </w:p>
+    <w:p xmlns:a="http://schemas.openxmlformats.org/drawingml/2006/main" xmlns:pic="http://schemas.openxmlformats.org/drawingml/2006/picture">
+      <w:pPr>
+        <w:pStyle w:val="List Bullet"/>
+        <w:spacing w:line="480" w:lineRule="auto" w:after="120"/>
+      </w:pPr>
+      <w:r>
+        <w:rPr>
+          <w:rFonts w:ascii="Times New Roman" w:hAnsi="Times New Roman" w:cs="Times New Roman" w:eastAsia="Times New Roman"/>
+          <w:sz w:val="24"/>
+          <w:szCs w:val="24"/>
+        </w:rPr>
+        <w:t xml:space="preserve">The operating-characteristics simulation is intentionally stylized: it uses a single data-generating model with risk-dependent effects, one selection mechanism, and normal-approximation power priors. It demonstrates that KOTHA can improve operating characteristics under transparent assumptions, but it does not establish general optimality of any fixed discounting factor.</w:t>
       </w:r>
     </w:p>
     <w:p xmlns:a="http://schemas.openxmlformats.org/drawingml/2006/main" xmlns:pic="http://schemas.openxmlformats.org/drawingml/2006/picture">
@@ -8428,7 +9845,7 @@
     <w:lvl w:ilvl="0">
       <w:start w:val="1"/>
       <w:numFmt w:val="bullet"/>
-      <w:lvlText w:val=""/>
+      <w:lvlText w:val="-"/>
       <w:lvlJc w:val="left"/>
       <w:pPr>
         <w:tabs>
@@ -8449,7 +9866,7 @@
       <w:start w:val="1"/>
       <w:numFmt w:val="bullet"/>
       <w:pStyle w:val="ListBullet3"/>
-      <w:lvlText w:val=""/>
+      <w:lvlText w:val="-"/>
       <w:lvlJc w:val="left"/>
       <w:pPr>
         <w:tabs>
@@ -8470,7 +9887,7 @@
       <w:start w:val="1"/>
       <w:numFmt w:val="bullet"/>
       <w:pStyle w:val="ListBullet2"/>
-      <w:lvlText w:val=""/>
+      <w:lvlText w:val="-"/>
       <w:lvlJc w:val="left"/>
       <w:pPr>
         <w:tabs>
@@ -8509,7 +9926,7 @@
       <w:start w:val="1"/>
       <w:numFmt w:val="bullet"/>
       <w:pStyle w:val="ListBullet"/>
-      <w:lvlText w:val=""/>
+      <w:lvlText w:val="-"/>
       <w:lvlJc w:val="left"/>
       <w:pPr>
         <w:tabs>
@@ -32253,10 +33670,10 @@
         <a:latin typeface="Calibri"/>
         <a:ea typeface=""/>
         <a:cs typeface=""/>
-        <a:font script="Jpan" typeface="ＭＳ ゴシック"/>
-        <a:font script="Hang" typeface="맑은 고딕"/>
-        <a:font script="Hans" typeface="宋体"/>
-        <a:font script="Hant" typeface="新細明體"/>
+        <a:font script="Jpan" typeface="MS Gothic"/>
+        <a:font script="Hang" typeface="Malgun Gothic"/>
+        <a:font script="Hans" typeface="SimSun"/>
+        <a:font script="Hant" typeface="PMingLiU"/>
         <a:font script="Arab" typeface="Times New Roman"/>
         <a:font script="Hebr" typeface="Times New Roman"/>
         <a:font script="Thai" typeface="Angsana New"/>
@@ -32288,10 +33705,10 @@
         <a:latin typeface="Cambria"/>
         <a:ea typeface=""/>
         <a:cs typeface=""/>
-        <a:font script="Jpan" typeface="ＭＳ 明朝"/>
-        <a:font script="Hang" typeface="맑은 고딕"/>
-        <a:font script="Hans" typeface="宋体"/>
-        <a:font script="Hant" typeface="新細明體"/>
+        <a:font script="Jpan" typeface="MS Mincho"/>
+        <a:font script="Hang" typeface="Malgun Gothic"/>
+        <a:font script="Hans" typeface="SimSun"/>
+        <a:font script="Hant" typeface="PMingLiU"/>
         <a:font script="Arab" typeface="Arial"/>
         <a:font script="Hebr" typeface="Arial"/>
         <a:font script="Thai" typeface="Cordia New"/>

</xml_diff>

<commit_message>
Add JBS submission package and builder scripts
- build_paper_jbs.py reframes CCTC manuscript for Journal of Biopharmaceutical Statistics
- NLM bracketed citations, <=8 main display items, abstract trimmed to ~182 words
- Generated 05_paper_jbs.md, KOTHA_Framework_JBS*.docx, figures/tables PPTX/DOCX
- cover_letter_JBS.docx and submission_package_JBS.zip
- critical_review_JBS.md with reviewer-perspective assessment
- Makefile/README updated for make jbs

Co-Authored-By: Tatsuki Onishi <bougtoir@gmail.com>
</commit_message>
<xml_diff>
--- a/rct-decomposition/KOTHA_Framework_CCTC.docx
+++ b/rct-decomposition/KOTHA_Framework_CCTC.docx
@@ -9845,7 +9845,7 @@
     <w:lvl w:ilvl="0">
       <w:start w:val="1"/>
       <w:numFmt w:val="bullet"/>
-      <w:lvlText w:val="-"/>
+      <w:lvlText w:val=""/>
       <w:lvlJc w:val="left"/>
       <w:pPr>
         <w:tabs>
@@ -9866,7 +9866,7 @@
       <w:start w:val="1"/>
       <w:numFmt w:val="bullet"/>
       <w:pStyle w:val="ListBullet3"/>
-      <w:lvlText w:val="-"/>
+      <w:lvlText w:val=""/>
       <w:lvlJc w:val="left"/>
       <w:pPr>
         <w:tabs>
@@ -9887,7 +9887,7 @@
       <w:start w:val="1"/>
       <w:numFmt w:val="bullet"/>
       <w:pStyle w:val="ListBullet2"/>
-      <w:lvlText w:val="-"/>
+      <w:lvlText w:val=""/>
       <w:lvlJc w:val="left"/>
       <w:pPr>
         <w:tabs>
@@ -9926,7 +9926,7 @@
       <w:start w:val="1"/>
       <w:numFmt w:val="bullet"/>
       <w:pStyle w:val="ListBullet"/>
-      <w:lvlText w:val="-"/>
+      <w:lvlText w:val=""/>
       <w:lvlJc w:val="left"/>
       <w:pPr>
         <w:tabs>
@@ -33670,10 +33670,10 @@
         <a:latin typeface="Calibri"/>
         <a:ea typeface=""/>
         <a:cs typeface=""/>
-        <a:font script="Jpan" typeface="MS Gothic"/>
-        <a:font script="Hang" typeface="Malgun Gothic"/>
-        <a:font script="Hans" typeface="SimSun"/>
-        <a:font script="Hant" typeface="PMingLiU"/>
+        <a:font script="Jpan" typeface="ＭＳ ゴシック"/>
+        <a:font script="Hang" typeface="맑은 고딕"/>
+        <a:font script="Hans" typeface="宋体"/>
+        <a:font script="Hant" typeface="新細明體"/>
         <a:font script="Arab" typeface="Times New Roman"/>
         <a:font script="Hebr" typeface="Times New Roman"/>
         <a:font script="Thai" typeface="Angsana New"/>
@@ -33705,10 +33705,10 @@
         <a:latin typeface="Cambria"/>
         <a:ea typeface=""/>
         <a:cs typeface=""/>
-        <a:font script="Jpan" typeface="MS Mincho"/>
-        <a:font script="Hang" typeface="Malgun Gothic"/>
-        <a:font script="Hans" typeface="SimSun"/>
-        <a:font script="Hant" typeface="PMingLiU"/>
+        <a:font script="Jpan" typeface="ＭＳ 明朝"/>
+        <a:font script="Hang" typeface="맑은 고딕"/>
+        <a:font script="Hans" typeface="宋体"/>
+        <a:font script="Hant" typeface="新細明體"/>
         <a:font script="Arab" typeface="Arial"/>
         <a:font script="Hebr" typeface="Arial"/>
         <a:font script="Thai" typeface="Cordia New"/>

</xml_diff>